<commit_message>
Created Contect Level Diagram and pasted it in BRD
</commit_message>
<xml_diff>
--- a/docs/Business-Requirements-Document-BRD.docx
+++ b/docs/Business-Requirements-Document-BRD.docx
@@ -2461,7 +2461,7 @@
         </w:rPr>
         <w:fldChar w:fldCharType="separate"/>
       </w:r>
-      <w:hyperlink w:anchor="_Toc238078581" w:history="1">
+      <w:hyperlink w:anchor="_Toc238259018" w:history="1">
         <w:r>
           <w:rPr>
             <w:rStyle w:val="Hyperlink"/>
@@ -2509,7 +2509,7 @@
             <w:noProof/>
             <w:webHidden/>
           </w:rPr>
-          <w:instrText xml:space="preserve"> PAGEREF _Toc238078581 \h </w:instrText>
+          <w:instrText xml:space="preserve"> PAGEREF _Toc238259018 \h </w:instrText>
         </w:r>
         <w:r>
           <w:rPr>
@@ -2557,10 +2557,11 @@
           <w14:ligatures w14:val="standardContextual"/>
         </w:rPr>
       </w:pPr>
-      <w:hyperlink w:anchor="_Toc238078582" w:history="1">
+      <w:hyperlink w:anchor="_Toc238259019" w:history="1">
         <w:r>
           <w:rPr>
             <w:rStyle w:val="Hyperlink"/>
+            <w:rFonts w:ascii="Calibri" w:hAnsi="Calibri"/>
             <w:noProof/>
           </w:rPr>
           <w:t>1.1</w:t>
@@ -2580,6 +2581,7 @@
         <w:r>
           <w:rPr>
             <w:rStyle w:val="Hyperlink"/>
+            <w:rFonts w:ascii="Calibri" w:hAnsi="Calibri"/>
             <w:noProof/>
           </w:rPr>
           <w:t>Background</w:t>
@@ -2603,7 +2605,7 @@
             <w:noProof/>
             <w:webHidden/>
           </w:rPr>
-          <w:instrText xml:space="preserve"> PAGEREF _Toc238078582 \h </w:instrText>
+          <w:instrText xml:space="preserve"> PAGEREF _Toc238259019 \h </w:instrText>
         </w:r>
         <w:r>
           <w:rPr>
@@ -2651,10 +2653,11 @@
           <w14:ligatures w14:val="standardContextual"/>
         </w:rPr>
       </w:pPr>
-      <w:hyperlink w:anchor="_Toc238078583" w:history="1">
+      <w:hyperlink w:anchor="_Toc238259020" w:history="1">
         <w:r>
           <w:rPr>
             <w:rStyle w:val="Hyperlink"/>
+            <w:rFonts w:ascii="Calibri" w:hAnsi="Calibri"/>
             <w:noProof/>
           </w:rPr>
           <w:t>1.2</w:t>
@@ -2674,6 +2677,7 @@
         <w:r>
           <w:rPr>
             <w:rStyle w:val="Hyperlink"/>
+            <w:rFonts w:ascii="Calibri" w:hAnsi="Calibri"/>
             <w:noProof/>
           </w:rPr>
           <w:t>Purpose</w:t>
@@ -2697,7 +2701,7 @@
             <w:noProof/>
             <w:webHidden/>
           </w:rPr>
-          <w:instrText xml:space="preserve"> PAGEREF _Toc238078583 \h </w:instrText>
+          <w:instrText xml:space="preserve"> PAGEREF _Toc238259020 \h </w:instrText>
         </w:r>
         <w:r>
           <w:rPr>
@@ -2745,7 +2749,7 @@
           <w14:ligatures w14:val="standardContextual"/>
         </w:rPr>
       </w:pPr>
-      <w:hyperlink w:anchor="_Toc238078584" w:history="1">
+      <w:hyperlink w:anchor="_Toc238259021" w:history="1">
         <w:r>
           <w:rPr>
             <w:rStyle w:val="Hyperlink"/>
@@ -2793,7 +2797,7 @@
             <w:noProof/>
             <w:webHidden/>
           </w:rPr>
-          <w:instrText xml:space="preserve"> PAGEREF _Toc238078584 \h </w:instrText>
+          <w:instrText xml:space="preserve"> PAGEREF _Toc238259021 \h </w:instrText>
         </w:r>
         <w:r>
           <w:rPr>
@@ -2841,7 +2845,7 @@
           <w14:ligatures w14:val="standardContextual"/>
         </w:rPr>
       </w:pPr>
-      <w:hyperlink w:anchor="_Toc238078585" w:history="1">
+      <w:hyperlink w:anchor="_Toc238259022" w:history="1">
         <w:r>
           <w:rPr>
             <w:rStyle w:val="Hyperlink"/>
@@ -2889,7 +2893,7 @@
             <w:noProof/>
             <w:webHidden/>
           </w:rPr>
-          <w:instrText xml:space="preserve"> PAGEREF _Toc238078585 \h </w:instrText>
+          <w:instrText xml:space="preserve"> PAGEREF _Toc238259022 \h </w:instrText>
         </w:r>
         <w:r>
           <w:rPr>
@@ -2937,7 +2941,7 @@
           <w14:ligatures w14:val="standardContextual"/>
         </w:rPr>
       </w:pPr>
-      <w:hyperlink w:anchor="_Toc238078586" w:history="1">
+      <w:hyperlink w:anchor="_Toc238259023" w:history="1">
         <w:r>
           <w:rPr>
             <w:rStyle w:val="Hyperlink"/>
@@ -2985,7 +2989,7 @@
             <w:noProof/>
             <w:webHidden/>
           </w:rPr>
-          <w:instrText xml:space="preserve"> PAGEREF _Toc238078586 \h </w:instrText>
+          <w:instrText xml:space="preserve"> PAGEREF _Toc238259023 \h </w:instrText>
         </w:r>
         <w:r>
           <w:rPr>
@@ -3033,7 +3037,7 @@
           <w14:ligatures w14:val="standardContextual"/>
         </w:rPr>
       </w:pPr>
-      <w:hyperlink w:anchor="_Toc238078587" w:history="1">
+      <w:hyperlink w:anchor="_Toc238259024" w:history="1">
         <w:r>
           <w:rPr>
             <w:rStyle w:val="Hyperlink"/>
@@ -3081,7 +3085,7 @@
             <w:noProof/>
             <w:webHidden/>
           </w:rPr>
-          <w:instrText xml:space="preserve"> PAGEREF _Toc238078587 \h </w:instrText>
+          <w:instrText xml:space="preserve"> PAGEREF _Toc238259024 \h </w:instrText>
         </w:r>
         <w:r>
           <w:rPr>
@@ -3101,7 +3105,7 @@
             <w:noProof/>
             <w:webHidden/>
           </w:rPr>
-          <w:t>6</w:t>
+          <w:t>7</w:t>
         </w:r>
         <w:r>
           <w:rPr>
@@ -3129,7 +3133,7 @@
           <w14:ligatures w14:val="standardContextual"/>
         </w:rPr>
       </w:pPr>
-      <w:hyperlink w:anchor="_Toc238078588" w:history="1">
+      <w:hyperlink w:anchor="_Toc238259025" w:history="1">
         <w:r>
           <w:rPr>
             <w:rStyle w:val="Hyperlink"/>
@@ -3177,7 +3181,7 @@
             <w:noProof/>
             <w:webHidden/>
           </w:rPr>
-          <w:instrText xml:space="preserve"> PAGEREF _Toc238078588 \h </w:instrText>
+          <w:instrText xml:space="preserve"> PAGEREF _Toc238259025 \h </w:instrText>
         </w:r>
         <w:r>
           <w:rPr>
@@ -3197,7 +3201,7 @@
             <w:noProof/>
             <w:webHidden/>
           </w:rPr>
-          <w:t>6</w:t>
+          <w:t>7</w:t>
         </w:r>
         <w:r>
           <w:rPr>
@@ -3225,7 +3229,7 @@
           <w14:ligatures w14:val="standardContextual"/>
         </w:rPr>
       </w:pPr>
-      <w:hyperlink w:anchor="_Toc238078589" w:history="1">
+      <w:hyperlink w:anchor="_Toc238259026" w:history="1">
         <w:r>
           <w:rPr>
             <w:rStyle w:val="Hyperlink"/>
@@ -3273,7 +3277,7 @@
             <w:noProof/>
             <w:webHidden/>
           </w:rPr>
-          <w:instrText xml:space="preserve"> PAGEREF _Toc238078589 \h </w:instrText>
+          <w:instrText xml:space="preserve"> PAGEREF _Toc238259026 \h </w:instrText>
         </w:r>
         <w:r>
           <w:rPr>
@@ -3293,7 +3297,7 @@
             <w:noProof/>
             <w:webHidden/>
           </w:rPr>
-          <w:t>6</w:t>
+          <w:t>7</w:t>
         </w:r>
         <w:r>
           <w:rPr>
@@ -3321,7 +3325,7 @@
           <w14:ligatures w14:val="standardContextual"/>
         </w:rPr>
       </w:pPr>
-      <w:hyperlink w:anchor="_Toc238078590" w:history="1">
+      <w:hyperlink w:anchor="_Toc238259027" w:history="1">
         <w:r>
           <w:rPr>
             <w:rStyle w:val="Hyperlink"/>
@@ -3369,7 +3373,7 @@
             <w:noProof/>
             <w:webHidden/>
           </w:rPr>
-          <w:instrText xml:space="preserve"> PAGEREF _Toc238078590 \h </w:instrText>
+          <w:instrText xml:space="preserve"> PAGEREF _Toc238259027 \h </w:instrText>
         </w:r>
         <w:r>
           <w:rPr>
@@ -3389,7 +3393,7 @@
             <w:noProof/>
             <w:webHidden/>
           </w:rPr>
-          <w:t>6</w:t>
+          <w:t>8</w:t>
         </w:r>
         <w:r>
           <w:rPr>
@@ -3417,7 +3421,7 @@
           <w14:ligatures w14:val="standardContextual"/>
         </w:rPr>
       </w:pPr>
-      <w:hyperlink w:anchor="_Toc238078591" w:history="1">
+      <w:hyperlink w:anchor="_Toc238259028" w:history="1">
         <w:r>
           <w:rPr>
             <w:rStyle w:val="Hyperlink"/>
@@ -3465,7 +3469,7 @@
             <w:noProof/>
             <w:webHidden/>
           </w:rPr>
-          <w:instrText xml:space="preserve"> PAGEREF _Toc238078591 \h </w:instrText>
+          <w:instrText xml:space="preserve"> PAGEREF _Toc238259028 \h </w:instrText>
         </w:r>
         <w:r>
           <w:rPr>
@@ -3485,7 +3489,7 @@
             <w:noProof/>
             <w:webHidden/>
           </w:rPr>
-          <w:t>6</w:t>
+          <w:t>8</w:t>
         </w:r>
         <w:r>
           <w:rPr>
@@ -3513,7 +3517,7 @@
           <w14:ligatures w14:val="standardContextual"/>
         </w:rPr>
       </w:pPr>
-      <w:hyperlink w:anchor="_Toc238078592" w:history="1">
+      <w:hyperlink w:anchor="_Toc238259029" w:history="1">
         <w:r>
           <w:rPr>
             <w:rStyle w:val="Hyperlink"/>
@@ -3561,7 +3565,7 @@
             <w:noProof/>
             <w:webHidden/>
           </w:rPr>
-          <w:instrText xml:space="preserve"> PAGEREF _Toc238078592 \h </w:instrText>
+          <w:instrText xml:space="preserve"> PAGEREF _Toc238259029 \h </w:instrText>
         </w:r>
         <w:r>
           <w:rPr>
@@ -3581,7 +3585,7 @@
             <w:noProof/>
             <w:webHidden/>
           </w:rPr>
-          <w:t>7</w:t>
+          <w:t>8</w:t>
         </w:r>
         <w:r>
           <w:rPr>
@@ -3609,7 +3613,7 @@
           <w14:ligatures w14:val="standardContextual"/>
         </w:rPr>
       </w:pPr>
-      <w:hyperlink w:anchor="_Toc238078593" w:history="1">
+      <w:hyperlink w:anchor="_Toc238259030" w:history="1">
         <w:r>
           <w:rPr>
             <w:rStyle w:val="Hyperlink"/>
@@ -3657,7 +3661,7 @@
             <w:noProof/>
             <w:webHidden/>
           </w:rPr>
-          <w:instrText xml:space="preserve"> PAGEREF _Toc238078593 \h </w:instrText>
+          <w:instrText xml:space="preserve"> PAGEREF _Toc238259030 \h </w:instrText>
         </w:r>
         <w:r>
           <w:rPr>
@@ -3677,7 +3681,7 @@
             <w:noProof/>
             <w:webHidden/>
           </w:rPr>
-          <w:t>7</w:t>
+          <w:t>9</w:t>
         </w:r>
         <w:r>
           <w:rPr>
@@ -3690,9 +3694,9 @@
     </w:p>
     <w:p>
       <w:pPr>
-        <w:pStyle w:val="TOC1"/>
+        <w:pStyle w:val="TOC2"/>
         <w:tabs>
-          <w:tab w:val="left" w:pos="600"/>
+          <w:tab w:val="left" w:pos="800"/>
           <w:tab w:val="right" w:leader="dot" w:pos="9019"/>
         </w:tabs>
         <w:rPr>
@@ -3705,14 +3709,14 @@
           <w14:ligatures w14:val="standardContextual"/>
         </w:rPr>
       </w:pPr>
-      <w:hyperlink w:anchor="_Toc238078594" w:history="1">
+      <w:hyperlink w:anchor="_Toc238259031" w:history="1">
         <w:r>
           <w:rPr>
             <w:rStyle w:val="Hyperlink"/>
-            <w:rFonts w:ascii="Calibri" w:hAnsi="Calibri"/>
-            <w:noProof/>
-          </w:rPr>
-          <w:t>12</w:t>
+            <w:rFonts w:ascii="Times New Roman" w:hAnsi="Times New Roman"/>
+            <w:noProof/>
+          </w:rPr>
+          <w:t>11.1</w:t>
         </w:r>
         <w:r>
           <w:rPr>
@@ -3729,10 +3733,9 @@
         <w:r>
           <w:rPr>
             <w:rStyle w:val="Hyperlink"/>
-            <w:rFonts w:ascii="Calibri" w:hAnsi="Calibri"/>
-            <w:noProof/>
-          </w:rPr>
-          <w:t>Context Diagram</w:t>
+            <w:noProof/>
+          </w:rPr>
+          <w:t>Vendor Compliance &amp; Risk Monitoring</w:t>
         </w:r>
         <w:r>
           <w:rPr>
@@ -3753,7 +3756,7 @@
             <w:noProof/>
             <w:webHidden/>
           </w:rPr>
-          <w:instrText xml:space="preserve"> PAGEREF _Toc238078594 \h </w:instrText>
+          <w:instrText xml:space="preserve"> PAGEREF _Toc238259031 \h </w:instrText>
         </w:r>
         <w:r>
           <w:rPr>
@@ -3773,7 +3776,7 @@
             <w:noProof/>
             <w:webHidden/>
           </w:rPr>
-          <w:t>7</w:t>
+          <w:t>9</w:t>
         </w:r>
         <w:r>
           <w:rPr>
@@ -3786,9 +3789,9 @@
     </w:p>
     <w:p>
       <w:pPr>
-        <w:pStyle w:val="TOC1"/>
+        <w:pStyle w:val="TOC3"/>
         <w:tabs>
-          <w:tab w:val="left" w:pos="600"/>
+          <w:tab w:val="left" w:pos="1200"/>
           <w:tab w:val="right" w:leader="dot" w:pos="9019"/>
         </w:tabs>
         <w:rPr>
@@ -3801,14 +3804,13 @@
           <w14:ligatures w14:val="standardContextual"/>
         </w:rPr>
       </w:pPr>
-      <w:hyperlink w:anchor="_Toc238078595" w:history="1">
+      <w:hyperlink w:anchor="_Toc238259032" w:history="1">
         <w:r>
           <w:rPr>
             <w:rStyle w:val="Hyperlink"/>
-            <w:rFonts w:ascii="Calibri" w:hAnsi="Calibri"/>
-            <w:noProof/>
-          </w:rPr>
-          <w:t>13</w:t>
+            <w:noProof/>
+          </w:rPr>
+          <w:t>11.1.1</w:t>
         </w:r>
         <w:r>
           <w:rPr>
@@ -3825,10 +3827,9 @@
         <w:r>
           <w:rPr>
             <w:rStyle w:val="Hyperlink"/>
-            <w:rFonts w:ascii="Calibri" w:hAnsi="Calibri"/>
-            <w:noProof/>
-          </w:rPr>
-          <w:t>Process Overview Diagram</w:t>
+            <w:noProof/>
+          </w:rPr>
+          <w:t>Process Objective</w:t>
         </w:r>
         <w:r>
           <w:rPr>
@@ -3849,7 +3850,7 @@
             <w:noProof/>
             <w:webHidden/>
           </w:rPr>
-          <w:instrText xml:space="preserve"> PAGEREF _Toc238078595 \h </w:instrText>
+          <w:instrText xml:space="preserve"> PAGEREF _Toc238259032 \h </w:instrText>
         </w:r>
         <w:r>
           <w:rPr>
@@ -3869,7 +3870,7 @@
             <w:noProof/>
             <w:webHidden/>
           </w:rPr>
-          <w:t>7</w:t>
+          <w:t>9</w:t>
         </w:r>
         <w:r>
           <w:rPr>
@@ -3897,14 +3898,14 @@
           <w14:ligatures w14:val="standardContextual"/>
         </w:rPr>
       </w:pPr>
-      <w:hyperlink w:anchor="_Toc238078596" w:history="1">
+      <w:hyperlink w:anchor="_Toc238259033" w:history="1">
         <w:r>
           <w:rPr>
             <w:rStyle w:val="Hyperlink"/>
             <w:rFonts w:ascii="Calibri" w:hAnsi="Calibri"/>
             <w:noProof/>
           </w:rPr>
-          <w:t>14</w:t>
+          <w:t>12</w:t>
         </w:r>
         <w:r>
           <w:rPr>
@@ -3924,7 +3925,23 @@
             <w:rFonts w:ascii="Calibri" w:hAnsi="Calibri"/>
             <w:noProof/>
           </w:rPr>
-          <w:t>High Level To Be Business Requirements</w:t>
+          <w:t>Context Diag</w:t>
+        </w:r>
+        <w:r>
+          <w:rPr>
+            <w:rStyle w:val="Hyperlink"/>
+            <w:rFonts w:ascii="Calibri" w:hAnsi="Calibri"/>
+            <w:noProof/>
+          </w:rPr>
+          <w:t>r</w:t>
+        </w:r>
+        <w:r>
+          <w:rPr>
+            <w:rStyle w:val="Hyperlink"/>
+            <w:rFonts w:ascii="Calibri" w:hAnsi="Calibri"/>
+            <w:noProof/>
+          </w:rPr>
+          <w:t>am</w:t>
         </w:r>
         <w:r>
           <w:rPr>
@@ -3945,7 +3962,7 @@
             <w:noProof/>
             <w:webHidden/>
           </w:rPr>
-          <w:instrText xml:space="preserve"> PAGEREF _Toc238078596 \h </w:instrText>
+          <w:instrText xml:space="preserve"> PAGEREF _Toc238259033 \h </w:instrText>
         </w:r>
         <w:r>
           <w:rPr>
@@ -3965,7 +3982,7 @@
             <w:noProof/>
             <w:webHidden/>
           </w:rPr>
-          <w:t>7</w:t>
+          <w:t>12</w:t>
         </w:r>
         <w:r>
           <w:rPr>
@@ -3993,14 +4010,14 @@
           <w14:ligatures w14:val="standardContextual"/>
         </w:rPr>
       </w:pPr>
-      <w:hyperlink w:anchor="_Toc238078597" w:history="1">
+      <w:hyperlink w:anchor="_Toc238259034" w:history="1">
         <w:r>
           <w:rPr>
             <w:rStyle w:val="Hyperlink"/>
             <w:rFonts w:ascii="Calibri" w:hAnsi="Calibri"/>
             <w:noProof/>
           </w:rPr>
-          <w:t>15</w:t>
+          <w:t>13</w:t>
         </w:r>
         <w:r>
           <w:rPr>
@@ -4020,7 +4037,7 @@
             <w:rFonts w:ascii="Calibri" w:hAnsi="Calibri"/>
             <w:noProof/>
           </w:rPr>
-          <w:t>Detailed Business/IT Requirements</w:t>
+          <w:t>Process Overview Diagram</w:t>
         </w:r>
         <w:r>
           <w:rPr>
@@ -4041,7 +4058,7 @@
             <w:noProof/>
             <w:webHidden/>
           </w:rPr>
-          <w:instrText xml:space="preserve"> PAGEREF _Toc238078597 \h </w:instrText>
+          <w:instrText xml:space="preserve"> PAGEREF _Toc238259034 \h </w:instrText>
         </w:r>
         <w:r>
           <w:rPr>
@@ -4061,7 +4078,7 @@
             <w:noProof/>
             <w:webHidden/>
           </w:rPr>
-          <w:t>9</w:t>
+          <w:t>12</w:t>
         </w:r>
         <w:r>
           <w:rPr>
@@ -4074,9 +4091,9 @@
     </w:p>
     <w:p>
       <w:pPr>
-        <w:pStyle w:val="TOC2"/>
+        <w:pStyle w:val="TOC1"/>
         <w:tabs>
-          <w:tab w:val="left" w:pos="800"/>
+          <w:tab w:val="left" w:pos="600"/>
           <w:tab w:val="right" w:leader="dot" w:pos="9019"/>
         </w:tabs>
         <w:rPr>
@@ -4089,14 +4106,14 @@
           <w14:ligatures w14:val="standardContextual"/>
         </w:rPr>
       </w:pPr>
-      <w:hyperlink w:anchor="_Toc238078598" w:history="1">
+      <w:hyperlink w:anchor="_Toc238259035" w:history="1">
         <w:r>
           <w:rPr>
             <w:rStyle w:val="Hyperlink"/>
             <w:rFonts w:ascii="Calibri" w:hAnsi="Calibri"/>
             <w:noProof/>
           </w:rPr>
-          <w:t>15.1</w:t>
+          <w:t>14</w:t>
         </w:r>
         <w:r>
           <w:rPr>
@@ -4116,7 +4133,7 @@
             <w:rFonts w:ascii="Calibri" w:hAnsi="Calibri"/>
             <w:noProof/>
           </w:rPr>
-          <w:t>Functional Requirements</w:t>
+          <w:t>High Level To Be Business Requirements</w:t>
         </w:r>
         <w:r>
           <w:rPr>
@@ -4137,7 +4154,7 @@
             <w:noProof/>
             <w:webHidden/>
           </w:rPr>
-          <w:instrText xml:space="preserve"> PAGEREF _Toc238078598 \h </w:instrText>
+          <w:instrText xml:space="preserve"> PAGEREF _Toc238259035 \h </w:instrText>
         </w:r>
         <w:r>
           <w:rPr>
@@ -4157,7 +4174,7 @@
             <w:noProof/>
             <w:webHidden/>
           </w:rPr>
-          <w:t>9</w:t>
+          <w:t>12</w:t>
         </w:r>
         <w:r>
           <w:rPr>
@@ -4170,9 +4187,9 @@
     </w:p>
     <w:p>
       <w:pPr>
-        <w:pStyle w:val="TOC2"/>
+        <w:pStyle w:val="TOC1"/>
         <w:tabs>
-          <w:tab w:val="left" w:pos="800"/>
+          <w:tab w:val="left" w:pos="600"/>
           <w:tab w:val="right" w:leader="dot" w:pos="9019"/>
         </w:tabs>
         <w:rPr>
@@ -4185,14 +4202,14 @@
           <w14:ligatures w14:val="standardContextual"/>
         </w:rPr>
       </w:pPr>
-      <w:hyperlink w:anchor="_Toc238078599" w:history="1">
+      <w:hyperlink w:anchor="_Toc238259036" w:history="1">
         <w:r>
           <w:rPr>
             <w:rStyle w:val="Hyperlink"/>
             <w:rFonts w:ascii="Calibri" w:hAnsi="Calibri"/>
             <w:noProof/>
           </w:rPr>
-          <w:t>15.2</w:t>
+          <w:t>15</w:t>
         </w:r>
         <w:r>
           <w:rPr>
@@ -4212,7 +4229,7 @@
             <w:rFonts w:ascii="Calibri" w:hAnsi="Calibri"/>
             <w:noProof/>
           </w:rPr>
-          <w:t>Process Diagram</w:t>
+          <w:t>Detailed Business/IT Requirements</w:t>
         </w:r>
         <w:r>
           <w:rPr>
@@ -4233,7 +4250,7 @@
             <w:noProof/>
             <w:webHidden/>
           </w:rPr>
-          <w:instrText xml:space="preserve"> PAGEREF _Toc238078599 \h </w:instrText>
+          <w:instrText xml:space="preserve"> PAGEREF _Toc238259036 \h </w:instrText>
         </w:r>
         <w:r>
           <w:rPr>
@@ -4253,7 +4270,7 @@
             <w:noProof/>
             <w:webHidden/>
           </w:rPr>
-          <w:t>10</w:t>
+          <w:t>13</w:t>
         </w:r>
         <w:r>
           <w:rPr>
@@ -4281,14 +4298,14 @@
           <w14:ligatures w14:val="standardContextual"/>
         </w:rPr>
       </w:pPr>
-      <w:hyperlink w:anchor="_Toc238078600" w:history="1">
+      <w:hyperlink w:anchor="_Toc238259037" w:history="1">
         <w:r>
           <w:rPr>
             <w:rStyle w:val="Hyperlink"/>
             <w:rFonts w:ascii="Calibri" w:hAnsi="Calibri"/>
             <w:noProof/>
           </w:rPr>
-          <w:t>15.3</w:t>
+          <w:t>15.1</w:t>
         </w:r>
         <w:r>
           <w:rPr>
@@ -4308,7 +4325,7 @@
             <w:rFonts w:ascii="Calibri" w:hAnsi="Calibri"/>
             <w:noProof/>
           </w:rPr>
-          <w:t>Non Functional Requirements</w:t>
+          <w:t>Functional Requirements</w:t>
         </w:r>
         <w:r>
           <w:rPr>
@@ -4329,7 +4346,7 @@
             <w:noProof/>
             <w:webHidden/>
           </w:rPr>
-          <w:instrText xml:space="preserve"> PAGEREF _Toc238078600 \h </w:instrText>
+          <w:instrText xml:space="preserve"> PAGEREF _Toc238259037 \h </w:instrText>
         </w:r>
         <w:r>
           <w:rPr>
@@ -4349,7 +4366,7 @@
             <w:noProof/>
             <w:webHidden/>
           </w:rPr>
-          <w:t>10</w:t>
+          <w:t>13</w:t>
         </w:r>
         <w:r>
           <w:rPr>
@@ -4362,9 +4379,9 @@
     </w:p>
     <w:p>
       <w:pPr>
-        <w:pStyle w:val="TOC1"/>
+        <w:pStyle w:val="TOC2"/>
         <w:tabs>
-          <w:tab w:val="left" w:pos="600"/>
+          <w:tab w:val="left" w:pos="800"/>
           <w:tab w:val="right" w:leader="dot" w:pos="9019"/>
         </w:tabs>
         <w:rPr>
@@ -4377,14 +4394,14 @@
           <w14:ligatures w14:val="standardContextual"/>
         </w:rPr>
       </w:pPr>
-      <w:hyperlink w:anchor="_Toc238078601" w:history="1">
+      <w:hyperlink w:anchor="_Toc238259038" w:history="1">
         <w:r>
           <w:rPr>
             <w:rStyle w:val="Hyperlink"/>
             <w:rFonts w:ascii="Calibri" w:hAnsi="Calibri"/>
             <w:noProof/>
           </w:rPr>
-          <w:t>16</w:t>
+          <w:t>15.2</w:t>
         </w:r>
         <w:r>
           <w:rPr>
@@ -4404,7 +4421,7 @@
             <w:rFonts w:ascii="Calibri" w:hAnsi="Calibri"/>
             <w:noProof/>
           </w:rPr>
-          <w:t>Business Impact Assessment</w:t>
+          <w:t>Process Diagram</w:t>
         </w:r>
         <w:r>
           <w:rPr>
@@ -4425,7 +4442,7 @@
             <w:noProof/>
             <w:webHidden/>
           </w:rPr>
-          <w:instrText xml:space="preserve"> PAGEREF _Toc238078601 \h </w:instrText>
+          <w:instrText xml:space="preserve"> PAGEREF _Toc238259038 \h </w:instrText>
         </w:r>
         <w:r>
           <w:rPr>
@@ -4445,7 +4462,7 @@
             <w:noProof/>
             <w:webHidden/>
           </w:rPr>
-          <w:t>13</w:t>
+          <w:t>14</w:t>
         </w:r>
         <w:r>
           <w:rPr>
@@ -4458,9 +4475,9 @@
     </w:p>
     <w:p>
       <w:pPr>
-        <w:pStyle w:val="TOC1"/>
+        <w:pStyle w:val="TOC2"/>
         <w:tabs>
-          <w:tab w:val="left" w:pos="600"/>
+          <w:tab w:val="left" w:pos="800"/>
           <w:tab w:val="right" w:leader="dot" w:pos="9019"/>
         </w:tabs>
         <w:rPr>
@@ -4473,14 +4490,14 @@
           <w14:ligatures w14:val="standardContextual"/>
         </w:rPr>
       </w:pPr>
-      <w:hyperlink w:anchor="_Toc238078602" w:history="1">
+      <w:hyperlink w:anchor="_Toc238259039" w:history="1">
         <w:r>
           <w:rPr>
             <w:rStyle w:val="Hyperlink"/>
             <w:rFonts w:ascii="Calibri" w:hAnsi="Calibri"/>
             <w:noProof/>
           </w:rPr>
-          <w:t>17</w:t>
+          <w:t>15.3</w:t>
         </w:r>
         <w:r>
           <w:rPr>
@@ -4500,7 +4517,7 @@
             <w:rFonts w:ascii="Calibri" w:hAnsi="Calibri"/>
             <w:noProof/>
           </w:rPr>
-          <w:t>Costs</w:t>
+          <w:t>Non Functional Requirements</w:t>
         </w:r>
         <w:r>
           <w:rPr>
@@ -4521,7 +4538,7 @@
             <w:noProof/>
             <w:webHidden/>
           </w:rPr>
-          <w:instrText xml:space="preserve"> PAGEREF _Toc238078602 \h </w:instrText>
+          <w:instrText xml:space="preserve"> PAGEREF _Toc238259039 \h </w:instrText>
         </w:r>
         <w:r>
           <w:rPr>
@@ -4569,14 +4586,14 @@
           <w14:ligatures w14:val="standardContextual"/>
         </w:rPr>
       </w:pPr>
-      <w:hyperlink w:anchor="_Toc238078603" w:history="1">
+      <w:hyperlink w:anchor="_Toc238259040" w:history="1">
         <w:r>
           <w:rPr>
             <w:rStyle w:val="Hyperlink"/>
             <w:rFonts w:ascii="Calibri" w:hAnsi="Calibri"/>
             <w:noProof/>
           </w:rPr>
-          <w:t>18</w:t>
+          <w:t>16</w:t>
         </w:r>
         <w:r>
           <w:rPr>
@@ -4596,6 +4613,198 @@
             <w:rFonts w:ascii="Calibri" w:hAnsi="Calibri"/>
             <w:noProof/>
           </w:rPr>
+          <w:t>Business Impact Assessment</w:t>
+        </w:r>
+        <w:r>
+          <w:rPr>
+            <w:noProof/>
+            <w:webHidden/>
+          </w:rPr>
+          <w:tab/>
+        </w:r>
+        <w:r>
+          <w:rPr>
+            <w:noProof/>
+            <w:webHidden/>
+          </w:rPr>
+          <w:fldChar w:fldCharType="begin"/>
+        </w:r>
+        <w:r>
+          <w:rPr>
+            <w:noProof/>
+            <w:webHidden/>
+          </w:rPr>
+          <w:instrText xml:space="preserve"> PAGEREF _Toc238259040 \h </w:instrText>
+        </w:r>
+        <w:r>
+          <w:rPr>
+            <w:noProof/>
+            <w:webHidden/>
+          </w:rPr>
+        </w:r>
+        <w:r>
+          <w:rPr>
+            <w:noProof/>
+            <w:webHidden/>
+          </w:rPr>
+          <w:fldChar w:fldCharType="separate"/>
+        </w:r>
+        <w:r>
+          <w:rPr>
+            <w:noProof/>
+            <w:webHidden/>
+          </w:rPr>
+          <w:t>17</w:t>
+        </w:r>
+        <w:r>
+          <w:rPr>
+            <w:noProof/>
+            <w:webHidden/>
+          </w:rPr>
+          <w:fldChar w:fldCharType="end"/>
+        </w:r>
+      </w:hyperlink>
+    </w:p>
+    <w:p>
+      <w:pPr>
+        <w:pStyle w:val="TOC1"/>
+        <w:tabs>
+          <w:tab w:val="left" w:pos="600"/>
+          <w:tab w:val="right" w:leader="dot" w:pos="9019"/>
+        </w:tabs>
+        <w:rPr>
+          <w:rFonts w:asciiTheme="minorHAnsi" w:eastAsiaTheme="minorEastAsia" w:hAnsiTheme="minorHAnsi" w:cstheme="minorBidi"/>
+          <w:noProof/>
+          <w:kern w:val="2"/>
+          <w:sz w:val="24"/>
+          <w:szCs w:val="24"/>
+          <w:lang w:val="en-US"/>
+          <w14:ligatures w14:val="standardContextual"/>
+        </w:rPr>
+      </w:pPr>
+      <w:hyperlink w:anchor="_Toc238259041" w:history="1">
+        <w:r>
+          <w:rPr>
+            <w:rStyle w:val="Hyperlink"/>
+            <w:rFonts w:ascii="Calibri" w:hAnsi="Calibri"/>
+            <w:noProof/>
+          </w:rPr>
+          <w:t>17</w:t>
+        </w:r>
+        <w:r>
+          <w:rPr>
+            <w:rFonts w:asciiTheme="minorHAnsi" w:eastAsiaTheme="minorEastAsia" w:hAnsiTheme="minorHAnsi" w:cstheme="minorBidi"/>
+            <w:noProof/>
+            <w:kern w:val="2"/>
+            <w:sz w:val="24"/>
+            <w:szCs w:val="24"/>
+            <w:lang w:val="en-US"/>
+            <w14:ligatures w14:val="standardContextual"/>
+          </w:rPr>
+          <w:tab/>
+        </w:r>
+        <w:r>
+          <w:rPr>
+            <w:rStyle w:val="Hyperlink"/>
+            <w:rFonts w:ascii="Calibri" w:hAnsi="Calibri"/>
+            <w:noProof/>
+          </w:rPr>
+          <w:t>Costs</w:t>
+        </w:r>
+        <w:r>
+          <w:rPr>
+            <w:noProof/>
+            <w:webHidden/>
+          </w:rPr>
+          <w:tab/>
+        </w:r>
+        <w:r>
+          <w:rPr>
+            <w:noProof/>
+            <w:webHidden/>
+          </w:rPr>
+          <w:fldChar w:fldCharType="begin"/>
+        </w:r>
+        <w:r>
+          <w:rPr>
+            <w:noProof/>
+            <w:webHidden/>
+          </w:rPr>
+          <w:instrText xml:space="preserve"> PAGEREF _Toc238259041 \h </w:instrText>
+        </w:r>
+        <w:r>
+          <w:rPr>
+            <w:noProof/>
+            <w:webHidden/>
+          </w:rPr>
+        </w:r>
+        <w:r>
+          <w:rPr>
+            <w:noProof/>
+            <w:webHidden/>
+          </w:rPr>
+          <w:fldChar w:fldCharType="separate"/>
+        </w:r>
+        <w:r>
+          <w:rPr>
+            <w:noProof/>
+            <w:webHidden/>
+          </w:rPr>
+          <w:t>18</w:t>
+        </w:r>
+        <w:r>
+          <w:rPr>
+            <w:noProof/>
+            <w:webHidden/>
+          </w:rPr>
+          <w:fldChar w:fldCharType="end"/>
+        </w:r>
+      </w:hyperlink>
+    </w:p>
+    <w:p>
+      <w:pPr>
+        <w:pStyle w:val="TOC1"/>
+        <w:tabs>
+          <w:tab w:val="left" w:pos="600"/>
+          <w:tab w:val="right" w:leader="dot" w:pos="9019"/>
+        </w:tabs>
+        <w:rPr>
+          <w:rFonts w:asciiTheme="minorHAnsi" w:eastAsiaTheme="minorEastAsia" w:hAnsiTheme="minorHAnsi" w:cstheme="minorBidi"/>
+          <w:noProof/>
+          <w:kern w:val="2"/>
+          <w:sz w:val="24"/>
+          <w:szCs w:val="24"/>
+          <w:lang w:val="en-US"/>
+          <w14:ligatures w14:val="standardContextual"/>
+        </w:rPr>
+      </w:pPr>
+      <w:hyperlink w:anchor="_Toc238259042" w:history="1">
+        <w:r>
+          <w:rPr>
+            <w:rStyle w:val="Hyperlink"/>
+            <w:rFonts w:ascii="Calibri" w:hAnsi="Calibri"/>
+            <w:noProof/>
+          </w:rPr>
+          <w:t>18</w:t>
+        </w:r>
+        <w:r>
+          <w:rPr>
+            <w:rFonts w:asciiTheme="minorHAnsi" w:eastAsiaTheme="minorEastAsia" w:hAnsiTheme="minorHAnsi" w:cstheme="minorBidi"/>
+            <w:noProof/>
+            <w:kern w:val="2"/>
+            <w:sz w:val="24"/>
+            <w:szCs w:val="24"/>
+            <w:lang w:val="en-US"/>
+            <w14:ligatures w14:val="standardContextual"/>
+          </w:rPr>
+          <w:tab/>
+        </w:r>
+        <w:r>
+          <w:rPr>
+            <w:rStyle w:val="Hyperlink"/>
+            <w:rFonts w:ascii="Calibri" w:hAnsi="Calibri"/>
+            <w:noProof/>
+          </w:rPr>
           <w:t>Appendices</w:t>
         </w:r>
         <w:r>
@@ -4617,7 +4826,7 @@
             <w:noProof/>
             <w:webHidden/>
           </w:rPr>
-          <w:instrText xml:space="preserve"> PAGEREF _Toc238078603 \h </w:instrText>
+          <w:instrText xml:space="preserve"> PAGEREF _Toc238259042 \h </w:instrText>
         </w:r>
         <w:r>
           <w:rPr>
@@ -4637,7 +4846,7 @@
             <w:noProof/>
             <w:webHidden/>
           </w:rPr>
-          <w:t>14</w:t>
+          <w:t>18</w:t>
         </w:r>
         <w:r>
           <w:rPr>
@@ -4900,7 +5109,7 @@
         </w:rPr>
       </w:pPr>
       <w:bookmarkStart w:id="0" w:name="_Toc337656202"/>
-      <w:bookmarkStart w:id="1" w:name="_Toc238078581"/>
+      <w:bookmarkStart w:id="1" w:name="_Toc238259018"/>
       <w:r>
         <w:rPr>
           <w:rFonts w:ascii="Calibri" w:hAnsi="Calibri"/>
@@ -4919,7 +5128,7 @@
           <w:szCs w:val="22"/>
         </w:rPr>
       </w:pPr>
-      <w:bookmarkStart w:id="2" w:name="_Toc238078582"/>
+      <w:bookmarkStart w:id="2" w:name="_Toc238259019"/>
       <w:r>
         <w:rPr>
           <w:rFonts w:ascii="Calibri" w:hAnsi="Calibri"/>
@@ -4999,7 +5208,7 @@
           <w:szCs w:val="22"/>
         </w:rPr>
       </w:pPr>
-      <w:bookmarkStart w:id="3" w:name="_Toc238078583"/>
+      <w:bookmarkStart w:id="3" w:name="_Toc238259020"/>
       <w:r>
         <w:rPr>
           <w:rFonts w:ascii="Calibri" w:hAnsi="Calibri"/>
@@ -5068,7 +5277,7 @@
         </w:rPr>
       </w:pPr>
       <w:bookmarkStart w:id="4" w:name="_Toc357519054"/>
-      <w:bookmarkStart w:id="5" w:name="_Toc238078584"/>
+      <w:bookmarkStart w:id="5" w:name="_Toc238259021"/>
       <w:r>
         <w:rPr>
           <w:rFonts w:ascii="Calibri" w:hAnsi="Calibri"/>
@@ -5302,7 +5511,7 @@
           <w:rFonts w:ascii="Calibri" w:hAnsi="Calibri"/>
         </w:rPr>
       </w:pPr>
-      <w:bookmarkStart w:id="6" w:name="_Toc238078585"/>
+      <w:bookmarkStart w:id="6" w:name="_Toc238259022"/>
       <w:r>
         <w:rPr>
           <w:rFonts w:ascii="Calibri" w:hAnsi="Calibri"/>
@@ -5490,7 +5699,7 @@
                 <w:sz w:val="22"/>
                 <w:szCs w:val="22"/>
               </w:rPr>
-              <w:t xml:space="preserve">Improve visibility of vendor compliance status by providing centralized access to vendor documents, validity periods, and </w:t>
+              <w:t xml:space="preserve">Improve visibility of vendor compliance </w:t>
             </w:r>
             <w:r>
               <w:rPr>
@@ -5499,7 +5708,7 @@
                 <w:szCs w:val="22"/>
               </w:rPr>
               <w:lastRenderedPageBreak/>
-              <w:t>compliance information.</w:t>
+              <w:t>status by providing centralized access to vendor documents, validity periods, and compliance information.</w:t>
             </w:r>
           </w:p>
         </w:tc>
@@ -6238,7 +6447,7 @@
         </w:rPr>
       </w:pPr>
       <w:bookmarkStart w:id="7" w:name="_Toc357519058"/>
-      <w:bookmarkStart w:id="8" w:name="_Toc238078586"/>
+      <w:bookmarkStart w:id="8" w:name="_Toc238259023"/>
       <w:r>
         <w:rPr>
           <w:rFonts w:ascii="Calibri" w:hAnsi="Calibri"/>
@@ -6484,11 +6693,12 @@
         </w:rPr>
       </w:pPr>
       <w:bookmarkStart w:id="9" w:name="_Toc357519059"/>
-      <w:bookmarkStart w:id="10" w:name="_Toc238078587"/>
-      <w:r>
-        <w:rPr>
-          <w:rFonts w:ascii="Calibri" w:hAnsi="Calibri"/>
-        </w:rPr>
+      <w:bookmarkStart w:id="10" w:name="_Toc238259024"/>
+      <w:r>
+        <w:rPr>
+          <w:rFonts w:ascii="Calibri" w:hAnsi="Calibri"/>
+        </w:rPr>
+        <w:lastRenderedPageBreak/>
         <w:t>Scope</w:t>
       </w:r>
       <w:bookmarkEnd w:id="9"/>
@@ -6611,7 +6821,6 @@
                 <w:sz w:val="22"/>
                 <w:szCs w:val="22"/>
               </w:rPr>
-              <w:lastRenderedPageBreak/>
               <w:t>Vendor compliance management.</w:t>
             </w:r>
           </w:p>
@@ -7019,7 +7228,7 @@
           <w:rFonts w:ascii="Calibri" w:hAnsi="Calibri"/>
         </w:rPr>
       </w:pPr>
-      <w:bookmarkStart w:id="11" w:name="_Toc238078588"/>
+      <w:bookmarkStart w:id="11" w:name="_Toc238259025"/>
       <w:r>
         <w:rPr>
           <w:rFonts w:ascii="Calibri" w:hAnsi="Calibri"/>
@@ -7813,7 +8022,7 @@
           <w:rFonts w:ascii="Calibri" w:hAnsi="Calibri"/>
         </w:rPr>
       </w:pPr>
-      <w:bookmarkStart w:id="12" w:name="_Toc238078589"/>
+      <w:bookmarkStart w:id="12" w:name="_Toc238259026"/>
       <w:r>
         <w:rPr>
           <w:rFonts w:ascii="Calibri" w:hAnsi="Calibri"/>
@@ -8196,7 +8405,16 @@
                 <w:sz w:val="22"/>
                 <w:szCs w:val="22"/>
               </w:rPr>
-              <w:t>Integration limitations or API restrictions may affect data synchronization between Business Central and the external platform.</w:t>
+              <w:t xml:space="preserve">Integration limitations or API restrictions may affect data </w:t>
+            </w:r>
+            <w:r>
+              <w:rPr>
+                <w:rFonts w:ascii="Calibri" w:hAnsi="Calibri"/>
+                <w:sz w:val="22"/>
+                <w:szCs w:val="22"/>
+              </w:rPr>
+              <w:lastRenderedPageBreak/>
+              <w:t>synchronization between Business Central and the external platform.</w:t>
             </w:r>
           </w:p>
         </w:tc>
@@ -8219,6 +8437,7 @@
                 <w:sz w:val="22"/>
                 <w:szCs w:val="22"/>
               </w:rPr>
+              <w:lastRenderedPageBreak/>
               <w:t>System Integration</w:t>
             </w:r>
           </w:p>
@@ -8323,7 +8542,6 @@
                 <w:sz w:val="22"/>
                 <w:szCs w:val="22"/>
               </w:rPr>
-              <w:lastRenderedPageBreak/>
               <w:t>R0</w:t>
             </w:r>
             <w:r>
@@ -8405,7 +8623,7 @@
           <w:rFonts w:ascii="Calibri" w:hAnsi="Calibri"/>
         </w:rPr>
       </w:pPr>
-      <w:bookmarkStart w:id="13" w:name="_Toc238078590"/>
+      <w:bookmarkStart w:id="13" w:name="_Toc238259027"/>
       <w:r>
         <w:rPr>
           <w:rFonts w:ascii="Calibri" w:hAnsi="Calibri"/>
@@ -9020,7 +9238,7 @@
           <w:rFonts w:ascii="Calibri" w:hAnsi="Calibri"/>
         </w:rPr>
       </w:pPr>
-      <w:bookmarkStart w:id="14" w:name="_Toc238078591"/>
+      <w:bookmarkStart w:id="14" w:name="_Toc238259028"/>
       <w:r>
         <w:rPr>
           <w:rFonts w:ascii="Calibri" w:hAnsi="Calibri"/>
@@ -9238,15 +9456,7 @@
                 <w:sz w:val="22"/>
                 <w:szCs w:val="22"/>
               </w:rPr>
-              <w:t>0</w:t>
-            </w:r>
-            <w:r>
-              <w:rPr>
-                <w:rFonts w:ascii="Calibri" w:hAnsi="Calibri"/>
-                <w:sz w:val="22"/>
-                <w:szCs w:val="22"/>
-              </w:rPr>
-              <w:t>2</w:t>
+              <w:t>02</w:t>
             </w:r>
           </w:p>
         </w:tc>
@@ -9325,15 +9535,7 @@
                 <w:sz w:val="22"/>
                 <w:szCs w:val="22"/>
               </w:rPr>
-              <w:t>0</w:t>
-            </w:r>
-            <w:r>
-              <w:rPr>
-                <w:rFonts w:ascii="Calibri" w:hAnsi="Calibri"/>
-                <w:sz w:val="22"/>
-                <w:szCs w:val="22"/>
-              </w:rPr>
-              <w:t>3</w:t>
+              <w:t>03</w:t>
             </w:r>
           </w:p>
         </w:tc>
@@ -9412,15 +9614,7 @@
                 <w:sz w:val="22"/>
                 <w:szCs w:val="22"/>
               </w:rPr>
-              <w:t>0</w:t>
-            </w:r>
-            <w:r>
-              <w:rPr>
-                <w:rFonts w:ascii="Calibri" w:hAnsi="Calibri"/>
-                <w:sz w:val="22"/>
-                <w:szCs w:val="22"/>
-              </w:rPr>
-              <w:t>4</w:t>
+              <w:t>04</w:t>
             </w:r>
           </w:p>
         </w:tc>
@@ -9499,15 +9693,7 @@
                 <w:sz w:val="22"/>
                 <w:szCs w:val="22"/>
               </w:rPr>
-              <w:t>0</w:t>
-            </w:r>
-            <w:r>
-              <w:rPr>
-                <w:rFonts w:ascii="Calibri" w:hAnsi="Calibri"/>
-                <w:sz w:val="22"/>
-                <w:szCs w:val="22"/>
-              </w:rPr>
-              <w:t>5</w:t>
+              <w:t>05</w:t>
             </w:r>
           </w:p>
         </w:tc>
@@ -9573,7 +9759,7 @@
           <w:rFonts w:ascii="Calibri" w:hAnsi="Calibri"/>
         </w:rPr>
       </w:pPr>
-      <w:bookmarkStart w:id="15" w:name="_Toc238078592"/>
+      <w:bookmarkStart w:id="15" w:name="_Toc238259029"/>
       <w:r>
         <w:rPr>
           <w:rFonts w:ascii="Calibri" w:hAnsi="Calibri"/>
@@ -9791,15 +9977,7 @@
                 <w:sz w:val="22"/>
                 <w:szCs w:val="22"/>
               </w:rPr>
-              <w:t>0</w:t>
-            </w:r>
-            <w:r>
-              <w:rPr>
-                <w:rFonts w:ascii="Calibri" w:hAnsi="Calibri"/>
-                <w:sz w:val="22"/>
-                <w:szCs w:val="22"/>
-              </w:rPr>
-              <w:t>2</w:t>
+              <w:t>02</w:t>
             </w:r>
           </w:p>
         </w:tc>
@@ -9878,15 +10056,7 @@
                 <w:sz w:val="22"/>
                 <w:szCs w:val="22"/>
               </w:rPr>
-              <w:t>0</w:t>
-            </w:r>
-            <w:r>
-              <w:rPr>
-                <w:rFonts w:ascii="Calibri" w:hAnsi="Calibri"/>
-                <w:sz w:val="22"/>
-                <w:szCs w:val="22"/>
-              </w:rPr>
-              <w:t>3</w:t>
+              <w:t>03</w:t>
             </w:r>
           </w:p>
         </w:tc>
@@ -9965,15 +10135,7 @@
                 <w:sz w:val="22"/>
                 <w:szCs w:val="22"/>
               </w:rPr>
-              <w:t>0</w:t>
-            </w:r>
-            <w:r>
-              <w:rPr>
-                <w:rFonts w:ascii="Calibri" w:hAnsi="Calibri"/>
-                <w:sz w:val="22"/>
-                <w:szCs w:val="22"/>
-              </w:rPr>
-              <w:t>4</w:t>
+              <w:t>04</w:t>
             </w:r>
           </w:p>
         </w:tc>
@@ -9996,7 +10158,16 @@
                 <w:sz w:val="22"/>
                 <w:szCs w:val="22"/>
               </w:rPr>
-              <w:t>Compliance team approval of document requirements and expiry rules.</w:t>
+              <w:t xml:space="preserve">Compliance team approval of document requirements and </w:t>
+            </w:r>
+            <w:r>
+              <w:rPr>
+                <w:rFonts w:ascii="Calibri" w:hAnsi="Calibri"/>
+                <w:sz w:val="22"/>
+                <w:szCs w:val="22"/>
+              </w:rPr>
+              <w:lastRenderedPageBreak/>
+              <w:t>expiry rules.</w:t>
             </w:r>
           </w:p>
         </w:tc>
@@ -10019,6 +10190,7 @@
                 <w:sz w:val="22"/>
                 <w:szCs w:val="22"/>
               </w:rPr>
+              <w:lastRenderedPageBreak/>
               <w:t>Compliance Management</w:t>
             </w:r>
           </w:p>
@@ -10052,15 +10224,7 @@
                 <w:sz w:val="22"/>
                 <w:szCs w:val="22"/>
               </w:rPr>
-              <w:t>0</w:t>
-            </w:r>
-            <w:r>
-              <w:rPr>
-                <w:rFonts w:ascii="Calibri" w:hAnsi="Calibri"/>
-                <w:sz w:val="22"/>
-                <w:szCs w:val="22"/>
-              </w:rPr>
-              <w:t>5</w:t>
+              <w:t>05</w:t>
             </w:r>
           </w:p>
         </w:tc>
@@ -10139,15 +10303,7 @@
                 <w:sz w:val="22"/>
                 <w:szCs w:val="22"/>
               </w:rPr>
-              <w:t>0</w:t>
-            </w:r>
-            <w:r>
-              <w:rPr>
-                <w:rFonts w:ascii="Calibri" w:hAnsi="Calibri"/>
-                <w:sz w:val="22"/>
-                <w:szCs w:val="22"/>
-              </w:rPr>
-              <w:t>6</w:t>
+              <w:t>06</w:t>
             </w:r>
           </w:p>
         </w:tc>
@@ -10170,16 +10326,7 @@
                 <w:sz w:val="22"/>
                 <w:szCs w:val="22"/>
               </w:rPr>
-              <w:t xml:space="preserve">Stakeholder approval of vendor risk scoring methodology and </w:t>
-            </w:r>
-            <w:r>
-              <w:rPr>
-                <w:rFonts w:ascii="Calibri" w:hAnsi="Calibri"/>
-                <w:sz w:val="22"/>
-                <w:szCs w:val="22"/>
-              </w:rPr>
-              <w:lastRenderedPageBreak/>
-              <w:t>risk thresholds.</w:t>
+              <w:t>Stakeholder approval of vendor risk scoring methodology and risk thresholds.</w:t>
             </w:r>
           </w:p>
         </w:tc>
@@ -10202,7 +10349,6 @@
                 <w:sz w:val="22"/>
                 <w:szCs w:val="22"/>
               </w:rPr>
-              <w:lastRenderedPageBreak/>
               <w:t>Risk Assessment Engine</w:t>
             </w:r>
           </w:p>
@@ -10244,7 +10390,7 @@
           <w:rFonts w:ascii="Calibri" w:hAnsi="Calibri"/>
         </w:rPr>
       </w:pPr>
-      <w:bookmarkStart w:id="16" w:name="_Toc238078593"/>
+      <w:bookmarkStart w:id="16" w:name="_Toc238259030"/>
       <w:r>
         <w:rPr>
           <w:rFonts w:ascii="Calibri" w:hAnsi="Calibri"/>
@@ -10260,17 +10406,21 @@
           <w:rFonts w:ascii="Times New Roman" w:hAnsi="Times New Roman"/>
         </w:rPr>
       </w:pPr>
+      <w:bookmarkStart w:id="17" w:name="_Toc238259031"/>
       <w:r>
         <w:t>Vendor Compliance &amp; Risk Monitoring</w:t>
       </w:r>
+      <w:bookmarkEnd w:id="17"/>
     </w:p>
     <w:p>
       <w:pPr>
         <w:pStyle w:val="Heading3"/>
       </w:pPr>
+      <w:bookmarkStart w:id="18" w:name="_Toc238259032"/>
       <w:r>
         <w:t>Process Objective</w:t>
       </w:r>
+      <w:bookmarkEnd w:id="18"/>
     </w:p>
     <w:p>
       <w:pPr>
@@ -10719,7 +10869,7 @@
       </w:pPr>
       <w:r>
         <w:pict w14:anchorId="6C7A50A0">
-          <v:rect id="_x0000_i1061" style="width:0;height:1.5pt" o:hralign="center" o:hrstd="t" o:hr="t" fillcolor="#a0a0a0" stroked="f"/>
+          <v:rect id="_x0000_i1025" style="width:0;height:1.5pt" o:hralign="center" o:hrstd="t" o:hr="t" fillcolor="#a0a0a0" stroked="f"/>
         </w:pict>
       </w:r>
     </w:p>
@@ -10756,6 +10906,7 @@
         <w:pStyle w:val="NormalWeb"/>
       </w:pPr>
       <w:r>
+        <w:lastRenderedPageBreak/>
         <w:t>However:</w:t>
       </w:r>
     </w:p>
@@ -10780,7 +10931,6 @@
         </w:numPr>
       </w:pPr>
       <w:r>
-        <w:lastRenderedPageBreak/>
         <w:t xml:space="preserve">Some records are maintained via email </w:t>
       </w:r>
     </w:p>
@@ -10831,7 +10981,7 @@
       </w:pPr>
       <w:r>
         <w:pict w14:anchorId="2B73E983">
-          <v:rect id="_x0000_i1062" style="width:0;height:1.5pt" o:hralign="center" o:hrstd="t" o:hr="t" fillcolor="#a0a0a0" stroked="f"/>
+          <v:rect id="_x0000_i1026" style="width:0;height:1.5pt" o:hralign="center" o:hrstd="t" o:hr="t" fillcolor="#a0a0a0" stroked="f"/>
         </w:pict>
       </w:r>
     </w:p>
@@ -10966,7 +11116,7 @@
       </w:pPr>
       <w:r>
         <w:pict w14:anchorId="18D202E9">
-          <v:rect id="_x0000_i1063" style="width:0;height:1.5pt" o:hralign="center" o:hrstd="t" o:hr="t" fillcolor="#a0a0a0" stroked="f"/>
+          <v:rect id="_x0000_i1027" style="width:0;height:1.5pt" o:hralign="center" o:hrstd="t" o:hr="t" fillcolor="#a0a0a0" stroked="f"/>
         </w:pict>
       </w:r>
     </w:p>
@@ -11063,6 +11213,7 @@
         <w:pStyle w:val="NormalWeb"/>
       </w:pPr>
       <w:r>
+        <w:lastRenderedPageBreak/>
         <w:t>Payments are completed.</w:t>
       </w:r>
     </w:p>
@@ -11071,9 +11222,8 @@
         <w:pStyle w:val="NormalWeb"/>
       </w:pPr>
       <w:r>
-        <w:lastRenderedPageBreak/>
         <w:pict w14:anchorId="4BC66096">
-          <v:rect id="_x0000_i1064" style="width:0;height:1.5pt" o:hralign="center" o:hrstd="t" o:hr="t" fillcolor="#a0a0a0" stroked="f"/>
+          <v:rect id="_x0000_i1028" style="width:0;height:1.5pt" o:hralign="center" o:hrstd="t" o:hr="t" fillcolor="#a0a0a0" stroked="f"/>
         </w:pict>
       </w:r>
     </w:p>
@@ -11203,7 +11353,7 @@
       </w:pPr>
       <w:r>
         <w:pict w14:anchorId="14744053">
-          <v:rect id="_x0000_i1065" style="width:0;height:1.5pt" o:hralign="center" o:hrstd="t" o:hr="t" fillcolor="#a0a0a0" stroked="f"/>
+          <v:rect id="_x0000_i1029" style="width:0;height:1.5pt" o:hralign="center" o:hrstd="t" o:hr="t" fillcolor="#a0a0a0" stroked="f"/>
         </w:pict>
       </w:r>
     </w:p>
@@ -11332,7 +11482,7 @@
       </w:pPr>
       <w:r>
         <w:pict w14:anchorId="4AD45DDC">
-          <v:rect id="_x0000_i1066" style="width:0;height:1.5pt" o:hralign="center" o:hrstd="t" o:hr="t" fillcolor="#a0a0a0" stroked="f"/>
+          <v:rect id="_x0000_i1030" style="width:0;height:1.5pt" o:hralign="center" o:hrstd="t" o:hr="t" fillcolor="#a0a0a0" stroked="f"/>
         </w:pict>
       </w:r>
     </w:p>
@@ -11417,6 +11567,7 @@
         </w:numPr>
       </w:pPr>
       <w:r>
+        <w:lastRenderedPageBreak/>
         <w:t xml:space="preserve">Excel </w:t>
       </w:r>
     </w:p>
@@ -11429,7 +11580,6 @@
         </w:numPr>
       </w:pPr>
       <w:r>
-        <w:lastRenderedPageBreak/>
         <w:t xml:space="preserve">Manual exports from ERP </w:t>
       </w:r>
     </w:p>
@@ -11493,14 +11643,14 @@
           <w:rFonts w:ascii="Calibri" w:hAnsi="Calibri"/>
         </w:rPr>
       </w:pPr>
-      <w:bookmarkStart w:id="17" w:name="_Toc238078594"/>
+      <w:bookmarkStart w:id="19" w:name="_Toc238259033"/>
       <w:r>
         <w:rPr>
           <w:rFonts w:ascii="Calibri" w:hAnsi="Calibri"/>
         </w:rPr>
         <w:t>Context Diagram</w:t>
       </w:r>
-      <w:bookmarkEnd w:id="17"/>
+      <w:bookmarkEnd w:id="19"/>
     </w:p>
     <w:p>
       <w:pPr>
@@ -11519,6 +11669,66 @@
           <w:rFonts w:ascii="Calibri" w:hAnsi="Calibri"/>
         </w:rPr>
       </w:pPr>
+      <w:r>
+        <w:rPr>
+          <w:rFonts w:ascii="Calibri" w:hAnsi="Calibri"/>
+          <w:noProof/>
+        </w:rPr>
+        <w:drawing>
+          <wp:inline distT="0" distB="0" distL="0" distR="0" wp14:anchorId="45F0A7B3" wp14:editId="18F5F8B8">
+            <wp:extent cx="5733415" cy="5130165"/>
+            <wp:effectExtent l="19050" t="19050" r="19685" b="13335"/>
+            <wp:docPr id="776569871" name="Picture 1"/>
+            <wp:cNvGraphicFramePr>
+              <a:graphicFrameLocks xmlns:a="http://schemas.openxmlformats.org/drawingml/2006/main" noChangeAspect="1"/>
+            </wp:cNvGraphicFramePr>
+            <a:graphic xmlns:a="http://schemas.openxmlformats.org/drawingml/2006/main">
+              <a:graphicData uri="http://schemas.openxmlformats.org/drawingml/2006/picture">
+                <pic:pic xmlns:pic="http://schemas.openxmlformats.org/drawingml/2006/picture">
+                  <pic:nvPicPr>
+                    <pic:cNvPr id="776569871" name="Picture 776569871"/>
+                    <pic:cNvPicPr/>
+                  </pic:nvPicPr>
+                  <pic:blipFill>
+                    <a:blip r:embed="rId11"/>
+                    <a:stretch>
+                      <a:fillRect/>
+                    </a:stretch>
+                  </pic:blipFill>
+                  <pic:spPr>
+                    <a:xfrm>
+                      <a:off x="0" y="0"/>
+                      <a:ext cx="5733415" cy="5130165"/>
+                    </a:xfrm>
+                    <a:prstGeom prst="rect">
+                      <a:avLst/>
+                    </a:prstGeom>
+                    <a:ln>
+                      <a:solidFill>
+                        <a:schemeClr val="tx1"/>
+                      </a:solidFill>
+                    </a:ln>
+                  </pic:spPr>
+                </pic:pic>
+              </a:graphicData>
+            </a:graphic>
+          </wp:inline>
+        </w:drawing>
+      </w:r>
+    </w:p>
+    <w:p>
+      <w:pPr>
+        <w:rPr>
+          <w:rFonts w:ascii="Calibri" w:hAnsi="Calibri"/>
+        </w:rPr>
+      </w:pPr>
+    </w:p>
+    <w:p>
+      <w:pPr>
+        <w:rPr>
+          <w:rFonts w:ascii="Calibri" w:hAnsi="Calibri"/>
+        </w:rPr>
+      </w:pPr>
     </w:p>
     <w:p>
       <w:pPr>
@@ -11534,14 +11744,14 @@
           <w:rFonts w:ascii="Calibri" w:hAnsi="Calibri"/>
         </w:rPr>
       </w:pPr>
-      <w:bookmarkStart w:id="18" w:name="_Toc238078595"/>
+      <w:bookmarkStart w:id="20" w:name="_Toc238259034"/>
       <w:r>
         <w:rPr>
           <w:rFonts w:ascii="Calibri" w:hAnsi="Calibri"/>
         </w:rPr>
         <w:t>Process Overview Diagram</w:t>
       </w:r>
-      <w:bookmarkEnd w:id="18"/>
+      <w:bookmarkEnd w:id="20"/>
       <w:r>
         <w:rPr>
           <w:rFonts w:ascii="Calibri" w:hAnsi="Calibri"/>
@@ -11613,7 +11823,7 @@
           <w:rFonts w:ascii="Calibri" w:hAnsi="Calibri"/>
         </w:rPr>
       </w:pPr>
-      <w:bookmarkStart w:id="19" w:name="_Toc238078596"/>
+      <w:bookmarkStart w:id="21" w:name="_Toc238259035"/>
       <w:r>
         <w:rPr>
           <w:rFonts w:ascii="Calibri" w:hAnsi="Calibri"/>
@@ -11634,7 +11844,7 @@
         </w:rPr>
         <w:t xml:space="preserve"> Be Business Requirements</w:t>
       </w:r>
-      <w:bookmarkEnd w:id="19"/>
+      <w:bookmarkEnd w:id="21"/>
     </w:p>
     <w:p>
       <w:pPr>
@@ -11786,9 +11996,9 @@
           <w:rFonts w:ascii="Calibri" w:hAnsi="Calibri"/>
         </w:rPr>
         <w:sectPr>
-          <w:headerReference w:type="default" r:id="rId11"/>
-          <w:footerReference w:type="default" r:id="rId12"/>
-          <w:footerReference w:type="first" r:id="rId13"/>
+          <w:headerReference w:type="default" r:id="rId12"/>
+          <w:footerReference w:type="default" r:id="rId13"/>
+          <w:footerReference w:type="first" r:id="rId14"/>
           <w:pgSz w:w="11909" w:h="16834" w:code="9"/>
           <w:pgMar w:top="1440" w:right="1440" w:bottom="1440" w:left="1440" w:header="709" w:footer="709" w:gutter="0"/>
           <w:cols w:space="720"/>
@@ -11803,8 +12013,8 @@
           <w:rFonts w:ascii="Calibri" w:hAnsi="Calibri"/>
         </w:rPr>
       </w:pPr>
-      <w:bookmarkStart w:id="20" w:name="_Toc357519062"/>
-      <w:bookmarkStart w:id="21" w:name="_Toc238078597"/>
+      <w:bookmarkStart w:id="22" w:name="_Toc357519062"/>
+      <w:bookmarkStart w:id="23" w:name="_Toc238259036"/>
       <w:r>
         <w:rPr>
           <w:rFonts w:ascii="Calibri" w:hAnsi="Calibri"/>
@@ -11812,8 +12022,8 @@
         <w:lastRenderedPageBreak/>
         <w:t>Detailed Business/IT Requirements</w:t>
       </w:r>
-      <w:bookmarkEnd w:id="20"/>
-      <w:bookmarkEnd w:id="21"/>
+      <w:bookmarkEnd w:id="22"/>
+      <w:bookmarkEnd w:id="23"/>
       <w:r>
         <w:rPr>
           <w:rFonts w:ascii="Calibri" w:hAnsi="Calibri"/>
@@ -11837,8 +12047,8 @@
           <w:szCs w:val="22"/>
         </w:rPr>
       </w:pPr>
-      <w:bookmarkStart w:id="22" w:name="_Toc357519063"/>
-      <w:bookmarkStart w:id="23" w:name="_Toc238078598"/>
+      <w:bookmarkStart w:id="24" w:name="_Toc357519063"/>
+      <w:bookmarkStart w:id="25" w:name="_Toc238259037"/>
       <w:r>
         <w:rPr>
           <w:rFonts w:ascii="Calibri" w:hAnsi="Calibri"/>
@@ -11847,8 +12057,8 @@
         </w:rPr>
         <w:t>Functional Requirements</w:t>
       </w:r>
-      <w:bookmarkEnd w:id="22"/>
-      <w:bookmarkEnd w:id="23"/>
+      <w:bookmarkEnd w:id="24"/>
+      <w:bookmarkEnd w:id="25"/>
       <w:r>
         <w:rPr>
           <w:rFonts w:ascii="Calibri" w:hAnsi="Calibri"/>
@@ -12997,7 +13207,7 @@
           <w:szCs w:val="22"/>
         </w:rPr>
       </w:pPr>
-      <w:bookmarkStart w:id="24" w:name="_Toc238078599"/>
+      <w:bookmarkStart w:id="26" w:name="_Toc238259038"/>
       <w:r>
         <w:rPr>
           <w:rFonts w:ascii="Calibri" w:hAnsi="Calibri"/>
@@ -13007,7 +13217,7 @@
         <w:lastRenderedPageBreak/>
         <w:t>Process Diagram</w:t>
       </w:r>
-      <w:bookmarkEnd w:id="24"/>
+      <w:bookmarkEnd w:id="26"/>
       <w:r>
         <w:rPr>
           <w:rFonts w:ascii="Calibri" w:hAnsi="Calibri"/>
@@ -13065,8 +13275,8 @@
           <w:szCs w:val="22"/>
         </w:rPr>
       </w:pPr>
-      <w:bookmarkStart w:id="25" w:name="_Toc357519064"/>
-      <w:bookmarkStart w:id="26" w:name="_Toc238078600"/>
+      <w:bookmarkStart w:id="27" w:name="_Toc357519064"/>
+      <w:bookmarkStart w:id="28" w:name="_Toc238259039"/>
       <w:proofErr w:type="gramStart"/>
       <w:r>
         <w:rPr>
@@ -13085,8 +13295,8 @@
         </w:rPr>
         <w:t xml:space="preserve"> Requirements</w:t>
       </w:r>
-      <w:bookmarkEnd w:id="25"/>
-      <w:bookmarkEnd w:id="26"/>
+      <w:bookmarkEnd w:id="27"/>
+      <w:bookmarkEnd w:id="28"/>
       <w:r>
         <w:rPr>
           <w:rFonts w:ascii="Calibri" w:hAnsi="Calibri"/>
@@ -14111,7 +14321,7 @@
           <w:szCs w:val="22"/>
         </w:rPr>
       </w:pPr>
-      <w:bookmarkStart w:id="27" w:name="_Toc357519065"/>
+      <w:bookmarkStart w:id="29" w:name="_Toc357519065"/>
       <w:r>
         <w:rPr>
           <w:rFonts w:ascii="Calibri" w:hAnsi="Calibri"/>
@@ -16464,8 +16674,8 @@
           <w:rFonts w:ascii="Calibri" w:hAnsi="Calibri"/>
         </w:rPr>
       </w:pPr>
-      <w:bookmarkStart w:id="28" w:name="_Toc238078601"/>
-      <w:bookmarkEnd w:id="27"/>
+      <w:bookmarkStart w:id="30" w:name="_Toc238259040"/>
+      <w:bookmarkEnd w:id="29"/>
       <w:r>
         <w:rPr>
           <w:rFonts w:ascii="Calibri" w:hAnsi="Calibri"/>
@@ -16473,7 +16683,7 @@
         <w:lastRenderedPageBreak/>
         <w:t>Business Impact Assessment</w:t>
       </w:r>
-      <w:bookmarkEnd w:id="28"/>
+      <w:bookmarkEnd w:id="30"/>
     </w:p>
     <w:p/>
     <w:tbl>
@@ -17533,7 +17743,7 @@
           <w:rFonts w:ascii="Calibri" w:hAnsi="Calibri"/>
         </w:rPr>
       </w:pPr>
-      <w:bookmarkStart w:id="29" w:name="_Toc238078602"/>
+      <w:bookmarkStart w:id="31" w:name="_Toc238259041"/>
       <w:r>
         <w:rPr>
           <w:rFonts w:ascii="Calibri" w:hAnsi="Calibri"/>
@@ -17541,7 +17751,7 @@
         <w:lastRenderedPageBreak/>
         <w:t>Costs</w:t>
       </w:r>
-      <w:bookmarkEnd w:id="29"/>
+      <w:bookmarkEnd w:id="31"/>
     </w:p>
     <w:p>
       <w:pPr>
@@ -17614,14 +17824,14 @@
           <w:rFonts w:ascii="Calibri" w:hAnsi="Calibri"/>
         </w:rPr>
       </w:pPr>
-      <w:bookmarkStart w:id="30" w:name="_Toc238078603"/>
+      <w:bookmarkStart w:id="32" w:name="_Toc238259042"/>
       <w:r>
         <w:rPr>
           <w:rFonts w:ascii="Calibri" w:hAnsi="Calibri"/>
         </w:rPr>
         <w:t>Appendices</w:t>
       </w:r>
-      <w:bookmarkEnd w:id="30"/>
+      <w:bookmarkEnd w:id="32"/>
     </w:p>
     <w:p>
       <w:pPr>
@@ -18166,7 +18376,7 @@
         <w:noProof/>
         <w:sz w:val="16"/>
       </w:rPr>
-      <w:t>21/08/26</w:t>
+      <w:t>22/08/26</w:t>
     </w:r>
     <w:r>
       <w:rPr>
@@ -22099,7 +22309,7 @@
     <w:lsdException w:name="index 9" w:semiHidden="1" w:unhideWhenUsed="1"/>
     <w:lsdException w:name="toc 1" w:locked="1" w:uiPriority="39"/>
     <w:lsdException w:name="toc 2" w:locked="1" w:uiPriority="39"/>
-    <w:lsdException w:name="toc 3" w:locked="1" w:uiPriority="0"/>
+    <w:lsdException w:name="toc 3" w:locked="1" w:uiPriority="39"/>
     <w:lsdException w:name="toc 4" w:semiHidden="1" w:uiPriority="39" w:unhideWhenUsed="1"/>
     <w:lsdException w:name="toc 5" w:semiHidden="1" w:uiPriority="39" w:unhideWhenUsed="1"/>
     <w:lsdException w:name="toc 6" w:semiHidden="1" w:uiPriority="39" w:unhideWhenUsed="1"/>
@@ -22650,6 +22860,7 @@
   <w:style w:type="character" w:default="1" w:styleId="DefaultParagraphFont">
     <w:name w:val="Default Paragraph Font"/>
     <w:uiPriority w:val="1"/>
+    <w:semiHidden/>
     <w:unhideWhenUsed/>
   </w:style>
   <w:style w:type="table" w:default="1" w:styleId="TableNormal">
@@ -22933,7 +23144,7 @@
     <w:basedOn w:val="Normal"/>
     <w:next w:val="Normal"/>
     <w:autoRedefine/>
-    <w:uiPriority w:val="99"/>
+    <w:uiPriority w:val="39"/>
     <w:rsid w:val="00FA52F8"/>
     <w:pPr>
       <w:ind w:left="400"/>

</xml_diff>

<commit_message>
Started the Solution Architecture Document - Completed Introduction and Solution Overview chapters
</commit_message>
<xml_diff>
--- a/docs/Business-Requirements-Document-BRD.docx
+++ b/docs/Business-Requirements-Document-BRD.docx
@@ -10040,7 +10040,7 @@
         <w:tblLook w:val="04A0" w:firstRow="1" w:lastRow="0" w:firstColumn="1" w:lastColumn="0" w:noHBand="0" w:noVBand="1"/>
       </w:tblPr>
       <w:tblGrid>
-        <w:gridCol w:w="2788"/>
+        <w:gridCol w:w="2631"/>
         <w:gridCol w:w="3950"/>
       </w:tblGrid>
       <w:tr>
@@ -10051,7 +10051,34 @@
         <w:tc>
           <w:tcPr>
             <w:tcW w:w="0" w:type="auto"/>
-            <w:shd w:val="clear" w:color="auto" w:fill="92D050"/>
+            <w:shd w:val="clear" w:color="auto" w:fill="D9D9D9"/>
+            <w:vAlign w:val="center"/>
+            <w:hideMark/>
+          </w:tcPr>
+          <w:p>
+            <w:pPr>
+              <w:rPr>
+                <w:rFonts w:asciiTheme="minorHAnsi" w:hAnsiTheme="minorHAnsi" w:cstheme="minorHAnsi"/>
+                <w:b/>
+                <w:sz w:val="22"/>
+                <w:szCs w:val="22"/>
+              </w:rPr>
+            </w:pPr>
+            <w:r>
+              <w:rPr>
+                <w:rFonts w:asciiTheme="minorHAnsi" w:hAnsiTheme="minorHAnsi" w:cstheme="minorHAnsi"/>
+                <w:b/>
+                <w:sz w:val="22"/>
+                <w:szCs w:val="22"/>
+              </w:rPr>
+              <w:t>Role</w:t>
+            </w:r>
+          </w:p>
+        </w:tc>
+        <w:tc>
+          <w:tcPr>
+            <w:tcW w:w="0" w:type="auto"/>
+            <w:shd w:val="clear" w:color="auto" w:fill="D9D9D9"/>
             <w:vAlign w:val="center"/>
             <w:hideMark/>
           </w:tcPr>
@@ -10062,41 +10089,18 @@
               <w:rPr>
                 <w:rFonts w:asciiTheme="minorHAnsi" w:hAnsiTheme="minorHAnsi" w:cstheme="minorHAnsi"/>
                 <w:b/>
-                <w:bCs/>
+                <w:sz w:val="22"/>
+                <w:szCs w:val="22"/>
+                <w:lang w:val="en-GB"/>
               </w:rPr>
             </w:pPr>
             <w:r>
               <w:rPr>
                 <w:rFonts w:asciiTheme="minorHAnsi" w:hAnsiTheme="minorHAnsi" w:cstheme="minorHAnsi"/>
                 <w:b/>
-                <w:bCs/>
-              </w:rPr>
-              <w:t>Role</w:t>
-            </w:r>
-          </w:p>
-        </w:tc>
-        <w:tc>
-          <w:tcPr>
-            <w:tcW w:w="0" w:type="auto"/>
-            <w:shd w:val="clear" w:color="auto" w:fill="92D050"/>
-            <w:vAlign w:val="center"/>
-            <w:hideMark/>
-          </w:tcPr>
-          <w:p>
-            <w:pPr>
-              <w:pStyle w:val="NormalWeb"/>
-              <w:jc w:val="center"/>
-              <w:rPr>
-                <w:rFonts w:asciiTheme="minorHAnsi" w:hAnsiTheme="minorHAnsi" w:cstheme="minorHAnsi"/>
-                <w:b/>
-                <w:bCs/>
-              </w:rPr>
-            </w:pPr>
-            <w:r>
-              <w:rPr>
-                <w:rFonts w:asciiTheme="minorHAnsi" w:hAnsiTheme="minorHAnsi" w:cstheme="minorHAnsi"/>
-                <w:b/>
-                <w:bCs/>
+                <w:sz w:val="22"/>
+                <w:szCs w:val="22"/>
+                <w:lang w:val="en-GB"/>
               </w:rPr>
               <w:t>Responsibility</w:t>
             </w:r>
@@ -10115,14 +10119,19 @@
           </w:tcPr>
           <w:p>
             <w:pPr>
-              <w:pStyle w:val="NormalWeb"/>
-              <w:rPr>
-                <w:rFonts w:asciiTheme="minorHAnsi" w:hAnsiTheme="minorHAnsi" w:cstheme="minorHAnsi"/>
-              </w:rPr>
-            </w:pPr>
-            <w:r>
-              <w:rPr>
-                <w:rFonts w:asciiTheme="minorHAnsi" w:hAnsiTheme="minorHAnsi" w:cstheme="minorHAnsi"/>
+              <w:rPr>
+                <w:rFonts w:asciiTheme="minorHAnsi" w:hAnsiTheme="minorHAnsi" w:cstheme="minorHAnsi"/>
+                <w:b/>
+                <w:sz w:val="22"/>
+                <w:szCs w:val="22"/>
+              </w:rPr>
+            </w:pPr>
+            <w:r>
+              <w:rPr>
+                <w:rFonts w:asciiTheme="minorHAnsi" w:hAnsiTheme="minorHAnsi" w:cstheme="minorHAnsi"/>
+                <w:b/>
+                <w:sz w:val="22"/>
+                <w:szCs w:val="22"/>
               </w:rPr>
               <w:t>Vendor</w:t>
             </w:r>
@@ -10162,14 +10171,19 @@
           </w:tcPr>
           <w:p>
             <w:pPr>
-              <w:pStyle w:val="NormalWeb"/>
-              <w:rPr>
-                <w:rFonts w:asciiTheme="minorHAnsi" w:hAnsiTheme="minorHAnsi" w:cstheme="minorHAnsi"/>
-              </w:rPr>
-            </w:pPr>
-            <w:r>
-              <w:rPr>
-                <w:rFonts w:asciiTheme="minorHAnsi" w:hAnsiTheme="minorHAnsi" w:cstheme="minorHAnsi"/>
+              <w:rPr>
+                <w:rFonts w:asciiTheme="minorHAnsi" w:hAnsiTheme="minorHAnsi" w:cstheme="minorHAnsi"/>
+                <w:b/>
+                <w:sz w:val="22"/>
+                <w:szCs w:val="22"/>
+              </w:rPr>
+            </w:pPr>
+            <w:r>
+              <w:rPr>
+                <w:rFonts w:asciiTheme="minorHAnsi" w:hAnsiTheme="minorHAnsi" w:cstheme="minorHAnsi"/>
+                <w:b/>
+                <w:sz w:val="22"/>
+                <w:szCs w:val="22"/>
               </w:rPr>
               <w:t>Procurement Officer</w:t>
             </w:r>
@@ -10209,14 +10223,19 @@
           </w:tcPr>
           <w:p>
             <w:pPr>
-              <w:pStyle w:val="NormalWeb"/>
-              <w:rPr>
-                <w:rFonts w:asciiTheme="minorHAnsi" w:hAnsiTheme="minorHAnsi" w:cstheme="minorHAnsi"/>
-              </w:rPr>
-            </w:pPr>
-            <w:r>
-              <w:rPr>
-                <w:rFonts w:asciiTheme="minorHAnsi" w:hAnsiTheme="minorHAnsi" w:cstheme="minorHAnsi"/>
+              <w:rPr>
+                <w:rFonts w:asciiTheme="minorHAnsi" w:hAnsiTheme="minorHAnsi" w:cstheme="minorHAnsi"/>
+                <w:b/>
+                <w:sz w:val="22"/>
+                <w:szCs w:val="22"/>
+              </w:rPr>
+            </w:pPr>
+            <w:r>
+              <w:rPr>
+                <w:rFonts w:asciiTheme="minorHAnsi" w:hAnsiTheme="minorHAnsi" w:cstheme="minorHAnsi"/>
+                <w:b/>
+                <w:sz w:val="22"/>
+                <w:szCs w:val="22"/>
               </w:rPr>
               <w:t>Procurement Manager</w:t>
             </w:r>
@@ -10256,14 +10275,19 @@
           </w:tcPr>
           <w:p>
             <w:pPr>
-              <w:pStyle w:val="NormalWeb"/>
-              <w:rPr>
-                <w:rFonts w:asciiTheme="minorHAnsi" w:hAnsiTheme="minorHAnsi" w:cstheme="minorHAnsi"/>
-              </w:rPr>
-            </w:pPr>
-            <w:r>
-              <w:rPr>
-                <w:rFonts w:asciiTheme="minorHAnsi" w:hAnsiTheme="minorHAnsi" w:cstheme="minorHAnsi"/>
+              <w:rPr>
+                <w:rFonts w:asciiTheme="minorHAnsi" w:hAnsiTheme="minorHAnsi" w:cstheme="minorHAnsi"/>
+                <w:b/>
+                <w:sz w:val="22"/>
+                <w:szCs w:val="22"/>
+              </w:rPr>
+            </w:pPr>
+            <w:r>
+              <w:rPr>
+                <w:rFonts w:asciiTheme="minorHAnsi" w:hAnsiTheme="minorHAnsi" w:cstheme="minorHAnsi"/>
+                <w:b/>
+                <w:sz w:val="22"/>
+                <w:szCs w:val="22"/>
               </w:rPr>
               <w:t>Finance Team</w:t>
             </w:r>
@@ -10303,14 +10327,19 @@
           </w:tcPr>
           <w:p>
             <w:pPr>
-              <w:pStyle w:val="NormalWeb"/>
-              <w:rPr>
-                <w:rFonts w:asciiTheme="minorHAnsi" w:hAnsiTheme="minorHAnsi" w:cstheme="minorHAnsi"/>
-              </w:rPr>
-            </w:pPr>
-            <w:r>
-              <w:rPr>
-                <w:rFonts w:asciiTheme="minorHAnsi" w:hAnsiTheme="minorHAnsi" w:cstheme="minorHAnsi"/>
+              <w:rPr>
+                <w:rFonts w:asciiTheme="minorHAnsi" w:hAnsiTheme="minorHAnsi" w:cstheme="minorHAnsi"/>
+                <w:b/>
+                <w:sz w:val="22"/>
+                <w:szCs w:val="22"/>
+              </w:rPr>
+            </w:pPr>
+            <w:r>
+              <w:rPr>
+                <w:rFonts w:asciiTheme="minorHAnsi" w:hAnsiTheme="minorHAnsi" w:cstheme="minorHAnsi"/>
+                <w:b/>
+                <w:sz w:val="22"/>
+                <w:szCs w:val="22"/>
               </w:rPr>
               <w:t>Internal Audit / Compliance</w:t>
             </w:r>
@@ -10350,14 +10379,19 @@
           </w:tcPr>
           <w:p>
             <w:pPr>
-              <w:pStyle w:val="NormalWeb"/>
-              <w:rPr>
-                <w:rFonts w:asciiTheme="minorHAnsi" w:hAnsiTheme="minorHAnsi" w:cstheme="minorHAnsi"/>
-              </w:rPr>
-            </w:pPr>
-            <w:r>
-              <w:rPr>
-                <w:rFonts w:asciiTheme="minorHAnsi" w:hAnsiTheme="minorHAnsi" w:cstheme="minorHAnsi"/>
+              <w:rPr>
+                <w:rFonts w:asciiTheme="minorHAnsi" w:hAnsiTheme="minorHAnsi" w:cstheme="minorHAnsi"/>
+                <w:b/>
+                <w:sz w:val="22"/>
+                <w:szCs w:val="22"/>
+              </w:rPr>
+            </w:pPr>
+            <w:r>
+              <w:rPr>
+                <w:rFonts w:asciiTheme="minorHAnsi" w:hAnsiTheme="minorHAnsi" w:cstheme="minorHAnsi"/>
+                <w:b/>
+                <w:sz w:val="22"/>
+                <w:szCs w:val="22"/>
               </w:rPr>
               <w:t>Management</w:t>
             </w:r>
@@ -10604,7 +10638,7 @@
           <w:rFonts w:asciiTheme="minorHAnsi" w:hAnsiTheme="minorHAnsi" w:cstheme="minorHAnsi"/>
         </w:rPr>
         <w:pict w14:anchorId="6C7A50A0">
-          <v:rect id="_x0000_i1067" style="width:0;height:1.5pt" o:hralign="center" o:hrstd="t" o:hr="t" fillcolor="#a0a0a0" stroked="f"/>
+          <v:rect id="_x0000_i1025" style="width:0;height:1.5pt" o:hralign="center" o:hrstd="t" o:hr="t" fillcolor="#a0a0a0" stroked="f"/>
         </w:pict>
       </w:r>
     </w:p>
@@ -10772,7 +10806,7 @@
           <w:rFonts w:asciiTheme="minorHAnsi" w:hAnsiTheme="minorHAnsi" w:cstheme="minorHAnsi"/>
         </w:rPr>
         <w:pict w14:anchorId="2B73E983">
-          <v:rect id="_x0000_i1068" style="width:0;height:1.5pt" o:hralign="center" o:hrstd="t" o:hr="t" fillcolor="#a0a0a0" stroked="f"/>
+          <v:rect id="_x0000_i1026" style="width:0;height:1.5pt" o:hralign="center" o:hrstd="t" o:hr="t" fillcolor="#a0a0a0" stroked="f"/>
         </w:pict>
       </w:r>
     </w:p>
@@ -10975,7 +11009,7 @@
           <w:rFonts w:asciiTheme="minorHAnsi" w:hAnsiTheme="minorHAnsi" w:cstheme="minorHAnsi"/>
         </w:rPr>
         <w:pict w14:anchorId="18D202E9">
-          <v:rect id="_x0000_i1069" style="width:0;height:1.5pt" o:hralign="center" o:hrstd="t" o:hr="t" fillcolor="#a0a0a0" stroked="f"/>
+          <v:rect id="_x0000_i1027" style="width:0;height:1.5pt" o:hralign="center" o:hrstd="t" o:hr="t" fillcolor="#a0a0a0" stroked="f"/>
         </w:pict>
       </w:r>
     </w:p>
@@ -11144,7 +11178,7 @@
           <w:rFonts w:asciiTheme="minorHAnsi" w:hAnsiTheme="minorHAnsi" w:cstheme="minorHAnsi"/>
         </w:rPr>
         <w:pict w14:anchorId="4BC66096">
-          <v:rect id="_x0000_i1070" style="width:0;height:1.5pt" o:hralign="center" o:hrstd="t" o:hr="t" fillcolor="#a0a0a0" stroked="f"/>
+          <v:rect id="_x0000_i1028" style="width:0;height:1.5pt" o:hralign="center" o:hrstd="t" o:hr="t" fillcolor="#a0a0a0" stroked="f"/>
         </w:pict>
       </w:r>
     </w:p>
@@ -11336,7 +11370,7 @@
           <w:rFonts w:asciiTheme="minorHAnsi" w:hAnsiTheme="minorHAnsi" w:cstheme="minorHAnsi"/>
         </w:rPr>
         <w:pict w14:anchorId="14744053">
-          <v:rect id="_x0000_i1071" style="width:0;height:1.5pt" o:hralign="center" o:hrstd="t" o:hr="t" fillcolor="#a0a0a0" stroked="f"/>
+          <v:rect id="_x0000_i1029" style="width:0;height:1.5pt" o:hralign="center" o:hrstd="t" o:hr="t" fillcolor="#a0a0a0" stroked="f"/>
         </w:pict>
       </w:r>
     </w:p>
@@ -11536,7 +11570,7 @@
           <w:rFonts w:asciiTheme="minorHAnsi" w:hAnsiTheme="minorHAnsi" w:cstheme="minorHAnsi"/>
         </w:rPr>
         <w:pict w14:anchorId="4AD45DDC">
-          <v:rect id="_x0000_i1072" style="width:0;height:1.5pt" o:hralign="center" o:hrstd="t" o:hr="t" fillcolor="#a0a0a0" stroked="f"/>
+          <v:rect id="_x0000_i1030" style="width:0;height:1.5pt" o:hralign="center" o:hrstd="t" o:hr="t" fillcolor="#a0a0a0" stroked="f"/>
         </w:pict>
       </w:r>
     </w:p>
@@ -12125,32 +12159,25 @@
         <w:tc>
           <w:tcPr>
             <w:tcW w:w="861" w:type="dxa"/>
-            <w:shd w:val="clear" w:color="auto" w:fill="92D050"/>
-            <w:vAlign w:val="center"/>
-            <w:hideMark/>
-          </w:tcPr>
-          <w:p>
-            <w:pPr>
-              <w:jc w:val="center"/>
+            <w:shd w:val="clear" w:color="auto" w:fill="BFBFBF" w:themeFill="background1" w:themeFillShade="BF"/>
+            <w:vAlign w:val="center"/>
+            <w:hideMark/>
+          </w:tcPr>
+          <w:p>
+            <w:pPr>
               <w:rPr>
                 <w:rFonts w:asciiTheme="minorHAnsi" w:hAnsiTheme="minorHAnsi" w:cstheme="minorHAnsi"/>
                 <w:b/>
-                <w:bCs/>
-                <w:i/>
-                <w:sz w:val="22"/>
-                <w:szCs w:val="22"/>
-                <w:lang w:val="en-US"/>
+                <w:sz w:val="22"/>
+                <w:szCs w:val="22"/>
               </w:rPr>
             </w:pPr>
             <w:r>
               <w:rPr>
                 <w:rFonts w:asciiTheme="minorHAnsi" w:hAnsiTheme="minorHAnsi" w:cstheme="minorHAnsi"/>
                 <w:b/>
-                <w:bCs/>
-                <w:i/>
-                <w:sz w:val="22"/>
-                <w:szCs w:val="22"/>
-                <w:lang w:val="en-US"/>
+                <w:sz w:val="22"/>
+                <w:szCs w:val="22"/>
               </w:rPr>
               <w:t>ID</w:t>
             </w:r>
@@ -12159,32 +12186,25 @@
         <w:tc>
           <w:tcPr>
             <w:tcW w:w="7199" w:type="dxa"/>
-            <w:shd w:val="clear" w:color="auto" w:fill="92D050"/>
-            <w:vAlign w:val="center"/>
-            <w:hideMark/>
-          </w:tcPr>
-          <w:p>
-            <w:pPr>
-              <w:jc w:val="center"/>
+            <w:shd w:val="clear" w:color="auto" w:fill="BFBFBF" w:themeFill="background1" w:themeFillShade="BF"/>
+            <w:vAlign w:val="center"/>
+            <w:hideMark/>
+          </w:tcPr>
+          <w:p>
+            <w:pPr>
               <w:rPr>
                 <w:rFonts w:asciiTheme="minorHAnsi" w:hAnsiTheme="minorHAnsi" w:cstheme="minorHAnsi"/>
                 <w:b/>
-                <w:bCs/>
-                <w:i/>
-                <w:sz w:val="22"/>
-                <w:szCs w:val="22"/>
-                <w:lang w:val="en-US"/>
+                <w:sz w:val="22"/>
+                <w:szCs w:val="22"/>
               </w:rPr>
             </w:pPr>
             <w:r>
               <w:rPr>
                 <w:rFonts w:asciiTheme="minorHAnsi" w:hAnsiTheme="minorHAnsi" w:cstheme="minorHAnsi"/>
                 <w:b/>
-                <w:bCs/>
-                <w:i/>
-                <w:sz w:val="22"/>
-                <w:szCs w:val="22"/>
-                <w:lang w:val="en-US"/>
+                <w:sz w:val="22"/>
+                <w:szCs w:val="22"/>
               </w:rPr>
               <w:t>Business Requirement</w:t>
             </w:r>
@@ -12193,32 +12213,25 @@
         <w:tc>
           <w:tcPr>
             <w:tcW w:w="1039" w:type="dxa"/>
-            <w:shd w:val="clear" w:color="auto" w:fill="92D050"/>
-            <w:vAlign w:val="center"/>
-            <w:hideMark/>
-          </w:tcPr>
-          <w:p>
-            <w:pPr>
-              <w:jc w:val="center"/>
+            <w:shd w:val="clear" w:color="auto" w:fill="BFBFBF" w:themeFill="background1" w:themeFillShade="BF"/>
+            <w:vAlign w:val="center"/>
+            <w:hideMark/>
+          </w:tcPr>
+          <w:p>
+            <w:pPr>
               <w:rPr>
                 <w:rFonts w:asciiTheme="minorHAnsi" w:hAnsiTheme="minorHAnsi" w:cstheme="minorHAnsi"/>
                 <w:b/>
-                <w:bCs/>
-                <w:i/>
-                <w:sz w:val="22"/>
-                <w:szCs w:val="22"/>
-                <w:lang w:val="en-US"/>
+                <w:sz w:val="22"/>
+                <w:szCs w:val="22"/>
               </w:rPr>
             </w:pPr>
             <w:r>
               <w:rPr>
                 <w:rFonts w:asciiTheme="minorHAnsi" w:hAnsiTheme="minorHAnsi" w:cstheme="minorHAnsi"/>
                 <w:b/>
-                <w:bCs/>
-                <w:i/>
-                <w:sz w:val="22"/>
-                <w:szCs w:val="22"/>
-                <w:lang w:val="en-US"/>
+                <w:sz w:val="22"/>
+                <w:szCs w:val="22"/>
               </w:rPr>
               <w:t>Priority</w:t>
             </w:r>
@@ -13521,7 +13534,7 @@
         <w:tc>
           <w:tcPr>
             <w:tcW w:w="4121" w:type="dxa"/>
-            <w:shd w:val="clear" w:color="auto" w:fill="92D050"/>
+            <w:shd w:val="clear" w:color="auto" w:fill="BFBFBF" w:themeFill="background1" w:themeFillShade="BF"/>
             <w:vAlign w:val="center"/>
             <w:hideMark/>
           </w:tcPr>
@@ -13549,7 +13562,7 @@
         <w:tc>
           <w:tcPr>
             <w:tcW w:w="3499" w:type="dxa"/>
-            <w:shd w:val="clear" w:color="auto" w:fill="92D050"/>
+            <w:shd w:val="clear" w:color="auto" w:fill="BFBFBF" w:themeFill="background1" w:themeFillShade="BF"/>
             <w:vAlign w:val="center"/>
             <w:hideMark/>
           </w:tcPr>
@@ -14026,7 +14039,7 @@
         <w:tc>
           <w:tcPr>
             <w:tcW w:w="860" w:type="dxa"/>
-            <w:shd w:val="clear" w:color="auto" w:fill="92D050"/>
+            <w:shd w:val="clear" w:color="auto" w:fill="BFBFBF" w:themeFill="background1" w:themeFillShade="BF"/>
             <w:vAlign w:val="center"/>
             <w:hideMark/>
           </w:tcPr>
@@ -14058,7 +14071,7 @@
         <w:tc>
           <w:tcPr>
             <w:tcW w:w="1914" w:type="dxa"/>
-            <w:shd w:val="clear" w:color="auto" w:fill="92D050"/>
+            <w:shd w:val="clear" w:color="auto" w:fill="BFBFBF" w:themeFill="background1" w:themeFillShade="BF"/>
             <w:vAlign w:val="center"/>
             <w:hideMark/>
           </w:tcPr>
@@ -14090,7 +14103,7 @@
         <w:tc>
           <w:tcPr>
             <w:tcW w:w="3852" w:type="dxa"/>
-            <w:shd w:val="clear" w:color="auto" w:fill="92D050"/>
+            <w:shd w:val="clear" w:color="auto" w:fill="BFBFBF" w:themeFill="background1" w:themeFillShade="BF"/>
             <w:vAlign w:val="center"/>
             <w:hideMark/>
           </w:tcPr>
@@ -14122,7 +14135,7 @@
         <w:tc>
           <w:tcPr>
             <w:tcW w:w="1297" w:type="dxa"/>
-            <w:shd w:val="clear" w:color="auto" w:fill="92D050"/>
+            <w:shd w:val="clear" w:color="auto" w:fill="BFBFBF" w:themeFill="background1" w:themeFillShade="BF"/>
             <w:vAlign w:val="center"/>
             <w:hideMark/>
           </w:tcPr>
@@ -14154,7 +14167,7 @@
         <w:tc>
           <w:tcPr>
             <w:tcW w:w="1144" w:type="dxa"/>
-            <w:shd w:val="clear" w:color="auto" w:fill="92D050"/>
+            <w:shd w:val="clear" w:color="auto" w:fill="BFBFBF" w:themeFill="background1" w:themeFillShade="BF"/>
             <w:vAlign w:val="center"/>
             <w:hideMark/>
           </w:tcPr>
@@ -14199,7 +14212,7 @@
         <w:tc>
           <w:tcPr>
             <w:tcW w:w="1638" w:type="dxa"/>
-            <w:shd w:val="clear" w:color="auto" w:fill="92D050"/>
+            <w:shd w:val="clear" w:color="auto" w:fill="BFBFBF" w:themeFill="background1" w:themeFillShade="BF"/>
             <w:vAlign w:val="center"/>
             <w:hideMark/>
           </w:tcPr>
@@ -14231,7 +14244,7 @@
         <w:tc>
           <w:tcPr>
             <w:tcW w:w="1024" w:type="dxa"/>
-            <w:shd w:val="clear" w:color="auto" w:fill="92D050"/>
+            <w:shd w:val="clear" w:color="auto" w:fill="BFBFBF" w:themeFill="background1" w:themeFillShade="BF"/>
             <w:vAlign w:val="center"/>
             <w:hideMark/>
           </w:tcPr>
@@ -14263,7 +14276,7 @@
         <w:tc>
           <w:tcPr>
             <w:tcW w:w="1698" w:type="dxa"/>
-            <w:shd w:val="clear" w:color="auto" w:fill="92D050"/>
+            <w:shd w:val="clear" w:color="auto" w:fill="BFBFBF" w:themeFill="background1" w:themeFillShade="BF"/>
             <w:vAlign w:val="center"/>
             <w:hideMark/>
           </w:tcPr>
@@ -14295,7 +14308,7 @@
         <w:tc>
           <w:tcPr>
             <w:tcW w:w="929" w:type="dxa"/>
-            <w:shd w:val="clear" w:color="auto" w:fill="92D050"/>
+            <w:shd w:val="clear" w:color="auto" w:fill="BFBFBF" w:themeFill="background1" w:themeFillShade="BF"/>
             <w:vAlign w:val="center"/>
             <w:hideMark/>
           </w:tcPr>
@@ -19846,7 +19859,7 @@
         <w:tc>
           <w:tcPr>
             <w:tcW w:w="0" w:type="auto"/>
-            <w:shd w:val="clear" w:color="auto" w:fill="92D050"/>
+            <w:shd w:val="clear" w:color="auto" w:fill="BFBFBF" w:themeFill="background1" w:themeFillShade="BF"/>
             <w:vAlign w:val="center"/>
             <w:hideMark/>
           </w:tcPr>
@@ -19878,7 +19891,7 @@
         <w:tc>
           <w:tcPr>
             <w:tcW w:w="0" w:type="auto"/>
-            <w:shd w:val="clear" w:color="auto" w:fill="92D050"/>
+            <w:shd w:val="clear" w:color="auto" w:fill="BFBFBF" w:themeFill="background1" w:themeFillShade="BF"/>
             <w:vAlign w:val="center"/>
             <w:hideMark/>
           </w:tcPr>
@@ -19910,7 +19923,7 @@
         <w:tc>
           <w:tcPr>
             <w:tcW w:w="0" w:type="auto"/>
-            <w:shd w:val="clear" w:color="auto" w:fill="92D050"/>
+            <w:shd w:val="clear" w:color="auto" w:fill="BFBFBF" w:themeFill="background1" w:themeFillShade="BF"/>
             <w:vAlign w:val="center"/>
             <w:hideMark/>
           </w:tcPr>
@@ -19942,7 +19955,7 @@
         <w:tc>
           <w:tcPr>
             <w:tcW w:w="0" w:type="auto"/>
-            <w:shd w:val="clear" w:color="auto" w:fill="92D050"/>
+            <w:shd w:val="clear" w:color="auto" w:fill="BFBFBF" w:themeFill="background1" w:themeFillShade="BF"/>
             <w:vAlign w:val="center"/>
             <w:hideMark/>
           </w:tcPr>
@@ -19974,7 +19987,7 @@
         <w:tc>
           <w:tcPr>
             <w:tcW w:w="0" w:type="auto"/>
-            <w:shd w:val="clear" w:color="auto" w:fill="92D050"/>
+            <w:shd w:val="clear" w:color="auto" w:fill="BFBFBF" w:themeFill="background1" w:themeFillShade="BF"/>
             <w:vAlign w:val="center"/>
             <w:hideMark/>
           </w:tcPr>
@@ -20019,7 +20032,7 @@
         <w:tc>
           <w:tcPr>
             <w:tcW w:w="0" w:type="auto"/>
-            <w:shd w:val="clear" w:color="auto" w:fill="92D050"/>
+            <w:shd w:val="clear" w:color="auto" w:fill="BFBFBF" w:themeFill="background1" w:themeFillShade="BF"/>
             <w:vAlign w:val="center"/>
             <w:hideMark/>
           </w:tcPr>
@@ -20051,7 +20064,7 @@
         <w:tc>
           <w:tcPr>
             <w:tcW w:w="0" w:type="auto"/>
-            <w:shd w:val="clear" w:color="auto" w:fill="92D050"/>
+            <w:shd w:val="clear" w:color="auto" w:fill="BFBFBF" w:themeFill="background1" w:themeFillShade="BF"/>
             <w:vAlign w:val="center"/>
             <w:hideMark/>
           </w:tcPr>
@@ -20083,7 +20096,7 @@
         <w:tc>
           <w:tcPr>
             <w:tcW w:w="0" w:type="auto"/>
-            <w:shd w:val="clear" w:color="auto" w:fill="92D050"/>
+            <w:shd w:val="clear" w:color="auto" w:fill="BFBFBF" w:themeFill="background1" w:themeFillShade="BF"/>
             <w:vAlign w:val="center"/>
             <w:hideMark/>
           </w:tcPr>
@@ -20115,7 +20128,7 @@
         <w:tc>
           <w:tcPr>
             <w:tcW w:w="0" w:type="auto"/>
-            <w:shd w:val="clear" w:color="auto" w:fill="92D050"/>
+            <w:shd w:val="clear" w:color="auto" w:fill="BFBFBF" w:themeFill="background1" w:themeFillShade="BF"/>
             <w:vAlign w:val="center"/>
             <w:hideMark/>
           </w:tcPr>
@@ -26704,7 +26717,7 @@
         <w:tc>
           <w:tcPr>
             <w:tcW w:w="1570" w:type="dxa"/>
-            <w:shd w:val="clear" w:color="auto" w:fill="92D050"/>
+            <w:shd w:val="clear" w:color="auto" w:fill="BFBFBF" w:themeFill="background1" w:themeFillShade="BF"/>
             <w:vAlign w:val="center"/>
             <w:hideMark/>
           </w:tcPr>
@@ -26732,7 +26745,7 @@
         <w:tc>
           <w:tcPr>
             <w:tcW w:w="7479" w:type="dxa"/>
-            <w:shd w:val="clear" w:color="auto" w:fill="92D050"/>
+            <w:shd w:val="clear" w:color="auto" w:fill="BFBFBF" w:themeFill="background1" w:themeFillShade="BF"/>
             <w:vAlign w:val="center"/>
             <w:hideMark/>
           </w:tcPr>
@@ -28405,7 +28418,7 @@
         <w:noProof/>
         <w:sz w:val="16"/>
       </w:rPr>
-      <w:t>22/08/26</w:t>
+      <w:t>23/08/26</w:t>
     </w:r>
     <w:r>
       <w:rPr>
@@ -32892,6 +32905,7 @@
   <w:style w:type="character" w:default="1" w:styleId="DefaultParagraphFont">
     <w:name w:val="Default Paragraph Font"/>
     <w:uiPriority w:val="1"/>
+    <w:semiHidden/>
     <w:unhideWhenUsed/>
   </w:style>
   <w:style w:type="table" w:default="1" w:styleId="TableNormal">

</xml_diff>

<commit_message>
created new Software Design Document and added diagram ERD, also started Logical Dataflow Diagram
</commit_message>
<xml_diff>
--- a/docs/Business-Requirements-Document-BRD.docx
+++ b/docs/Business-Requirements-Document-BRD.docx
@@ -1,6 +1,6 @@
 
 <file path=word/document.xml><?xml version="1.0" encoding="utf-8"?>
-<w:document xmlns:wpc="http://schemas.microsoft.com/office/word/2010/wordprocessingCanvas" xmlns:cx="http://schemas.microsoft.com/office/drawing/2014/chartex" xmlns:cx1="http://schemas.microsoft.com/office/drawing/2015/9/8/chartex" xmlns:cx2="http://schemas.microsoft.com/office/drawing/2015/10/21/chartex" xmlns:cx3="http://schemas.microsoft.com/office/drawing/2016/5/9/chartex" xmlns:cx4="http://schemas.microsoft.com/office/drawing/2016/5/10/chartex" xmlns:cx5="http://schemas.microsoft.com/office/drawing/2016/5/11/chartex" xmlns:cx6="http://schemas.microsoft.com/office/drawing/2016/5/12/chartex" xmlns:cx7="http://schemas.microsoft.com/office/drawing/2016/5/13/chartex" xmlns:cx8="http://schemas.microsoft.com/office/drawing/2016/5/14/chartex" xmlns:mc="http://schemas.openxmlformats.org/markup-compatibility/2006" xmlns:aink="http://schemas.microsoft.com/office/drawing/2016/ink" xmlns:am3d="http://schemas.microsoft.com/office/drawing/2017/model3d" xmlns:o="urn:schemas-microsoft-com:office:office" xmlns:oel="http://schemas.microsoft.com/office/2019/extlst" xmlns:r="http://schemas.openxmlformats.org/officeDocument/2006/relationships" xmlns:m="http://schemas.openxmlformats.org/officeDocument/2006/math" xmlns:v="urn:schemas-microsoft-com:vml" xmlns:wp14="http://schemas.microsoft.com/office/word/2010/wordprocessingDrawing" xmlns:wp="http://schemas.openxmlformats.org/drawingml/2006/wordprocessingDrawing" xmlns:w10="urn:schemas-microsoft-com:office:word" xmlns:w="http://schemas.openxmlformats.org/wordprocessingml/2006/main" xmlns:w14="http://schemas.microsoft.com/office/word/2010/wordml" xmlns:w15="http://schemas.microsoft.com/office/word/2012/wordml" xmlns:w16cei="http://schemas.microsoft.com/office/word/2026/wordml/cei" xmlns:w16cex="http://schemas.microsoft.com/office/word/2018/wordml/cex" xmlns:w16cid="http://schemas.microsoft.com/office/word/2016/wordml/cid" xmlns:w16="http://schemas.microsoft.com/office/word/2018/wordml" xmlns:w16du="http://schemas.microsoft.com/office/word/2023/wordml/word16du" xmlns:w16sdtdh="http://schemas.microsoft.com/office/word/2020/wordml/sdtdatahash" xmlns:w16sdtfl="http://schemas.microsoft.com/office/word/2024/wordml/sdtformatlock" xmlns:w16se="http://schemas.microsoft.com/office/word/2015/wordml/symex" xmlns:wpg="http://schemas.microsoft.com/office/word/2010/wordprocessingGroup" xmlns:wpi="http://schemas.microsoft.com/office/word/2010/wordprocessingInk" xmlns:wne="http://schemas.microsoft.com/office/word/2006/wordml" xmlns:wps="http://schemas.microsoft.com/office/word/2010/wordprocessingShape" mc:Ignorable="w14 w15 w16se w16cid w16 w16cex w16sdtdh w16sdtfl w16du wp14">
+<w:document xmlns:wpc="http://schemas.microsoft.com/office/word/2010/wordprocessingCanvas" xmlns:cx="http://schemas.microsoft.com/office/drawing/2014/chartex" xmlns:cx1="http://schemas.microsoft.com/office/drawing/2015/9/8/chartex" xmlns:cx2="http://schemas.microsoft.com/office/drawing/2015/10/21/chartex" xmlns:cx3="http://schemas.microsoft.com/office/drawing/2016/5/9/chartex" xmlns:cx4="http://schemas.microsoft.com/office/drawing/2016/5/10/chartex" xmlns:cx5="http://schemas.microsoft.com/office/drawing/2016/5/11/chartex" xmlns:cx6="http://schemas.microsoft.com/office/drawing/2016/5/12/chartex" xmlns:cx7="http://schemas.microsoft.com/office/drawing/2016/5/13/chartex" xmlns:cx8="http://schemas.microsoft.com/office/drawing/2016/5/14/chartex" xmlns:mc="http://schemas.openxmlformats.org/markup-compatibility/2006" xmlns:aink="http://schemas.microsoft.com/office/drawing/2016/ink" xmlns:am3d="http://schemas.microsoft.com/office/drawing/2017/model3d" xmlns:o="urn:schemas-microsoft-com:office:office" xmlns:oel="http://schemas.microsoft.com/office/2019/extlst" xmlns:r="http://schemas.openxmlformats.org/officeDocument/2006/relationships" xmlns:m="http://schemas.openxmlformats.org/officeDocument/2006/math" xmlns:v="urn:schemas-microsoft-com:vml" xmlns:wp14="http://schemas.microsoft.com/office/word/2010/wordprocessingDrawing" xmlns:wp="http://schemas.openxmlformats.org/drawingml/2006/wordprocessingDrawing" xmlns:w10="urn:schemas-microsoft-com:office:word" xmlns:w="http://schemas.openxmlformats.org/wordprocessingml/2006/main" xmlns:w14="http://schemas.microsoft.com/office/word/2010/wordml" xmlns:w15="http://schemas.microsoft.com/office/word/2012/wordml" xmlns:w16cex="http://schemas.microsoft.com/office/word/2018/wordml/cex" xmlns:w16cid="http://schemas.microsoft.com/office/word/2016/wordml/cid" xmlns:w16="http://schemas.microsoft.com/office/word/2018/wordml" xmlns:w16du="http://schemas.microsoft.com/office/word/2023/wordml/word16du" xmlns:w16sdtdh="http://schemas.microsoft.com/office/word/2020/wordml/sdtdatahash" xmlns:w16sdtfl="http://schemas.microsoft.com/office/word/2024/wordml/sdtformatlock" xmlns:w16se="http://schemas.microsoft.com/office/word/2015/wordml/symex" xmlns:wpg="http://schemas.microsoft.com/office/word/2010/wordprocessingGroup" xmlns:wpi="http://schemas.microsoft.com/office/word/2010/wordprocessingInk" xmlns:wne="http://schemas.microsoft.com/office/word/2006/wordml" xmlns:wps="http://schemas.microsoft.com/office/word/2010/wordprocessingShape" mc:Ignorable="w14 w15 w16se w16cid w16 w16cex w16sdtdh w16sdtfl w16du wp14">
   <w:body>
     <w:p>
       <w:pPr>
@@ -2281,31 +2281,7 @@
           <w:sz w:val="28"/>
           <w:szCs w:val="28"/>
         </w:rPr>
-        <w:t xml:space="preserve">Not </w:t>
-      </w:r>
-      <w:proofErr w:type="gramStart"/>
-      <w:r>
-        <w:rPr>
-          <w:rFonts w:asciiTheme="minorHAnsi" w:hAnsiTheme="minorHAnsi" w:cstheme="minorHAnsi"/>
-          <w:b/>
-          <w:i/>
-          <w:color w:val="0070C0"/>
-          <w:sz w:val="28"/>
-          <w:szCs w:val="28"/>
-        </w:rPr>
-        <w:t>all of</w:t>
-      </w:r>
-      <w:proofErr w:type="gramEnd"/>
-      <w:r>
-        <w:rPr>
-          <w:rFonts w:asciiTheme="minorHAnsi" w:hAnsiTheme="minorHAnsi" w:cstheme="minorHAnsi"/>
-          <w:b/>
-          <w:i/>
-          <w:color w:val="0070C0"/>
-          <w:sz w:val="28"/>
-          <w:szCs w:val="28"/>
-        </w:rPr>
-        <w:t xml:space="preserve"> the following sections may be applicable to the work being performed. If so, the preference would be to keep the section heading, but make a note such as “This section is not applicable for this process” and provide an explanation for the reasons why</w:t>
+        <w:t>Not all of the following sections may be applicable to the work being performed. If so, the preference would be to keep the section heading, but make a note such as “This section is not applicable for this process” and provide an explanation for the reasons why</w:t>
       </w:r>
       <w:r>
         <w:rPr>
@@ -11407,21 +11383,7 @@
         <w:rPr>
           <w:rFonts w:asciiTheme="minorHAnsi" w:hAnsiTheme="minorHAnsi" w:cstheme="minorHAnsi"/>
         </w:rPr>
-        <w:t xml:space="preserve">Current risk assessment is largely </w:t>
-      </w:r>
-      <w:proofErr w:type="gramStart"/>
-      <w:r>
-        <w:rPr>
-          <w:rFonts w:asciiTheme="minorHAnsi" w:hAnsiTheme="minorHAnsi" w:cstheme="minorHAnsi"/>
-        </w:rPr>
-        <w:t>experience</w:t>
-      </w:r>
-      <w:proofErr w:type="gramEnd"/>
-      <w:r>
-        <w:rPr>
-          <w:rFonts w:asciiTheme="minorHAnsi" w:hAnsiTheme="minorHAnsi" w:cstheme="minorHAnsi"/>
-        </w:rPr>
-        <w:t>-based.</w:t>
+        <w:t>Current risk assessment is largely experience-based.</w:t>
       </w:r>
     </w:p>
     <w:p>
@@ -11467,19 +11429,11 @@
           <w:rFonts w:asciiTheme="minorHAnsi" w:hAnsiTheme="minorHAnsi" w:cstheme="minorHAnsi"/>
         </w:rPr>
       </w:pPr>
-      <w:proofErr w:type="gramStart"/>
       <w:r>
         <w:rPr>
           <w:rFonts w:asciiTheme="minorHAnsi" w:hAnsiTheme="minorHAnsi" w:cstheme="minorHAnsi"/>
         </w:rPr>
-        <w:t>Expired</w:t>
-      </w:r>
-      <w:proofErr w:type="gramEnd"/>
-      <w:r>
-        <w:rPr>
-          <w:rFonts w:asciiTheme="minorHAnsi" w:hAnsiTheme="minorHAnsi" w:cstheme="minorHAnsi"/>
-        </w:rPr>
-        <w:t xml:space="preserve"> documents </w:t>
+        <w:t xml:space="preserve">Expired documents </w:t>
       </w:r>
     </w:p>
     <w:p>
@@ -12003,21 +11957,7 @@
         <w:rPr>
           <w:rFonts w:asciiTheme="minorHAnsi" w:hAnsiTheme="minorHAnsi" w:cstheme="minorHAnsi"/>
         </w:rPr>
-        <w:t xml:space="preserve">High Level </w:t>
-      </w:r>
-      <w:proofErr w:type="gramStart"/>
-      <w:r>
-        <w:rPr>
-          <w:rFonts w:asciiTheme="minorHAnsi" w:hAnsiTheme="minorHAnsi" w:cstheme="minorHAnsi"/>
-        </w:rPr>
-        <w:t>To</w:t>
-      </w:r>
-      <w:proofErr w:type="gramEnd"/>
-      <w:r>
-        <w:rPr>
-          <w:rFonts w:asciiTheme="minorHAnsi" w:hAnsiTheme="minorHAnsi" w:cstheme="minorHAnsi"/>
-        </w:rPr>
-        <w:t xml:space="preserve"> Be Business Requirements</w:t>
+        <w:t>High Level To Be Business Requirements</w:t>
       </w:r>
       <w:bookmarkEnd w:id="20"/>
     </w:p>
@@ -12650,29 +12590,7 @@
                 <w:szCs w:val="22"/>
                 <w:lang w:val="en-US"/>
               </w:rPr>
-              <w:t xml:space="preserve">The solution </w:t>
-            </w:r>
-            <w:proofErr w:type="gramStart"/>
-            <w:r>
-              <w:rPr>
-                <w:rFonts w:asciiTheme="minorHAnsi" w:hAnsiTheme="minorHAnsi" w:cstheme="minorHAnsi"/>
-                <w:i/>
-                <w:sz w:val="22"/>
-                <w:szCs w:val="22"/>
-                <w:lang w:val="en-US"/>
-              </w:rPr>
-              <w:t>shall</w:t>
-            </w:r>
-            <w:proofErr w:type="gramEnd"/>
-            <w:r>
-              <w:rPr>
-                <w:rFonts w:asciiTheme="minorHAnsi" w:hAnsiTheme="minorHAnsi" w:cstheme="minorHAnsi"/>
-                <w:i/>
-                <w:sz w:val="22"/>
-                <w:szCs w:val="22"/>
-                <w:lang w:val="en-US"/>
-              </w:rPr>
-              <w:t xml:space="preserve"> provide an automated mechanism for assessing and monitoring vendor risk.</w:t>
+              <w:t>The solution shall provide an automated mechanism for assessing and monitoring vendor risk.</w:t>
             </w:r>
           </w:p>
         </w:tc>
@@ -12761,29 +12679,7 @@
                 <w:szCs w:val="22"/>
                 <w:lang w:val="en-US"/>
               </w:rPr>
-              <w:t xml:space="preserve">The solution </w:t>
-            </w:r>
-            <w:proofErr w:type="gramStart"/>
-            <w:r>
-              <w:rPr>
-                <w:rFonts w:asciiTheme="minorHAnsi" w:hAnsiTheme="minorHAnsi" w:cstheme="minorHAnsi"/>
-                <w:i/>
-                <w:sz w:val="22"/>
-                <w:szCs w:val="22"/>
-                <w:lang w:val="en-US"/>
-              </w:rPr>
-              <w:t>shall</w:t>
-            </w:r>
-            <w:proofErr w:type="gramEnd"/>
-            <w:r>
-              <w:rPr>
-                <w:rFonts w:asciiTheme="minorHAnsi" w:hAnsiTheme="minorHAnsi" w:cstheme="minorHAnsi"/>
-                <w:i/>
-                <w:sz w:val="22"/>
-                <w:szCs w:val="22"/>
-                <w:lang w:val="en-US"/>
-              </w:rPr>
-              <w:t xml:space="preserve"> provide timely alerts and notifications related to vendor compliance and risk events.</w:t>
+              <w:t>The solution shall provide timely alerts and notifications related to vendor compliance and risk events.</w:t>
             </w:r>
           </w:p>
         </w:tc>
@@ -12872,29 +12768,7 @@
                 <w:szCs w:val="22"/>
                 <w:lang w:val="en-US"/>
               </w:rPr>
-              <w:t xml:space="preserve">The solution </w:t>
-            </w:r>
-            <w:proofErr w:type="gramStart"/>
-            <w:r>
-              <w:rPr>
-                <w:rFonts w:asciiTheme="minorHAnsi" w:hAnsiTheme="minorHAnsi" w:cstheme="minorHAnsi"/>
-                <w:i/>
-                <w:sz w:val="22"/>
-                <w:szCs w:val="22"/>
-                <w:lang w:val="en-US"/>
-              </w:rPr>
-              <w:t>shall</w:t>
-            </w:r>
-            <w:proofErr w:type="gramEnd"/>
-            <w:r>
-              <w:rPr>
-                <w:rFonts w:asciiTheme="minorHAnsi" w:hAnsiTheme="minorHAnsi" w:cstheme="minorHAnsi"/>
-                <w:i/>
-                <w:sz w:val="22"/>
-                <w:szCs w:val="22"/>
-                <w:lang w:val="en-US"/>
-              </w:rPr>
-              <w:t xml:space="preserve"> provide dashboards and reports to support procurement decision-making.</w:t>
+              <w:t>The solution shall provide dashboards and reports to support procurement decision-making.</w:t>
             </w:r>
           </w:p>
         </w:tc>
@@ -13250,29 +13124,7 @@
                 <w:szCs w:val="22"/>
                 <w:lang w:val="en-US"/>
               </w:rPr>
-              <w:t xml:space="preserve">The solution shall </w:t>
-            </w:r>
-            <w:proofErr w:type="gramStart"/>
-            <w:r>
-              <w:rPr>
-                <w:rFonts w:asciiTheme="minorHAnsi" w:hAnsiTheme="minorHAnsi" w:cstheme="minorHAnsi"/>
-                <w:i/>
-                <w:sz w:val="22"/>
-                <w:szCs w:val="22"/>
-                <w:lang w:val="en-US"/>
-              </w:rPr>
-              <w:t>integrate</w:t>
-            </w:r>
-            <w:proofErr w:type="gramEnd"/>
-            <w:r>
-              <w:rPr>
-                <w:rFonts w:asciiTheme="minorHAnsi" w:hAnsiTheme="minorHAnsi" w:cstheme="minorHAnsi"/>
-                <w:i/>
-                <w:sz w:val="22"/>
-                <w:szCs w:val="22"/>
-                <w:lang w:val="en-US"/>
-              </w:rPr>
-              <w:t xml:space="preserve"> with Microsoft Dynamics 365 Business Central as the source of vendor and procurement transaction data.</w:t>
+              <w:t>The solution shall integrate with Microsoft Dynamics 365 Business Central as the source of vendor and procurement transaction data.</w:t>
             </w:r>
           </w:p>
         </w:tc>
@@ -14183,7 +14035,6 @@
                 <w:lang w:val="en-US"/>
               </w:rPr>
             </w:pPr>
-            <w:proofErr w:type="spellStart"/>
             <w:r>
               <w:rPr>
                 <w:rFonts w:asciiTheme="minorHAnsi" w:hAnsiTheme="minorHAnsi" w:cstheme="minorHAnsi"/>
@@ -14193,19 +14044,7 @@
                 <w:szCs w:val="24"/>
                 <w:lang w:val="en-US"/>
               </w:rPr>
-              <w:t>MoSCoW</w:t>
-            </w:r>
-            <w:proofErr w:type="spellEnd"/>
-            <w:r>
-              <w:rPr>
-                <w:rFonts w:asciiTheme="minorHAnsi" w:hAnsiTheme="minorHAnsi" w:cstheme="minorHAnsi"/>
-                <w:b/>
-                <w:bCs/>
-                <w:sz w:val="24"/>
-                <w:szCs w:val="24"/>
-                <w:lang w:val="en-US"/>
-              </w:rPr>
-              <w:t xml:space="preserve"> Priority</w:t>
+              <w:t>MoSCoW Priority</w:t>
             </w:r>
           </w:p>
         </w:tc>
@@ -17784,27 +17623,7 @@
                 <w:szCs w:val="24"/>
                 <w:lang w:val="en-US"/>
               </w:rPr>
-              <w:t xml:space="preserve">The system </w:t>
-            </w:r>
-            <w:proofErr w:type="gramStart"/>
-            <w:r>
-              <w:rPr>
-                <w:rFonts w:asciiTheme="minorHAnsi" w:hAnsiTheme="minorHAnsi" w:cstheme="minorHAnsi"/>
-                <w:sz w:val="24"/>
-                <w:szCs w:val="24"/>
-                <w:lang w:val="en-US"/>
-              </w:rPr>
-              <w:t>shall</w:t>
-            </w:r>
-            <w:proofErr w:type="gramEnd"/>
-            <w:r>
-              <w:rPr>
-                <w:rFonts w:asciiTheme="minorHAnsi" w:hAnsiTheme="minorHAnsi" w:cstheme="minorHAnsi"/>
-                <w:sz w:val="24"/>
-                <w:szCs w:val="24"/>
-                <w:lang w:val="en-US"/>
-              </w:rPr>
-              <w:t xml:space="preserve"> provide dashboards displaying vendor compliance, performance, and risk information.</w:t>
+              <w:t>The system shall provide dashboards displaying vendor compliance, performance, and risk information.</w:t>
             </w:r>
           </w:p>
         </w:tc>
@@ -19190,18 +19009,8 @@
           <w:sz w:val="22"/>
           <w:szCs w:val="22"/>
         </w:rPr>
-        <w:t xml:space="preserve">* Type </w:t>
+        <w:t>* Type Key:-</w:t>
       </w:r>
-      <w:proofErr w:type="gramStart"/>
-      <w:r>
-        <w:rPr>
-          <w:rFonts w:asciiTheme="minorHAnsi" w:hAnsiTheme="minorHAnsi" w:cstheme="minorHAnsi"/>
-          <w:sz w:val="22"/>
-          <w:szCs w:val="22"/>
-        </w:rPr>
-        <w:t>Key:-</w:t>
-      </w:r>
-      <w:proofErr w:type="gramEnd"/>
     </w:p>
     <w:p>
       <w:pPr>
@@ -19338,36 +19147,8 @@
           <w:sz w:val="22"/>
           <w:szCs w:val="22"/>
         </w:rPr>
-        <w:t>*</w:t>
+        <w:t>**  Status Key:-</w:t>
       </w:r>
-      <w:proofErr w:type="gramStart"/>
-      <w:r>
-        <w:rPr>
-          <w:rFonts w:asciiTheme="minorHAnsi" w:hAnsiTheme="minorHAnsi" w:cstheme="minorHAnsi"/>
-          <w:sz w:val="22"/>
-          <w:szCs w:val="22"/>
-        </w:rPr>
-        <w:t>*  Status</w:t>
-      </w:r>
-      <w:proofErr w:type="gramEnd"/>
-      <w:r>
-        <w:rPr>
-          <w:rFonts w:asciiTheme="minorHAnsi" w:hAnsiTheme="minorHAnsi" w:cstheme="minorHAnsi"/>
-          <w:sz w:val="22"/>
-          <w:szCs w:val="22"/>
-        </w:rPr>
-        <w:t xml:space="preserve"> </w:t>
-      </w:r>
-      <w:proofErr w:type="gramStart"/>
-      <w:r>
-        <w:rPr>
-          <w:rFonts w:asciiTheme="minorHAnsi" w:hAnsiTheme="minorHAnsi" w:cstheme="minorHAnsi"/>
-          <w:sz w:val="22"/>
-          <w:szCs w:val="22"/>
-        </w:rPr>
-        <w:t>Key:-</w:t>
-      </w:r>
-      <w:proofErr w:type="gramEnd"/>
     </w:p>
     <w:p>
       <w:pPr>
@@ -19435,34 +19216,14 @@
           <w:szCs w:val="22"/>
         </w:rPr>
       </w:pPr>
-      <w:proofErr w:type="spellStart"/>
       <w:r>
         <w:rPr>
           <w:rFonts w:asciiTheme="minorHAnsi" w:hAnsiTheme="minorHAnsi" w:cstheme="minorHAnsi"/>
           <w:sz w:val="22"/>
           <w:szCs w:val="22"/>
         </w:rPr>
-        <w:t>MoSCoW</w:t>
+        <w:t>MoSCoW Rating:-</w:t>
       </w:r>
-      <w:proofErr w:type="spellEnd"/>
-      <w:r>
-        <w:rPr>
-          <w:rFonts w:asciiTheme="minorHAnsi" w:hAnsiTheme="minorHAnsi" w:cstheme="minorHAnsi"/>
-          <w:sz w:val="22"/>
-          <w:szCs w:val="22"/>
-        </w:rPr>
-        <w:t xml:space="preserve"> </w:t>
-      </w:r>
-      <w:proofErr w:type="gramStart"/>
-      <w:r>
-        <w:rPr>
-          <w:rFonts w:asciiTheme="minorHAnsi" w:hAnsiTheme="minorHAnsi" w:cstheme="minorHAnsi"/>
-          <w:sz w:val="22"/>
-          <w:szCs w:val="22"/>
-        </w:rPr>
-        <w:t>Rating:-</w:t>
-      </w:r>
-      <w:proofErr w:type="gramEnd"/>
     </w:p>
     <w:p>
       <w:pPr>
@@ -19672,27 +19433,7 @@
           <w:lang w:eastAsia="en-GB"/>
         </w:rPr>
         <w:tab/>
-        <w:t xml:space="preserve">Represents a requirement that stakeholders have agreed will not be implemented </w:t>
-      </w:r>
-      <w:proofErr w:type="gramStart"/>
-      <w:r>
-        <w:rPr>
-          <w:rFonts w:asciiTheme="minorHAnsi" w:hAnsiTheme="minorHAnsi" w:cstheme="minorHAnsi"/>
-          <w:sz w:val="22"/>
-          <w:szCs w:val="22"/>
-          <w:lang w:eastAsia="en-GB"/>
-        </w:rPr>
-        <w:t>in a given</w:t>
-      </w:r>
-      <w:proofErr w:type="gramEnd"/>
-      <w:r>
-        <w:rPr>
-          <w:rFonts w:asciiTheme="minorHAnsi" w:hAnsiTheme="minorHAnsi" w:cstheme="minorHAnsi"/>
-          <w:sz w:val="22"/>
-          <w:szCs w:val="22"/>
-          <w:lang w:eastAsia="en-GB"/>
-        </w:rPr>
-        <w:t xml:space="preserve"> release, but may be considered </w:t>
+        <w:t xml:space="preserve">Represents a requirement that stakeholders have agreed will not be implemented in a given release, but may be considered </w:t>
       </w:r>
     </w:p>
     <w:p>
@@ -19782,23 +19523,13 @@
       </w:pPr>
       <w:bookmarkStart w:id="26" w:name="_Toc357519064"/>
       <w:bookmarkStart w:id="27" w:name="_Toc238338304"/>
-      <w:proofErr w:type="gramStart"/>
       <w:r>
         <w:rPr>
           <w:rFonts w:asciiTheme="minorHAnsi" w:hAnsiTheme="minorHAnsi" w:cstheme="minorHAnsi"/>
           <w:sz w:val="22"/>
           <w:szCs w:val="22"/>
         </w:rPr>
-        <w:t>Non Functional</w:t>
-      </w:r>
-      <w:proofErr w:type="gramEnd"/>
-      <w:r>
-        <w:rPr>
-          <w:rFonts w:asciiTheme="minorHAnsi" w:hAnsiTheme="minorHAnsi" w:cstheme="minorHAnsi"/>
-          <w:sz w:val="22"/>
-          <w:szCs w:val="22"/>
-        </w:rPr>
-        <w:t xml:space="preserve"> Requirements</w:t>
+        <w:t>Non Functional Requirements</w:t>
       </w:r>
       <w:bookmarkEnd w:id="26"/>
       <w:bookmarkEnd w:id="27"/>
@@ -20003,7 +19734,6 @@
                 <w:lang w:val="en-US"/>
               </w:rPr>
             </w:pPr>
-            <w:proofErr w:type="spellStart"/>
             <w:r>
               <w:rPr>
                 <w:rFonts w:asciiTheme="minorHAnsi" w:hAnsiTheme="minorHAnsi" w:cstheme="minorHAnsi"/>
@@ -20013,19 +19743,7 @@
                 <w:szCs w:val="24"/>
                 <w:lang w:val="en-US"/>
               </w:rPr>
-              <w:t>MoSCoW</w:t>
-            </w:r>
-            <w:proofErr w:type="spellEnd"/>
-            <w:r>
-              <w:rPr>
-                <w:rFonts w:asciiTheme="minorHAnsi" w:hAnsiTheme="minorHAnsi" w:cstheme="minorHAnsi"/>
-                <w:b/>
-                <w:bCs/>
-                <w:sz w:val="24"/>
-                <w:szCs w:val="24"/>
-                <w:lang w:val="en-US"/>
-              </w:rPr>
-              <w:t xml:space="preserve"> Priority</w:t>
+              <w:t>MoSCoW Priority</w:t>
             </w:r>
           </w:p>
         </w:tc>
@@ -20475,27 +20193,7 @@
                 <w:szCs w:val="24"/>
                 <w:lang w:val="en-US"/>
               </w:rPr>
-              <w:t xml:space="preserve">The system </w:t>
-            </w:r>
-            <w:proofErr w:type="gramStart"/>
-            <w:r>
-              <w:rPr>
-                <w:rFonts w:asciiTheme="minorHAnsi" w:hAnsiTheme="minorHAnsi" w:cstheme="minorHAnsi"/>
-                <w:sz w:val="24"/>
-                <w:szCs w:val="24"/>
-                <w:lang w:val="en-US"/>
-              </w:rPr>
-              <w:t>shall</w:t>
-            </w:r>
-            <w:proofErr w:type="gramEnd"/>
-            <w:r>
-              <w:rPr>
-                <w:rFonts w:asciiTheme="minorHAnsi" w:hAnsiTheme="minorHAnsi" w:cstheme="minorHAnsi"/>
-                <w:sz w:val="24"/>
-                <w:szCs w:val="24"/>
-                <w:lang w:val="en-US"/>
-              </w:rPr>
-              <w:t xml:space="preserve"> restrict access to functions and data based on user roles and permissions.</w:t>
+              <w:t>The system shall restrict access to functions and data based on user roles and permissions.</w:t>
             </w:r>
           </w:p>
         </w:tc>
@@ -21223,27 +20921,7 @@
                 <w:szCs w:val="24"/>
                 <w:lang w:val="en-US"/>
               </w:rPr>
-              <w:t xml:space="preserve">Dashboard pages shall </w:t>
-            </w:r>
-            <w:proofErr w:type="gramStart"/>
-            <w:r>
-              <w:rPr>
-                <w:rFonts w:asciiTheme="minorHAnsi" w:hAnsiTheme="minorHAnsi" w:cstheme="minorHAnsi"/>
-                <w:sz w:val="24"/>
-                <w:szCs w:val="24"/>
-                <w:lang w:val="en-US"/>
-              </w:rPr>
-              <w:t>load</w:t>
-            </w:r>
-            <w:proofErr w:type="gramEnd"/>
-            <w:r>
-              <w:rPr>
-                <w:rFonts w:asciiTheme="minorHAnsi" w:hAnsiTheme="minorHAnsi" w:cstheme="minorHAnsi"/>
-                <w:sz w:val="24"/>
-                <w:szCs w:val="24"/>
-                <w:lang w:val="en-US"/>
-              </w:rPr>
-              <w:t xml:space="preserve"> within 5 seconds under normal operating conditions.</w:t>
+              <w:t>Dashboard pages shall load within 5 seconds under normal operating conditions.</w:t>
             </w:r>
           </w:p>
         </w:tc>
@@ -21482,27 +21160,7 @@
                 <w:szCs w:val="24"/>
                 <w:lang w:val="en-US"/>
               </w:rPr>
-              <w:t xml:space="preserve">Vendor risk score calculations shall </w:t>
-            </w:r>
-            <w:proofErr w:type="gramStart"/>
-            <w:r>
-              <w:rPr>
-                <w:rFonts w:asciiTheme="minorHAnsi" w:hAnsiTheme="minorHAnsi" w:cstheme="minorHAnsi"/>
-                <w:sz w:val="24"/>
-                <w:szCs w:val="24"/>
-                <w:lang w:val="en-US"/>
-              </w:rPr>
-              <w:t>complete</w:t>
-            </w:r>
-            <w:proofErr w:type="gramEnd"/>
-            <w:r>
-              <w:rPr>
-                <w:rFonts w:asciiTheme="minorHAnsi" w:hAnsiTheme="minorHAnsi" w:cstheme="minorHAnsi"/>
-                <w:sz w:val="24"/>
-                <w:szCs w:val="24"/>
-                <w:lang w:val="en-US"/>
-              </w:rPr>
-              <w:t xml:space="preserve"> within 60 seconds for all active vendors during scheduled processing.</w:t>
+              <w:t>Vendor risk score calculations shall complete within 60 seconds for all active vendors during scheduled processing.</w:t>
             </w:r>
           </w:p>
         </w:tc>
@@ -21741,27 +21399,7 @@
                 <w:szCs w:val="24"/>
                 <w:lang w:val="en-US"/>
               </w:rPr>
-              <w:t xml:space="preserve">The system shall be </w:t>
-            </w:r>
-            <w:proofErr w:type="gramStart"/>
-            <w:r>
-              <w:rPr>
-                <w:rFonts w:asciiTheme="minorHAnsi" w:hAnsiTheme="minorHAnsi" w:cstheme="minorHAnsi"/>
-                <w:sz w:val="24"/>
-                <w:szCs w:val="24"/>
-                <w:lang w:val="en-US"/>
-              </w:rPr>
-              <w:t>available</w:t>
-            </w:r>
-            <w:proofErr w:type="gramEnd"/>
-            <w:r>
-              <w:rPr>
-                <w:rFonts w:asciiTheme="minorHAnsi" w:hAnsiTheme="minorHAnsi" w:cstheme="minorHAnsi"/>
-                <w:sz w:val="24"/>
-                <w:szCs w:val="24"/>
-                <w:lang w:val="en-US"/>
-              </w:rPr>
-              <w:t xml:space="preserve"> 99% of business operating hours excluding scheduled maintenance periods.</w:t>
+              <w:t>The system shall be available 99% of business operating hours excluding scheduled maintenance periods.</w:t>
             </w:r>
           </w:p>
         </w:tc>
@@ -22717,27 +22355,7 @@
                 <w:szCs w:val="24"/>
                 <w:lang w:val="en-US"/>
               </w:rPr>
-              <w:t xml:space="preserve">The system </w:t>
-            </w:r>
-            <w:proofErr w:type="gramStart"/>
-            <w:r>
-              <w:rPr>
-                <w:rFonts w:asciiTheme="minorHAnsi" w:hAnsiTheme="minorHAnsi" w:cstheme="minorHAnsi"/>
-                <w:sz w:val="24"/>
-                <w:szCs w:val="24"/>
-                <w:lang w:val="en-US"/>
-              </w:rPr>
-              <w:t>shall</w:t>
-            </w:r>
-            <w:proofErr w:type="gramEnd"/>
-            <w:r>
-              <w:rPr>
-                <w:rFonts w:asciiTheme="minorHAnsi" w:hAnsiTheme="minorHAnsi" w:cstheme="minorHAnsi"/>
-                <w:sz w:val="24"/>
-                <w:szCs w:val="24"/>
-                <w:lang w:val="en-US"/>
-              </w:rPr>
-              <w:t xml:space="preserve"> support the latest versions of Microsoft Edge, Google Chrome, and Mozilla Firefox.</w:t>
+              <w:t>The system shall support the latest versions of Microsoft Edge, Google Chrome, and Mozilla Firefox.</w:t>
             </w:r>
           </w:p>
         </w:tc>
@@ -23694,27 +23312,7 @@
                 <w:szCs w:val="24"/>
                 <w:lang w:val="en-US"/>
               </w:rPr>
-              <w:t xml:space="preserve">The system </w:t>
-            </w:r>
-            <w:proofErr w:type="gramStart"/>
-            <w:r>
-              <w:rPr>
-                <w:rFonts w:asciiTheme="minorHAnsi" w:hAnsiTheme="minorHAnsi" w:cstheme="minorHAnsi"/>
-                <w:sz w:val="24"/>
-                <w:szCs w:val="24"/>
-                <w:lang w:val="en-US"/>
-              </w:rPr>
-              <w:t>shall</w:t>
-            </w:r>
-            <w:proofErr w:type="gramEnd"/>
-            <w:r>
-              <w:rPr>
-                <w:rFonts w:asciiTheme="minorHAnsi" w:hAnsiTheme="minorHAnsi" w:cstheme="minorHAnsi"/>
-                <w:sz w:val="24"/>
-                <w:szCs w:val="24"/>
-                <w:lang w:val="en-US"/>
-              </w:rPr>
-              <w:t xml:space="preserve"> provide a consistent and intuitive user interface requiring minimal user training.</w:t>
+              <w:t>The system shall provide a consistent and intuitive user interface requiring minimal user training.</w:t>
             </w:r>
           </w:p>
         </w:tc>
@@ -23920,18 +23518,8 @@
           <w:sz w:val="22"/>
           <w:szCs w:val="22"/>
         </w:rPr>
-        <w:t xml:space="preserve">* Type </w:t>
+        <w:t>* Type Key:-</w:t>
       </w:r>
-      <w:proofErr w:type="gramStart"/>
-      <w:r>
-        <w:rPr>
-          <w:rFonts w:asciiTheme="minorHAnsi" w:hAnsiTheme="minorHAnsi" w:cstheme="minorHAnsi"/>
-          <w:sz w:val="22"/>
-          <w:szCs w:val="22"/>
-        </w:rPr>
-        <w:t>Key:-</w:t>
-      </w:r>
-      <w:proofErr w:type="gramEnd"/>
     </w:p>
     <w:p>
       <w:pPr>
@@ -24218,36 +23806,8 @@
           <w:sz w:val="22"/>
           <w:szCs w:val="22"/>
         </w:rPr>
-        <w:t>*</w:t>
+        <w:t>**  Status Key:-</w:t>
       </w:r>
-      <w:proofErr w:type="gramStart"/>
-      <w:r>
-        <w:rPr>
-          <w:rFonts w:asciiTheme="minorHAnsi" w:hAnsiTheme="minorHAnsi" w:cstheme="minorHAnsi"/>
-          <w:sz w:val="22"/>
-          <w:szCs w:val="22"/>
-        </w:rPr>
-        <w:t>*  Status</w:t>
-      </w:r>
-      <w:proofErr w:type="gramEnd"/>
-      <w:r>
-        <w:rPr>
-          <w:rFonts w:asciiTheme="minorHAnsi" w:hAnsiTheme="minorHAnsi" w:cstheme="minorHAnsi"/>
-          <w:sz w:val="22"/>
-          <w:szCs w:val="22"/>
-        </w:rPr>
-        <w:t xml:space="preserve"> </w:t>
-      </w:r>
-      <w:proofErr w:type="gramStart"/>
-      <w:r>
-        <w:rPr>
-          <w:rFonts w:asciiTheme="minorHAnsi" w:hAnsiTheme="minorHAnsi" w:cstheme="minorHAnsi"/>
-          <w:sz w:val="22"/>
-          <w:szCs w:val="22"/>
-        </w:rPr>
-        <w:t>Key:-</w:t>
-      </w:r>
-      <w:proofErr w:type="gramEnd"/>
     </w:p>
     <w:p>
       <w:pPr>
@@ -24324,42 +23884,8 @@
           <w:szCs w:val="22"/>
         </w:rPr>
         <w:lastRenderedPageBreak/>
-        <w:t>&lt;</w:t>
+        <w:t>&lt;Non Functional requirements checklist:-</w:t>
       </w:r>
-      <w:proofErr w:type="gramStart"/>
-      <w:r>
-        <w:rPr>
-          <w:rFonts w:asciiTheme="minorHAnsi" w:hAnsiTheme="minorHAnsi" w:cstheme="minorHAnsi"/>
-          <w:i/>
-          <w:color w:val="0070C0"/>
-          <w:sz w:val="22"/>
-          <w:szCs w:val="22"/>
-        </w:rPr>
-        <w:t>Non Functional</w:t>
-      </w:r>
-      <w:proofErr w:type="gramEnd"/>
-      <w:r>
-        <w:rPr>
-          <w:rFonts w:asciiTheme="minorHAnsi" w:hAnsiTheme="minorHAnsi" w:cstheme="minorHAnsi"/>
-          <w:i/>
-          <w:color w:val="0070C0"/>
-          <w:sz w:val="22"/>
-          <w:szCs w:val="22"/>
-        </w:rPr>
-        <w:t xml:space="preserve"> requirements </w:t>
-      </w:r>
-      <w:proofErr w:type="gramStart"/>
-      <w:r>
-        <w:rPr>
-          <w:rFonts w:asciiTheme="minorHAnsi" w:hAnsiTheme="minorHAnsi" w:cstheme="minorHAnsi"/>
-          <w:i/>
-          <w:color w:val="0070C0"/>
-          <w:sz w:val="22"/>
-          <w:szCs w:val="22"/>
-        </w:rPr>
-        <w:t>checklist:-</w:t>
-      </w:r>
-      <w:proofErr w:type="gramEnd"/>
     </w:p>
     <w:p>
       <w:pPr>
@@ -25428,29 +24954,7 @@
                 <w:sz w:val="22"/>
                 <w:szCs w:val="22"/>
               </w:rPr>
-              <w:t xml:space="preserve">What is the acceptable threshold for down-time </w:t>
-            </w:r>
-            <w:proofErr w:type="spellStart"/>
-            <w:r>
-              <w:rPr>
-                <w:rFonts w:asciiTheme="minorHAnsi" w:hAnsiTheme="minorHAnsi" w:cstheme="minorHAnsi"/>
-                <w:i/>
-                <w:color w:val="0070C0"/>
-                <w:sz w:val="22"/>
-                <w:szCs w:val="22"/>
-              </w:rPr>
-              <w:t>eg.</w:t>
-            </w:r>
-            <w:proofErr w:type="spellEnd"/>
-            <w:r>
-              <w:rPr>
-                <w:rFonts w:asciiTheme="minorHAnsi" w:hAnsiTheme="minorHAnsi" w:cstheme="minorHAnsi"/>
-                <w:i/>
-                <w:color w:val="0070C0"/>
-                <w:sz w:val="22"/>
-                <w:szCs w:val="22"/>
-              </w:rPr>
-              <w:t xml:space="preserve"> one a year, 4,000 hours etc</w:t>
+              <w:t>What is the acceptable threshold for down-time eg. one a year, 4,000 hours etc</w:t>
             </w:r>
           </w:p>
         </w:tc>
@@ -25934,29 +25438,7 @@
                 <w:sz w:val="22"/>
                 <w:szCs w:val="22"/>
               </w:rPr>
-              <w:t xml:space="preserve">How often </w:t>
-            </w:r>
-            <w:proofErr w:type="gramStart"/>
-            <w:r>
-              <w:rPr>
-                <w:rFonts w:asciiTheme="minorHAnsi" w:hAnsiTheme="minorHAnsi" w:cstheme="minorHAnsi"/>
-                <w:i/>
-                <w:color w:val="0070C0"/>
-                <w:sz w:val="22"/>
-                <w:szCs w:val="22"/>
-              </w:rPr>
-              <w:t>is</w:t>
-            </w:r>
-            <w:proofErr w:type="gramEnd"/>
-            <w:r>
-              <w:rPr>
-                <w:rFonts w:asciiTheme="minorHAnsi" w:hAnsiTheme="minorHAnsi" w:cstheme="minorHAnsi"/>
-                <w:i/>
-                <w:color w:val="0070C0"/>
-                <w:sz w:val="22"/>
-                <w:szCs w:val="22"/>
-              </w:rPr>
-              <w:t xml:space="preserve"> the transaction data, set-up data and system (code) backed up?</w:t>
+              <w:t>How often is the transaction data, set-up data and system (code) backed up?</w:t>
             </w:r>
           </w:p>
         </w:tc>
@@ -26182,7 +25664,6 @@
                 <w:rFonts w:asciiTheme="minorHAnsi" w:hAnsiTheme="minorHAnsi" w:cstheme="minorHAnsi"/>
               </w:rPr>
             </w:pPr>
-            <w:proofErr w:type="gramStart"/>
             <w:r>
               <w:rPr>
                 <w:rFonts w:asciiTheme="minorHAnsi" w:hAnsiTheme="minorHAnsi" w:cstheme="minorHAnsi"/>
@@ -26191,18 +25672,7 @@
                 <w:sz w:val="22"/>
                 <w:szCs w:val="22"/>
               </w:rPr>
-              <w:t>Compatibility  On</w:t>
-            </w:r>
-            <w:proofErr w:type="gramEnd"/>
-            <w:r>
-              <w:rPr>
-                <w:rFonts w:asciiTheme="minorHAnsi" w:hAnsiTheme="minorHAnsi" w:cstheme="minorHAnsi"/>
-                <w:i/>
-                <w:color w:val="0070C0"/>
-                <w:sz w:val="22"/>
-                <w:szCs w:val="22"/>
-              </w:rPr>
-              <w:t xml:space="preserve"> Different Operating Systems</w:t>
+              <w:t>Compatibility  On Different Operating Systems</w:t>
             </w:r>
           </w:p>
         </w:tc>
@@ -26848,23 +26318,7 @@
                 <w:rFonts w:asciiTheme="minorHAnsi" w:hAnsiTheme="minorHAnsi" w:cstheme="minorHAnsi"/>
                 <w:lang w:val="en-US"/>
               </w:rPr>
-              <w:t xml:space="preserve">• Vendor risk assessment will become more structured and </w:t>
-            </w:r>
-            <w:proofErr w:type="gramStart"/>
-            <w:r>
-              <w:rPr>
-                <w:rFonts w:asciiTheme="minorHAnsi" w:hAnsiTheme="minorHAnsi" w:cstheme="minorHAnsi"/>
-                <w:lang w:val="en-US"/>
-              </w:rPr>
-              <w:t>data-driven</w:t>
-            </w:r>
-            <w:proofErr w:type="gramEnd"/>
-            <w:r>
-              <w:rPr>
-                <w:rFonts w:asciiTheme="minorHAnsi" w:hAnsiTheme="minorHAnsi" w:cstheme="minorHAnsi"/>
-                <w:lang w:val="en-US"/>
-              </w:rPr>
-              <w:t>.</w:t>
+              <w:t>• Vendor risk assessment will become more structured and data-driven.</w:t>
             </w:r>
           </w:p>
           <w:p>
@@ -27828,7 +27282,7 @@
           <w:sz w:val="22"/>
           <w:szCs w:val="22"/>
         </w:rPr>
-        <w:t>Note: This section has been specifically added at the request of the Food Business Analysts&gt;</w:t>
+        <w:t>Note: This section has been specifically added at the request of the Business Analysts&gt;</w:t>
       </w:r>
     </w:p>
     <w:p>
@@ -27922,7 +27376,7 @@
 </file>
 
 <file path=word/endnotes.xml><?xml version="1.0" encoding="utf-8"?>
-<w:endnotes xmlns:wpc="http://schemas.microsoft.com/office/word/2010/wordprocessingCanvas" xmlns:cx="http://schemas.microsoft.com/office/drawing/2014/chartex" xmlns:cx1="http://schemas.microsoft.com/office/drawing/2015/9/8/chartex" xmlns:cx2="http://schemas.microsoft.com/office/drawing/2015/10/21/chartex" xmlns:cx3="http://schemas.microsoft.com/office/drawing/2016/5/9/chartex" xmlns:cx4="http://schemas.microsoft.com/office/drawing/2016/5/10/chartex" xmlns:cx5="http://schemas.microsoft.com/office/drawing/2016/5/11/chartex" xmlns:cx6="http://schemas.microsoft.com/office/drawing/2016/5/12/chartex" xmlns:cx7="http://schemas.microsoft.com/office/drawing/2016/5/13/chartex" xmlns:cx8="http://schemas.microsoft.com/office/drawing/2016/5/14/chartex" xmlns:mc="http://schemas.openxmlformats.org/markup-compatibility/2006" xmlns:aink="http://schemas.microsoft.com/office/drawing/2016/ink" xmlns:am3d="http://schemas.microsoft.com/office/drawing/2017/model3d" xmlns:o="urn:schemas-microsoft-com:office:office" xmlns:oel="http://schemas.microsoft.com/office/2019/extlst" xmlns:r="http://schemas.openxmlformats.org/officeDocument/2006/relationships" xmlns:m="http://schemas.openxmlformats.org/officeDocument/2006/math" xmlns:v="urn:schemas-microsoft-com:vml" xmlns:wp14="http://schemas.microsoft.com/office/word/2010/wordprocessingDrawing" xmlns:wp="http://schemas.openxmlformats.org/drawingml/2006/wordprocessingDrawing" xmlns:w10="urn:schemas-microsoft-com:office:word" xmlns:w="http://schemas.openxmlformats.org/wordprocessingml/2006/main" xmlns:w14="http://schemas.microsoft.com/office/word/2010/wordml" xmlns:w15="http://schemas.microsoft.com/office/word/2012/wordml" xmlns:w16cei="http://schemas.microsoft.com/office/word/2026/wordml/cei" xmlns:w16cex="http://schemas.microsoft.com/office/word/2018/wordml/cex" xmlns:w16cid="http://schemas.microsoft.com/office/word/2016/wordml/cid" xmlns:w16="http://schemas.microsoft.com/office/word/2018/wordml" xmlns:w16du="http://schemas.microsoft.com/office/word/2023/wordml/word16du" xmlns:w16sdtdh="http://schemas.microsoft.com/office/word/2020/wordml/sdtdatahash" xmlns:w16sdtfl="http://schemas.microsoft.com/office/word/2024/wordml/sdtformatlock" xmlns:w16se="http://schemas.microsoft.com/office/word/2015/wordml/symex" xmlns:wpg="http://schemas.microsoft.com/office/word/2010/wordprocessingGroup" xmlns:wpi="http://schemas.microsoft.com/office/word/2010/wordprocessingInk" xmlns:wne="http://schemas.microsoft.com/office/word/2006/wordml" xmlns:wps="http://schemas.microsoft.com/office/word/2010/wordprocessingShape" mc:Ignorable="w14 w15 w16se w16cid w16 w16cex w16sdtdh w16sdtfl w16du wp14">
+<w:endnotes xmlns:wpc="http://schemas.microsoft.com/office/word/2010/wordprocessingCanvas" xmlns:cx="http://schemas.microsoft.com/office/drawing/2014/chartex" xmlns:cx1="http://schemas.microsoft.com/office/drawing/2015/9/8/chartex" xmlns:cx2="http://schemas.microsoft.com/office/drawing/2015/10/21/chartex" xmlns:cx3="http://schemas.microsoft.com/office/drawing/2016/5/9/chartex" xmlns:cx4="http://schemas.microsoft.com/office/drawing/2016/5/10/chartex" xmlns:cx5="http://schemas.microsoft.com/office/drawing/2016/5/11/chartex" xmlns:cx6="http://schemas.microsoft.com/office/drawing/2016/5/12/chartex" xmlns:cx7="http://schemas.microsoft.com/office/drawing/2016/5/13/chartex" xmlns:cx8="http://schemas.microsoft.com/office/drawing/2016/5/14/chartex" xmlns:mc="http://schemas.openxmlformats.org/markup-compatibility/2006" xmlns:aink="http://schemas.microsoft.com/office/drawing/2016/ink" xmlns:am3d="http://schemas.microsoft.com/office/drawing/2017/model3d" xmlns:o="urn:schemas-microsoft-com:office:office" xmlns:oel="http://schemas.microsoft.com/office/2019/extlst" xmlns:r="http://schemas.openxmlformats.org/officeDocument/2006/relationships" xmlns:m="http://schemas.openxmlformats.org/officeDocument/2006/math" xmlns:v="urn:schemas-microsoft-com:vml" xmlns:wp14="http://schemas.microsoft.com/office/word/2010/wordprocessingDrawing" xmlns:wp="http://schemas.openxmlformats.org/drawingml/2006/wordprocessingDrawing" xmlns:w10="urn:schemas-microsoft-com:office:word" xmlns:w="http://schemas.openxmlformats.org/wordprocessingml/2006/main" xmlns:w14="http://schemas.microsoft.com/office/word/2010/wordml" xmlns:w15="http://schemas.microsoft.com/office/word/2012/wordml" xmlns:w16cex="http://schemas.microsoft.com/office/word/2018/wordml/cex" xmlns:w16cid="http://schemas.microsoft.com/office/word/2016/wordml/cid" xmlns:w16="http://schemas.microsoft.com/office/word/2018/wordml" xmlns:w16du="http://schemas.microsoft.com/office/word/2023/wordml/word16du" xmlns:w16sdtdh="http://schemas.microsoft.com/office/word/2020/wordml/sdtdatahash" xmlns:w16sdtfl="http://schemas.microsoft.com/office/word/2024/wordml/sdtformatlock" xmlns:w16se="http://schemas.microsoft.com/office/word/2015/wordml/symex" xmlns:wpg="http://schemas.microsoft.com/office/word/2010/wordprocessingGroup" xmlns:wpi="http://schemas.microsoft.com/office/word/2010/wordprocessingInk" xmlns:wne="http://schemas.microsoft.com/office/word/2006/wordml" xmlns:wps="http://schemas.microsoft.com/office/word/2010/wordprocessingShape" mc:Ignorable="w14 w15 w16se w16cid w16 w16cex w16sdtdh w16sdtfl w16du wp14">
   <w:endnote w:type="separator" w:id="-1">
     <w:p>
       <w:r>
@@ -27941,7 +27395,7 @@
 </file>
 
 <file path=word/footer1.xml><?xml version="1.0" encoding="utf-8"?>
-<w:ftr xmlns:wpc="http://schemas.microsoft.com/office/word/2010/wordprocessingCanvas" xmlns:cx="http://schemas.microsoft.com/office/drawing/2014/chartex" xmlns:cx1="http://schemas.microsoft.com/office/drawing/2015/9/8/chartex" xmlns:cx2="http://schemas.microsoft.com/office/drawing/2015/10/21/chartex" xmlns:cx3="http://schemas.microsoft.com/office/drawing/2016/5/9/chartex" xmlns:cx4="http://schemas.microsoft.com/office/drawing/2016/5/10/chartex" xmlns:cx5="http://schemas.microsoft.com/office/drawing/2016/5/11/chartex" xmlns:cx6="http://schemas.microsoft.com/office/drawing/2016/5/12/chartex" xmlns:cx7="http://schemas.microsoft.com/office/drawing/2016/5/13/chartex" xmlns:cx8="http://schemas.microsoft.com/office/drawing/2016/5/14/chartex" xmlns:mc="http://schemas.openxmlformats.org/markup-compatibility/2006" xmlns:aink="http://schemas.microsoft.com/office/drawing/2016/ink" xmlns:am3d="http://schemas.microsoft.com/office/drawing/2017/model3d" xmlns:o="urn:schemas-microsoft-com:office:office" xmlns:oel="http://schemas.microsoft.com/office/2019/extlst" xmlns:r="http://schemas.openxmlformats.org/officeDocument/2006/relationships" xmlns:m="http://schemas.openxmlformats.org/officeDocument/2006/math" xmlns:v="urn:schemas-microsoft-com:vml" xmlns:wp14="http://schemas.microsoft.com/office/word/2010/wordprocessingDrawing" xmlns:wp="http://schemas.openxmlformats.org/drawingml/2006/wordprocessingDrawing" xmlns:w10="urn:schemas-microsoft-com:office:word" xmlns:w="http://schemas.openxmlformats.org/wordprocessingml/2006/main" xmlns:w14="http://schemas.microsoft.com/office/word/2010/wordml" xmlns:w15="http://schemas.microsoft.com/office/word/2012/wordml" xmlns:w16cei="http://schemas.microsoft.com/office/word/2026/wordml/cei" xmlns:w16cex="http://schemas.microsoft.com/office/word/2018/wordml/cex" xmlns:w16cid="http://schemas.microsoft.com/office/word/2016/wordml/cid" xmlns:w16="http://schemas.microsoft.com/office/word/2018/wordml" xmlns:w16du="http://schemas.microsoft.com/office/word/2023/wordml/word16du" xmlns:w16sdtdh="http://schemas.microsoft.com/office/word/2020/wordml/sdtdatahash" xmlns:w16sdtfl="http://schemas.microsoft.com/office/word/2024/wordml/sdtformatlock" xmlns:w16se="http://schemas.microsoft.com/office/word/2015/wordml/symex" xmlns:wpg="http://schemas.microsoft.com/office/word/2010/wordprocessingGroup" xmlns:wpi="http://schemas.microsoft.com/office/word/2010/wordprocessingInk" xmlns:wne="http://schemas.microsoft.com/office/word/2006/wordml" xmlns:wps="http://schemas.microsoft.com/office/word/2010/wordprocessingShape" mc:Ignorable="w14 w15 w16se w16cid w16 w16cex w16sdtdh w16sdtfl w16du wp14">
+<w:ftr xmlns:wpc="http://schemas.microsoft.com/office/word/2010/wordprocessingCanvas" xmlns:cx="http://schemas.microsoft.com/office/drawing/2014/chartex" xmlns:cx1="http://schemas.microsoft.com/office/drawing/2015/9/8/chartex" xmlns:cx2="http://schemas.microsoft.com/office/drawing/2015/10/21/chartex" xmlns:cx3="http://schemas.microsoft.com/office/drawing/2016/5/9/chartex" xmlns:cx4="http://schemas.microsoft.com/office/drawing/2016/5/10/chartex" xmlns:cx5="http://schemas.microsoft.com/office/drawing/2016/5/11/chartex" xmlns:cx6="http://schemas.microsoft.com/office/drawing/2016/5/12/chartex" xmlns:cx7="http://schemas.microsoft.com/office/drawing/2016/5/13/chartex" xmlns:cx8="http://schemas.microsoft.com/office/drawing/2016/5/14/chartex" xmlns:mc="http://schemas.openxmlformats.org/markup-compatibility/2006" xmlns:aink="http://schemas.microsoft.com/office/drawing/2016/ink" xmlns:am3d="http://schemas.microsoft.com/office/drawing/2017/model3d" xmlns:o="urn:schemas-microsoft-com:office:office" xmlns:oel="http://schemas.microsoft.com/office/2019/extlst" xmlns:r="http://schemas.openxmlformats.org/officeDocument/2006/relationships" xmlns:m="http://schemas.openxmlformats.org/officeDocument/2006/math" xmlns:v="urn:schemas-microsoft-com:vml" xmlns:wp14="http://schemas.microsoft.com/office/word/2010/wordprocessingDrawing" xmlns:wp="http://schemas.openxmlformats.org/drawingml/2006/wordprocessingDrawing" xmlns:w10="urn:schemas-microsoft-com:office:word" xmlns:w="http://schemas.openxmlformats.org/wordprocessingml/2006/main" xmlns:w14="http://schemas.microsoft.com/office/word/2010/wordml" xmlns:w15="http://schemas.microsoft.com/office/word/2012/wordml" xmlns:w16cex="http://schemas.microsoft.com/office/word/2018/wordml/cex" xmlns:w16cid="http://schemas.microsoft.com/office/word/2016/wordml/cid" xmlns:w16="http://schemas.microsoft.com/office/word/2018/wordml" xmlns:w16du="http://schemas.microsoft.com/office/word/2023/wordml/word16du" xmlns:w16sdtdh="http://schemas.microsoft.com/office/word/2020/wordml/sdtdatahash" xmlns:w16sdtfl="http://schemas.microsoft.com/office/word/2024/wordml/sdtformatlock" xmlns:w16se="http://schemas.microsoft.com/office/word/2015/wordml/symex" xmlns:wpg="http://schemas.microsoft.com/office/word/2010/wordprocessingGroup" xmlns:wpi="http://schemas.microsoft.com/office/word/2010/wordprocessingInk" xmlns:wne="http://schemas.microsoft.com/office/word/2006/wordml" xmlns:wps="http://schemas.microsoft.com/office/word/2010/wordprocessingShape" mc:Ignorable="w14 w15 w16se w16cid w16 w16cex w16sdtdh w16sdtfl w16du wp14">
   <w:p>
     <w:pPr>
       <w:pStyle w:val="Footer"/>
@@ -27972,25 +27426,7 @@
         <w:sz w:val="22"/>
         <w:szCs w:val="22"/>
       </w:rPr>
-      <w:t xml:space="preserve">Draft/Released </w:t>
-    </w:r>
-    <w:proofErr w:type="gramStart"/>
-    <w:r>
-      <w:rPr>
-        <w:rFonts w:ascii="Calibri" w:hAnsi="Calibri" w:cs="Tahoma"/>
-        <w:sz w:val="22"/>
-        <w:szCs w:val="22"/>
-      </w:rPr>
-      <w:t>For</w:t>
-    </w:r>
-    <w:proofErr w:type="gramEnd"/>
-    <w:r>
-      <w:rPr>
-        <w:rFonts w:ascii="Calibri" w:hAnsi="Calibri" w:cs="Tahoma"/>
-        <w:sz w:val="22"/>
-        <w:szCs w:val="22"/>
-      </w:rPr>
-      <w:t xml:space="preserve"> Approval/Approved</w:t>
+      <w:t>Draft/Released For Approval/Approved</w:t>
     </w:r>
     <w:r>
       <w:rPr>
@@ -28105,7 +27541,7 @@
 </file>
 
 <file path=word/footer2.xml><?xml version="1.0" encoding="utf-8"?>
-<w:ftr xmlns:wpc="http://schemas.microsoft.com/office/word/2010/wordprocessingCanvas" xmlns:cx="http://schemas.microsoft.com/office/drawing/2014/chartex" xmlns:cx1="http://schemas.microsoft.com/office/drawing/2015/9/8/chartex" xmlns:cx2="http://schemas.microsoft.com/office/drawing/2015/10/21/chartex" xmlns:cx3="http://schemas.microsoft.com/office/drawing/2016/5/9/chartex" xmlns:cx4="http://schemas.microsoft.com/office/drawing/2016/5/10/chartex" xmlns:cx5="http://schemas.microsoft.com/office/drawing/2016/5/11/chartex" xmlns:cx6="http://schemas.microsoft.com/office/drawing/2016/5/12/chartex" xmlns:cx7="http://schemas.microsoft.com/office/drawing/2016/5/13/chartex" xmlns:cx8="http://schemas.microsoft.com/office/drawing/2016/5/14/chartex" xmlns:mc="http://schemas.openxmlformats.org/markup-compatibility/2006" xmlns:aink="http://schemas.microsoft.com/office/drawing/2016/ink" xmlns:am3d="http://schemas.microsoft.com/office/drawing/2017/model3d" xmlns:o="urn:schemas-microsoft-com:office:office" xmlns:oel="http://schemas.microsoft.com/office/2019/extlst" xmlns:r="http://schemas.openxmlformats.org/officeDocument/2006/relationships" xmlns:m="http://schemas.openxmlformats.org/officeDocument/2006/math" xmlns:v="urn:schemas-microsoft-com:vml" xmlns:wp14="http://schemas.microsoft.com/office/word/2010/wordprocessingDrawing" xmlns:wp="http://schemas.openxmlformats.org/drawingml/2006/wordprocessingDrawing" xmlns:w10="urn:schemas-microsoft-com:office:word" xmlns:w="http://schemas.openxmlformats.org/wordprocessingml/2006/main" xmlns:w14="http://schemas.microsoft.com/office/word/2010/wordml" xmlns:w15="http://schemas.microsoft.com/office/word/2012/wordml" xmlns:w16cei="http://schemas.microsoft.com/office/word/2026/wordml/cei" xmlns:w16cex="http://schemas.microsoft.com/office/word/2018/wordml/cex" xmlns:w16cid="http://schemas.microsoft.com/office/word/2016/wordml/cid" xmlns:w16="http://schemas.microsoft.com/office/word/2018/wordml" xmlns:w16du="http://schemas.microsoft.com/office/word/2023/wordml/word16du" xmlns:w16sdtdh="http://schemas.microsoft.com/office/word/2020/wordml/sdtdatahash" xmlns:w16sdtfl="http://schemas.microsoft.com/office/word/2024/wordml/sdtformatlock" xmlns:w16se="http://schemas.microsoft.com/office/word/2015/wordml/symex" xmlns:wpg="http://schemas.microsoft.com/office/word/2010/wordprocessingGroup" xmlns:wpi="http://schemas.microsoft.com/office/word/2010/wordprocessingInk" xmlns:wne="http://schemas.microsoft.com/office/word/2006/wordml" xmlns:wps="http://schemas.microsoft.com/office/word/2010/wordprocessingShape" mc:Ignorable="w14 w15 w16se w16cid w16 w16cex w16sdtdh w16sdtfl w16du wp14">
+<w:ftr xmlns:wpc="http://schemas.microsoft.com/office/word/2010/wordprocessingCanvas" xmlns:cx="http://schemas.microsoft.com/office/drawing/2014/chartex" xmlns:cx1="http://schemas.microsoft.com/office/drawing/2015/9/8/chartex" xmlns:cx2="http://schemas.microsoft.com/office/drawing/2015/10/21/chartex" xmlns:cx3="http://schemas.microsoft.com/office/drawing/2016/5/9/chartex" xmlns:cx4="http://schemas.microsoft.com/office/drawing/2016/5/10/chartex" xmlns:cx5="http://schemas.microsoft.com/office/drawing/2016/5/11/chartex" xmlns:cx6="http://schemas.microsoft.com/office/drawing/2016/5/12/chartex" xmlns:cx7="http://schemas.microsoft.com/office/drawing/2016/5/13/chartex" xmlns:cx8="http://schemas.microsoft.com/office/drawing/2016/5/14/chartex" xmlns:mc="http://schemas.openxmlformats.org/markup-compatibility/2006" xmlns:aink="http://schemas.microsoft.com/office/drawing/2016/ink" xmlns:am3d="http://schemas.microsoft.com/office/drawing/2017/model3d" xmlns:o="urn:schemas-microsoft-com:office:office" xmlns:oel="http://schemas.microsoft.com/office/2019/extlst" xmlns:r="http://schemas.openxmlformats.org/officeDocument/2006/relationships" xmlns:m="http://schemas.openxmlformats.org/officeDocument/2006/math" xmlns:v="urn:schemas-microsoft-com:vml" xmlns:wp14="http://schemas.microsoft.com/office/word/2010/wordprocessingDrawing" xmlns:wp="http://schemas.openxmlformats.org/drawingml/2006/wordprocessingDrawing" xmlns:w10="urn:schemas-microsoft-com:office:word" xmlns:w="http://schemas.openxmlformats.org/wordprocessingml/2006/main" xmlns:w14="http://schemas.microsoft.com/office/word/2010/wordml" xmlns:w15="http://schemas.microsoft.com/office/word/2012/wordml" xmlns:w16cex="http://schemas.microsoft.com/office/word/2018/wordml/cex" xmlns:w16cid="http://schemas.microsoft.com/office/word/2016/wordml/cid" xmlns:w16="http://schemas.microsoft.com/office/word/2018/wordml" xmlns:w16du="http://schemas.microsoft.com/office/word/2023/wordml/word16du" xmlns:w16sdtdh="http://schemas.microsoft.com/office/word/2020/wordml/sdtdatahash" xmlns:w16sdtfl="http://schemas.microsoft.com/office/word/2024/wordml/sdtformatlock" xmlns:w16se="http://schemas.microsoft.com/office/word/2015/wordml/symex" xmlns:wpg="http://schemas.microsoft.com/office/word/2010/wordprocessingGroup" xmlns:wpi="http://schemas.microsoft.com/office/word/2010/wordprocessingInk" xmlns:wne="http://schemas.microsoft.com/office/word/2006/wordml" xmlns:wps="http://schemas.microsoft.com/office/word/2010/wordprocessingShape" mc:Ignorable="w14 w15 w16se w16cid w16 w16cex w16sdtdh w16sdtfl w16du wp14">
   <w:p>
     <w:pPr>
       <w:pStyle w:val="Footer"/>
@@ -28120,7 +27556,7 @@
 </file>
 
 <file path=word/footer3.xml><?xml version="1.0" encoding="utf-8"?>
-<w:ftr xmlns:wpc="http://schemas.microsoft.com/office/word/2010/wordprocessingCanvas" xmlns:cx="http://schemas.microsoft.com/office/drawing/2014/chartex" xmlns:cx1="http://schemas.microsoft.com/office/drawing/2015/9/8/chartex" xmlns:cx2="http://schemas.microsoft.com/office/drawing/2015/10/21/chartex" xmlns:cx3="http://schemas.microsoft.com/office/drawing/2016/5/9/chartex" xmlns:cx4="http://schemas.microsoft.com/office/drawing/2016/5/10/chartex" xmlns:cx5="http://schemas.microsoft.com/office/drawing/2016/5/11/chartex" xmlns:cx6="http://schemas.microsoft.com/office/drawing/2016/5/12/chartex" xmlns:cx7="http://schemas.microsoft.com/office/drawing/2016/5/13/chartex" xmlns:cx8="http://schemas.microsoft.com/office/drawing/2016/5/14/chartex" xmlns:mc="http://schemas.openxmlformats.org/markup-compatibility/2006" xmlns:aink="http://schemas.microsoft.com/office/drawing/2016/ink" xmlns:am3d="http://schemas.microsoft.com/office/drawing/2017/model3d" xmlns:o="urn:schemas-microsoft-com:office:office" xmlns:oel="http://schemas.microsoft.com/office/2019/extlst" xmlns:r="http://schemas.openxmlformats.org/officeDocument/2006/relationships" xmlns:m="http://schemas.openxmlformats.org/officeDocument/2006/math" xmlns:v="urn:schemas-microsoft-com:vml" xmlns:wp14="http://schemas.microsoft.com/office/word/2010/wordprocessingDrawing" xmlns:wp="http://schemas.openxmlformats.org/drawingml/2006/wordprocessingDrawing" xmlns:w10="urn:schemas-microsoft-com:office:word" xmlns:w="http://schemas.openxmlformats.org/wordprocessingml/2006/main" xmlns:w14="http://schemas.microsoft.com/office/word/2010/wordml" xmlns:w15="http://schemas.microsoft.com/office/word/2012/wordml" xmlns:w16cei="http://schemas.microsoft.com/office/word/2026/wordml/cei" xmlns:w16cex="http://schemas.microsoft.com/office/word/2018/wordml/cex" xmlns:w16cid="http://schemas.microsoft.com/office/word/2016/wordml/cid" xmlns:w16="http://schemas.microsoft.com/office/word/2018/wordml" xmlns:w16du="http://schemas.microsoft.com/office/word/2023/wordml/word16du" xmlns:w16sdtdh="http://schemas.microsoft.com/office/word/2020/wordml/sdtdatahash" xmlns:w16sdtfl="http://schemas.microsoft.com/office/word/2024/wordml/sdtformatlock" xmlns:w16se="http://schemas.microsoft.com/office/word/2015/wordml/symex" xmlns:wpg="http://schemas.microsoft.com/office/word/2010/wordprocessingGroup" xmlns:wpi="http://schemas.microsoft.com/office/word/2010/wordprocessingInk" xmlns:wne="http://schemas.microsoft.com/office/word/2006/wordml" xmlns:wps="http://schemas.microsoft.com/office/word/2010/wordprocessingShape" mc:Ignorable="w14 w15 w16se w16cid w16 w16cex w16sdtdh w16sdtfl w16du wp14">
+<w:ftr xmlns:wpc="http://schemas.microsoft.com/office/word/2010/wordprocessingCanvas" xmlns:cx="http://schemas.microsoft.com/office/drawing/2014/chartex" xmlns:cx1="http://schemas.microsoft.com/office/drawing/2015/9/8/chartex" xmlns:cx2="http://schemas.microsoft.com/office/drawing/2015/10/21/chartex" xmlns:cx3="http://schemas.microsoft.com/office/drawing/2016/5/9/chartex" xmlns:cx4="http://schemas.microsoft.com/office/drawing/2016/5/10/chartex" xmlns:cx5="http://schemas.microsoft.com/office/drawing/2016/5/11/chartex" xmlns:cx6="http://schemas.microsoft.com/office/drawing/2016/5/12/chartex" xmlns:cx7="http://schemas.microsoft.com/office/drawing/2016/5/13/chartex" xmlns:cx8="http://schemas.microsoft.com/office/drawing/2016/5/14/chartex" xmlns:mc="http://schemas.openxmlformats.org/markup-compatibility/2006" xmlns:aink="http://schemas.microsoft.com/office/drawing/2016/ink" xmlns:am3d="http://schemas.microsoft.com/office/drawing/2017/model3d" xmlns:o="urn:schemas-microsoft-com:office:office" xmlns:oel="http://schemas.microsoft.com/office/2019/extlst" xmlns:r="http://schemas.openxmlformats.org/officeDocument/2006/relationships" xmlns:m="http://schemas.openxmlformats.org/officeDocument/2006/math" xmlns:v="urn:schemas-microsoft-com:vml" xmlns:wp14="http://schemas.microsoft.com/office/word/2010/wordprocessingDrawing" xmlns:wp="http://schemas.openxmlformats.org/drawingml/2006/wordprocessingDrawing" xmlns:w10="urn:schemas-microsoft-com:office:word" xmlns:w="http://schemas.openxmlformats.org/wordprocessingml/2006/main" xmlns:w14="http://schemas.microsoft.com/office/word/2010/wordml" xmlns:w15="http://schemas.microsoft.com/office/word/2012/wordml" xmlns:w16cex="http://schemas.microsoft.com/office/word/2018/wordml/cex" xmlns:w16cid="http://schemas.microsoft.com/office/word/2016/wordml/cid" xmlns:w16="http://schemas.microsoft.com/office/word/2018/wordml" xmlns:w16du="http://schemas.microsoft.com/office/word/2023/wordml/word16du" xmlns:w16sdtdh="http://schemas.microsoft.com/office/word/2020/wordml/sdtdatahash" xmlns:w16sdtfl="http://schemas.microsoft.com/office/word/2024/wordml/sdtformatlock" xmlns:w16se="http://schemas.microsoft.com/office/word/2015/wordml/symex" xmlns:wpg="http://schemas.microsoft.com/office/word/2010/wordprocessingGroup" xmlns:wpi="http://schemas.microsoft.com/office/word/2010/wordprocessingInk" xmlns:wne="http://schemas.microsoft.com/office/word/2006/wordml" xmlns:wps="http://schemas.microsoft.com/office/word/2010/wordprocessingShape" mc:Ignorable="w14 w15 w16se w16cid w16 w16cex w16sdtdh w16sdtfl w16du wp14">
   <w:p>
     <w:pPr>
       <w:pStyle w:val="Footer"/>
@@ -28141,21 +27577,7 @@
       <w:rPr>
         <w:rFonts w:ascii="Tahoma" w:hAnsi="Tahoma" w:cs="Tahoma"/>
       </w:rPr>
-      <w:t xml:space="preserve">Status: &lt;Draft/Released </w:t>
-    </w:r>
-    <w:proofErr w:type="gramStart"/>
-    <w:r>
-      <w:rPr>
-        <w:rFonts w:ascii="Tahoma" w:hAnsi="Tahoma" w:cs="Tahoma"/>
-      </w:rPr>
-      <w:t>For</w:t>
-    </w:r>
-    <w:proofErr w:type="gramEnd"/>
-    <w:r>
-      <w:rPr>
-        <w:rFonts w:ascii="Tahoma" w:hAnsi="Tahoma" w:cs="Tahoma"/>
-      </w:rPr>
-      <w:t xml:space="preserve"> Approval/Approved&gt;</w:t>
+      <w:t>Status: &lt;Draft/Released For Approval/Approved&gt;</w:t>
     </w:r>
     <w:r>
       <w:tab/>
@@ -28267,7 +27689,7 @@
 </file>
 
 <file path=word/footer4.xml><?xml version="1.0" encoding="utf-8"?>
-<w:ftr xmlns:wpc="http://schemas.microsoft.com/office/word/2010/wordprocessingCanvas" xmlns:cx="http://schemas.microsoft.com/office/drawing/2014/chartex" xmlns:cx1="http://schemas.microsoft.com/office/drawing/2015/9/8/chartex" xmlns:cx2="http://schemas.microsoft.com/office/drawing/2015/10/21/chartex" xmlns:cx3="http://schemas.microsoft.com/office/drawing/2016/5/9/chartex" xmlns:cx4="http://schemas.microsoft.com/office/drawing/2016/5/10/chartex" xmlns:cx5="http://schemas.microsoft.com/office/drawing/2016/5/11/chartex" xmlns:cx6="http://schemas.microsoft.com/office/drawing/2016/5/12/chartex" xmlns:cx7="http://schemas.microsoft.com/office/drawing/2016/5/13/chartex" xmlns:cx8="http://schemas.microsoft.com/office/drawing/2016/5/14/chartex" xmlns:mc="http://schemas.openxmlformats.org/markup-compatibility/2006" xmlns:aink="http://schemas.microsoft.com/office/drawing/2016/ink" xmlns:am3d="http://schemas.microsoft.com/office/drawing/2017/model3d" xmlns:o="urn:schemas-microsoft-com:office:office" xmlns:oel="http://schemas.microsoft.com/office/2019/extlst" xmlns:r="http://schemas.openxmlformats.org/officeDocument/2006/relationships" xmlns:m="http://schemas.openxmlformats.org/officeDocument/2006/math" xmlns:v="urn:schemas-microsoft-com:vml" xmlns:wp14="http://schemas.microsoft.com/office/word/2010/wordprocessingDrawing" xmlns:wp="http://schemas.openxmlformats.org/drawingml/2006/wordprocessingDrawing" xmlns:w10="urn:schemas-microsoft-com:office:word" xmlns:w="http://schemas.openxmlformats.org/wordprocessingml/2006/main" xmlns:w14="http://schemas.microsoft.com/office/word/2010/wordml" xmlns:w15="http://schemas.microsoft.com/office/word/2012/wordml" xmlns:w16cei="http://schemas.microsoft.com/office/word/2026/wordml/cei" xmlns:w16cex="http://schemas.microsoft.com/office/word/2018/wordml/cex" xmlns:w16cid="http://schemas.microsoft.com/office/word/2016/wordml/cid" xmlns:w16="http://schemas.microsoft.com/office/word/2018/wordml" xmlns:w16du="http://schemas.microsoft.com/office/word/2023/wordml/word16du" xmlns:w16sdtdh="http://schemas.microsoft.com/office/word/2020/wordml/sdtdatahash" xmlns:w16sdtfl="http://schemas.microsoft.com/office/word/2024/wordml/sdtformatlock" xmlns:w16se="http://schemas.microsoft.com/office/word/2015/wordml/symex" xmlns:wpg="http://schemas.microsoft.com/office/word/2010/wordprocessingGroup" xmlns:wpi="http://schemas.microsoft.com/office/word/2010/wordprocessingInk" xmlns:wne="http://schemas.microsoft.com/office/word/2006/wordml" xmlns:wps="http://schemas.microsoft.com/office/word/2010/wordprocessingShape" mc:Ignorable="w14 w15 w16se w16cid w16 w16cex w16sdtdh w16sdtfl w16du wp14">
+<w:ftr xmlns:wpc="http://schemas.microsoft.com/office/word/2010/wordprocessingCanvas" xmlns:cx="http://schemas.microsoft.com/office/drawing/2014/chartex" xmlns:cx1="http://schemas.microsoft.com/office/drawing/2015/9/8/chartex" xmlns:cx2="http://schemas.microsoft.com/office/drawing/2015/10/21/chartex" xmlns:cx3="http://schemas.microsoft.com/office/drawing/2016/5/9/chartex" xmlns:cx4="http://schemas.microsoft.com/office/drawing/2016/5/10/chartex" xmlns:cx5="http://schemas.microsoft.com/office/drawing/2016/5/11/chartex" xmlns:cx6="http://schemas.microsoft.com/office/drawing/2016/5/12/chartex" xmlns:cx7="http://schemas.microsoft.com/office/drawing/2016/5/13/chartex" xmlns:cx8="http://schemas.microsoft.com/office/drawing/2016/5/14/chartex" xmlns:mc="http://schemas.openxmlformats.org/markup-compatibility/2006" xmlns:aink="http://schemas.microsoft.com/office/drawing/2016/ink" xmlns:am3d="http://schemas.microsoft.com/office/drawing/2017/model3d" xmlns:o="urn:schemas-microsoft-com:office:office" xmlns:oel="http://schemas.microsoft.com/office/2019/extlst" xmlns:r="http://schemas.openxmlformats.org/officeDocument/2006/relationships" xmlns:m="http://schemas.openxmlformats.org/officeDocument/2006/math" xmlns:v="urn:schemas-microsoft-com:vml" xmlns:wp14="http://schemas.microsoft.com/office/word/2010/wordprocessingDrawing" xmlns:wp="http://schemas.openxmlformats.org/drawingml/2006/wordprocessingDrawing" xmlns:w10="urn:schemas-microsoft-com:office:word" xmlns:w="http://schemas.openxmlformats.org/wordprocessingml/2006/main" xmlns:w14="http://schemas.microsoft.com/office/word/2010/wordml" xmlns:w15="http://schemas.microsoft.com/office/word/2012/wordml" xmlns:w16cex="http://schemas.microsoft.com/office/word/2018/wordml/cex" xmlns:w16cid="http://schemas.microsoft.com/office/word/2016/wordml/cid" xmlns:w16="http://schemas.microsoft.com/office/word/2018/wordml" xmlns:w16du="http://schemas.microsoft.com/office/word/2023/wordml/word16du" xmlns:w16sdtdh="http://schemas.microsoft.com/office/word/2020/wordml/sdtdatahash" xmlns:w16sdtfl="http://schemas.microsoft.com/office/word/2024/wordml/sdtformatlock" xmlns:w16se="http://schemas.microsoft.com/office/word/2015/wordml/symex" xmlns:wpg="http://schemas.microsoft.com/office/word/2010/wordprocessingGroup" xmlns:wpi="http://schemas.microsoft.com/office/word/2010/wordprocessingInk" xmlns:wne="http://schemas.microsoft.com/office/word/2006/wordml" xmlns:wps="http://schemas.microsoft.com/office/word/2010/wordprocessingShape" mc:Ignorable="w14 w15 w16se w16cid w16 w16cex w16sdtdh w16sdtfl w16du wp14">
   <w:tbl>
     <w:tblPr>
       <w:tblW w:w="0" w:type="auto"/>
@@ -28522,7 +27944,7 @@
 </file>
 
 <file path=word/footnotes.xml><?xml version="1.0" encoding="utf-8"?>
-<w:footnotes xmlns:wpc="http://schemas.microsoft.com/office/word/2010/wordprocessingCanvas" xmlns:cx="http://schemas.microsoft.com/office/drawing/2014/chartex" xmlns:cx1="http://schemas.microsoft.com/office/drawing/2015/9/8/chartex" xmlns:cx2="http://schemas.microsoft.com/office/drawing/2015/10/21/chartex" xmlns:cx3="http://schemas.microsoft.com/office/drawing/2016/5/9/chartex" xmlns:cx4="http://schemas.microsoft.com/office/drawing/2016/5/10/chartex" xmlns:cx5="http://schemas.microsoft.com/office/drawing/2016/5/11/chartex" xmlns:cx6="http://schemas.microsoft.com/office/drawing/2016/5/12/chartex" xmlns:cx7="http://schemas.microsoft.com/office/drawing/2016/5/13/chartex" xmlns:cx8="http://schemas.microsoft.com/office/drawing/2016/5/14/chartex" xmlns:mc="http://schemas.openxmlformats.org/markup-compatibility/2006" xmlns:aink="http://schemas.microsoft.com/office/drawing/2016/ink" xmlns:am3d="http://schemas.microsoft.com/office/drawing/2017/model3d" xmlns:o="urn:schemas-microsoft-com:office:office" xmlns:oel="http://schemas.microsoft.com/office/2019/extlst" xmlns:r="http://schemas.openxmlformats.org/officeDocument/2006/relationships" xmlns:m="http://schemas.openxmlformats.org/officeDocument/2006/math" xmlns:v="urn:schemas-microsoft-com:vml" xmlns:wp14="http://schemas.microsoft.com/office/word/2010/wordprocessingDrawing" xmlns:wp="http://schemas.openxmlformats.org/drawingml/2006/wordprocessingDrawing" xmlns:w10="urn:schemas-microsoft-com:office:word" xmlns:w="http://schemas.openxmlformats.org/wordprocessingml/2006/main" xmlns:w14="http://schemas.microsoft.com/office/word/2010/wordml" xmlns:w15="http://schemas.microsoft.com/office/word/2012/wordml" xmlns:w16cei="http://schemas.microsoft.com/office/word/2026/wordml/cei" xmlns:w16cex="http://schemas.microsoft.com/office/word/2018/wordml/cex" xmlns:w16cid="http://schemas.microsoft.com/office/word/2016/wordml/cid" xmlns:w16="http://schemas.microsoft.com/office/word/2018/wordml" xmlns:w16du="http://schemas.microsoft.com/office/word/2023/wordml/word16du" xmlns:w16sdtdh="http://schemas.microsoft.com/office/word/2020/wordml/sdtdatahash" xmlns:w16sdtfl="http://schemas.microsoft.com/office/word/2024/wordml/sdtformatlock" xmlns:w16se="http://schemas.microsoft.com/office/word/2015/wordml/symex" xmlns:wpg="http://schemas.microsoft.com/office/word/2010/wordprocessingGroup" xmlns:wpi="http://schemas.microsoft.com/office/word/2010/wordprocessingInk" xmlns:wne="http://schemas.microsoft.com/office/word/2006/wordml" xmlns:wps="http://schemas.microsoft.com/office/word/2010/wordprocessingShape" mc:Ignorable="w14 w15 w16se w16cid w16 w16cex w16sdtdh w16sdtfl w16du wp14">
+<w:footnotes xmlns:wpc="http://schemas.microsoft.com/office/word/2010/wordprocessingCanvas" xmlns:cx="http://schemas.microsoft.com/office/drawing/2014/chartex" xmlns:cx1="http://schemas.microsoft.com/office/drawing/2015/9/8/chartex" xmlns:cx2="http://schemas.microsoft.com/office/drawing/2015/10/21/chartex" xmlns:cx3="http://schemas.microsoft.com/office/drawing/2016/5/9/chartex" xmlns:cx4="http://schemas.microsoft.com/office/drawing/2016/5/10/chartex" xmlns:cx5="http://schemas.microsoft.com/office/drawing/2016/5/11/chartex" xmlns:cx6="http://schemas.microsoft.com/office/drawing/2016/5/12/chartex" xmlns:cx7="http://schemas.microsoft.com/office/drawing/2016/5/13/chartex" xmlns:cx8="http://schemas.microsoft.com/office/drawing/2016/5/14/chartex" xmlns:mc="http://schemas.openxmlformats.org/markup-compatibility/2006" xmlns:aink="http://schemas.microsoft.com/office/drawing/2016/ink" xmlns:am3d="http://schemas.microsoft.com/office/drawing/2017/model3d" xmlns:o="urn:schemas-microsoft-com:office:office" xmlns:oel="http://schemas.microsoft.com/office/2019/extlst" xmlns:r="http://schemas.openxmlformats.org/officeDocument/2006/relationships" xmlns:m="http://schemas.openxmlformats.org/officeDocument/2006/math" xmlns:v="urn:schemas-microsoft-com:vml" xmlns:wp14="http://schemas.microsoft.com/office/word/2010/wordprocessingDrawing" xmlns:wp="http://schemas.openxmlformats.org/drawingml/2006/wordprocessingDrawing" xmlns:w10="urn:schemas-microsoft-com:office:word" xmlns:w="http://schemas.openxmlformats.org/wordprocessingml/2006/main" xmlns:w14="http://schemas.microsoft.com/office/word/2010/wordml" xmlns:w15="http://schemas.microsoft.com/office/word/2012/wordml" xmlns:w16cex="http://schemas.microsoft.com/office/word/2018/wordml/cex" xmlns:w16cid="http://schemas.microsoft.com/office/word/2016/wordml/cid" xmlns:w16="http://schemas.microsoft.com/office/word/2018/wordml" xmlns:w16du="http://schemas.microsoft.com/office/word/2023/wordml/word16du" xmlns:w16sdtdh="http://schemas.microsoft.com/office/word/2020/wordml/sdtdatahash" xmlns:w16sdtfl="http://schemas.microsoft.com/office/word/2024/wordml/sdtformatlock" xmlns:w16se="http://schemas.microsoft.com/office/word/2015/wordml/symex" xmlns:wpg="http://schemas.microsoft.com/office/word/2010/wordprocessingGroup" xmlns:wpi="http://schemas.microsoft.com/office/word/2010/wordprocessingInk" xmlns:wne="http://schemas.microsoft.com/office/word/2006/wordml" xmlns:wps="http://schemas.microsoft.com/office/word/2010/wordprocessingShape" mc:Ignorable="w14 w15 w16se w16cid w16 w16cex w16sdtdh w16sdtfl w16du wp14">
   <w:footnote w:type="separator" w:id="-1">
     <w:p>
       <w:r>
@@ -28541,7 +27963,7 @@
 </file>
 
 <file path=word/header1.xml><?xml version="1.0" encoding="utf-8"?>
-<w:hdr xmlns:wpc="http://schemas.microsoft.com/office/word/2010/wordprocessingCanvas" xmlns:cx="http://schemas.microsoft.com/office/drawing/2014/chartex" xmlns:cx1="http://schemas.microsoft.com/office/drawing/2015/9/8/chartex" xmlns:cx2="http://schemas.microsoft.com/office/drawing/2015/10/21/chartex" xmlns:cx3="http://schemas.microsoft.com/office/drawing/2016/5/9/chartex" xmlns:cx4="http://schemas.microsoft.com/office/drawing/2016/5/10/chartex" xmlns:cx5="http://schemas.microsoft.com/office/drawing/2016/5/11/chartex" xmlns:cx6="http://schemas.microsoft.com/office/drawing/2016/5/12/chartex" xmlns:cx7="http://schemas.microsoft.com/office/drawing/2016/5/13/chartex" xmlns:cx8="http://schemas.microsoft.com/office/drawing/2016/5/14/chartex" xmlns:mc="http://schemas.openxmlformats.org/markup-compatibility/2006" xmlns:aink="http://schemas.microsoft.com/office/drawing/2016/ink" xmlns:am3d="http://schemas.microsoft.com/office/drawing/2017/model3d" xmlns:o="urn:schemas-microsoft-com:office:office" xmlns:oel="http://schemas.microsoft.com/office/2019/extlst" xmlns:r="http://schemas.openxmlformats.org/officeDocument/2006/relationships" xmlns:m="http://schemas.openxmlformats.org/officeDocument/2006/math" xmlns:v="urn:schemas-microsoft-com:vml" xmlns:wp14="http://schemas.microsoft.com/office/word/2010/wordprocessingDrawing" xmlns:wp="http://schemas.openxmlformats.org/drawingml/2006/wordprocessingDrawing" xmlns:w10="urn:schemas-microsoft-com:office:word" xmlns:w="http://schemas.openxmlformats.org/wordprocessingml/2006/main" xmlns:w14="http://schemas.microsoft.com/office/word/2010/wordml" xmlns:w15="http://schemas.microsoft.com/office/word/2012/wordml" xmlns:w16cei="http://schemas.microsoft.com/office/word/2026/wordml/cei" xmlns:w16cex="http://schemas.microsoft.com/office/word/2018/wordml/cex" xmlns:w16cid="http://schemas.microsoft.com/office/word/2016/wordml/cid" xmlns:w16="http://schemas.microsoft.com/office/word/2018/wordml" xmlns:w16du="http://schemas.microsoft.com/office/word/2023/wordml/word16du" xmlns:w16sdtdh="http://schemas.microsoft.com/office/word/2020/wordml/sdtdatahash" xmlns:w16sdtfl="http://schemas.microsoft.com/office/word/2024/wordml/sdtformatlock" xmlns:w16se="http://schemas.microsoft.com/office/word/2015/wordml/symex" xmlns:wpg="http://schemas.microsoft.com/office/word/2010/wordprocessingGroup" xmlns:wpi="http://schemas.microsoft.com/office/word/2010/wordprocessingInk" xmlns:wne="http://schemas.microsoft.com/office/word/2006/wordml" xmlns:wps="http://schemas.microsoft.com/office/word/2010/wordprocessingShape" mc:Ignorable="w14 w15 w16se w16cid w16 w16cex w16sdtdh w16sdtfl w16du wp14">
+<w:hdr xmlns:wpc="http://schemas.microsoft.com/office/word/2010/wordprocessingCanvas" xmlns:cx="http://schemas.microsoft.com/office/drawing/2014/chartex" xmlns:cx1="http://schemas.microsoft.com/office/drawing/2015/9/8/chartex" xmlns:cx2="http://schemas.microsoft.com/office/drawing/2015/10/21/chartex" xmlns:cx3="http://schemas.microsoft.com/office/drawing/2016/5/9/chartex" xmlns:cx4="http://schemas.microsoft.com/office/drawing/2016/5/10/chartex" xmlns:cx5="http://schemas.microsoft.com/office/drawing/2016/5/11/chartex" xmlns:cx6="http://schemas.microsoft.com/office/drawing/2016/5/12/chartex" xmlns:cx7="http://schemas.microsoft.com/office/drawing/2016/5/13/chartex" xmlns:cx8="http://schemas.microsoft.com/office/drawing/2016/5/14/chartex" xmlns:mc="http://schemas.openxmlformats.org/markup-compatibility/2006" xmlns:aink="http://schemas.microsoft.com/office/drawing/2016/ink" xmlns:am3d="http://schemas.microsoft.com/office/drawing/2017/model3d" xmlns:o="urn:schemas-microsoft-com:office:office" xmlns:oel="http://schemas.microsoft.com/office/2019/extlst" xmlns:r="http://schemas.openxmlformats.org/officeDocument/2006/relationships" xmlns:m="http://schemas.openxmlformats.org/officeDocument/2006/math" xmlns:v="urn:schemas-microsoft-com:vml" xmlns:wp14="http://schemas.microsoft.com/office/word/2010/wordprocessingDrawing" xmlns:wp="http://schemas.openxmlformats.org/drawingml/2006/wordprocessingDrawing" xmlns:w10="urn:schemas-microsoft-com:office:word" xmlns:w="http://schemas.openxmlformats.org/wordprocessingml/2006/main" xmlns:w14="http://schemas.microsoft.com/office/word/2010/wordml" xmlns:w15="http://schemas.microsoft.com/office/word/2012/wordml" xmlns:w16cex="http://schemas.microsoft.com/office/word/2018/wordml/cex" xmlns:w16cid="http://schemas.microsoft.com/office/word/2016/wordml/cid" xmlns:w16="http://schemas.microsoft.com/office/word/2018/wordml" xmlns:w16du="http://schemas.microsoft.com/office/word/2023/wordml/word16du" xmlns:w16sdtdh="http://schemas.microsoft.com/office/word/2020/wordml/sdtdatahash" xmlns:w16sdtfl="http://schemas.microsoft.com/office/word/2024/wordml/sdtformatlock" xmlns:w16se="http://schemas.microsoft.com/office/word/2015/wordml/symex" xmlns:wpg="http://schemas.microsoft.com/office/word/2010/wordprocessingGroup" xmlns:wpi="http://schemas.microsoft.com/office/word/2010/wordprocessingInk" xmlns:wne="http://schemas.microsoft.com/office/word/2006/wordml" xmlns:wps="http://schemas.microsoft.com/office/word/2010/wordprocessingShape" mc:Ignorable="w14 w15 w16se w16cid w16 w16cex w16sdtdh w16sdtfl w16du wp14">
   <w:p>
     <w:pPr>
       <w:pStyle w:val="Header"/>
@@ -28618,7 +28040,7 @@
 </file>
 
 <file path=word/header2.xml><?xml version="1.0" encoding="utf-8"?>
-<w:hdr xmlns:wpc="http://schemas.microsoft.com/office/word/2010/wordprocessingCanvas" xmlns:cx="http://schemas.microsoft.com/office/drawing/2014/chartex" xmlns:cx1="http://schemas.microsoft.com/office/drawing/2015/9/8/chartex" xmlns:cx2="http://schemas.microsoft.com/office/drawing/2015/10/21/chartex" xmlns:cx3="http://schemas.microsoft.com/office/drawing/2016/5/9/chartex" xmlns:cx4="http://schemas.microsoft.com/office/drawing/2016/5/10/chartex" xmlns:cx5="http://schemas.microsoft.com/office/drawing/2016/5/11/chartex" xmlns:cx6="http://schemas.microsoft.com/office/drawing/2016/5/12/chartex" xmlns:cx7="http://schemas.microsoft.com/office/drawing/2016/5/13/chartex" xmlns:cx8="http://schemas.microsoft.com/office/drawing/2016/5/14/chartex" xmlns:mc="http://schemas.openxmlformats.org/markup-compatibility/2006" xmlns:aink="http://schemas.microsoft.com/office/drawing/2016/ink" xmlns:am3d="http://schemas.microsoft.com/office/drawing/2017/model3d" xmlns:o="urn:schemas-microsoft-com:office:office" xmlns:oel="http://schemas.microsoft.com/office/2019/extlst" xmlns:r="http://schemas.openxmlformats.org/officeDocument/2006/relationships" xmlns:m="http://schemas.openxmlformats.org/officeDocument/2006/math" xmlns:v="urn:schemas-microsoft-com:vml" xmlns:wp14="http://schemas.microsoft.com/office/word/2010/wordprocessingDrawing" xmlns:wp="http://schemas.openxmlformats.org/drawingml/2006/wordprocessingDrawing" xmlns:w10="urn:schemas-microsoft-com:office:word" xmlns:w="http://schemas.openxmlformats.org/wordprocessingml/2006/main" xmlns:w14="http://schemas.microsoft.com/office/word/2010/wordml" xmlns:w15="http://schemas.microsoft.com/office/word/2012/wordml" xmlns:w16cei="http://schemas.microsoft.com/office/word/2026/wordml/cei" xmlns:w16cex="http://schemas.microsoft.com/office/word/2018/wordml/cex" xmlns:w16cid="http://schemas.microsoft.com/office/word/2016/wordml/cid" xmlns:w16="http://schemas.microsoft.com/office/word/2018/wordml" xmlns:w16du="http://schemas.microsoft.com/office/word/2023/wordml/word16du" xmlns:w16sdtdh="http://schemas.microsoft.com/office/word/2020/wordml/sdtdatahash" xmlns:w16sdtfl="http://schemas.microsoft.com/office/word/2024/wordml/sdtformatlock" xmlns:w16se="http://schemas.microsoft.com/office/word/2015/wordml/symex" xmlns:wpg="http://schemas.microsoft.com/office/word/2010/wordprocessingGroup" xmlns:wpi="http://schemas.microsoft.com/office/word/2010/wordprocessingInk" xmlns:wne="http://schemas.microsoft.com/office/word/2006/wordml" xmlns:wps="http://schemas.microsoft.com/office/word/2010/wordprocessingShape" mc:Ignorable="w14 w15 w16se w16cid w16 w16cex w16sdtdh w16sdtfl w16du wp14">
+<w:hdr xmlns:wpc="http://schemas.microsoft.com/office/word/2010/wordprocessingCanvas" xmlns:cx="http://schemas.microsoft.com/office/drawing/2014/chartex" xmlns:cx1="http://schemas.microsoft.com/office/drawing/2015/9/8/chartex" xmlns:cx2="http://schemas.microsoft.com/office/drawing/2015/10/21/chartex" xmlns:cx3="http://schemas.microsoft.com/office/drawing/2016/5/9/chartex" xmlns:cx4="http://schemas.microsoft.com/office/drawing/2016/5/10/chartex" xmlns:cx5="http://schemas.microsoft.com/office/drawing/2016/5/11/chartex" xmlns:cx6="http://schemas.microsoft.com/office/drawing/2016/5/12/chartex" xmlns:cx7="http://schemas.microsoft.com/office/drawing/2016/5/13/chartex" xmlns:cx8="http://schemas.microsoft.com/office/drawing/2016/5/14/chartex" xmlns:mc="http://schemas.openxmlformats.org/markup-compatibility/2006" xmlns:aink="http://schemas.microsoft.com/office/drawing/2016/ink" xmlns:am3d="http://schemas.microsoft.com/office/drawing/2017/model3d" xmlns:o="urn:schemas-microsoft-com:office:office" xmlns:oel="http://schemas.microsoft.com/office/2019/extlst" xmlns:r="http://schemas.openxmlformats.org/officeDocument/2006/relationships" xmlns:m="http://schemas.openxmlformats.org/officeDocument/2006/math" xmlns:v="urn:schemas-microsoft-com:vml" xmlns:wp14="http://schemas.microsoft.com/office/word/2010/wordprocessingDrawing" xmlns:wp="http://schemas.openxmlformats.org/drawingml/2006/wordprocessingDrawing" xmlns:w10="urn:schemas-microsoft-com:office:word" xmlns:w="http://schemas.openxmlformats.org/wordprocessingml/2006/main" xmlns:w14="http://schemas.microsoft.com/office/word/2010/wordml" xmlns:w15="http://schemas.microsoft.com/office/word/2012/wordml" xmlns:w16cex="http://schemas.microsoft.com/office/word/2018/wordml/cex" xmlns:w16cid="http://schemas.microsoft.com/office/word/2016/wordml/cid" xmlns:w16="http://schemas.microsoft.com/office/word/2018/wordml" xmlns:w16du="http://schemas.microsoft.com/office/word/2023/wordml/word16du" xmlns:w16sdtdh="http://schemas.microsoft.com/office/word/2020/wordml/sdtdatahash" xmlns:w16sdtfl="http://schemas.microsoft.com/office/word/2024/wordml/sdtformatlock" xmlns:w16se="http://schemas.microsoft.com/office/word/2015/wordml/symex" xmlns:wpg="http://schemas.microsoft.com/office/word/2010/wordprocessingGroup" xmlns:wpi="http://schemas.microsoft.com/office/word/2010/wordprocessingInk" xmlns:wne="http://schemas.microsoft.com/office/word/2006/wordml" xmlns:wps="http://schemas.microsoft.com/office/word/2010/wordprocessingShape" mc:Ignorable="w14 w15 w16se w16cid w16 w16cex w16sdtdh w16sdtfl w16du wp14">
   <w:p>
     <w:pPr>
       <w:pStyle w:val="Header"/>
@@ -28690,7 +28112,7 @@
 </file>
 
 <file path=word/numbering.xml><?xml version="1.0" encoding="utf-8"?>
-<w:numbering xmlns:wpc="http://schemas.microsoft.com/office/word/2010/wordprocessingCanvas" xmlns:cx="http://schemas.microsoft.com/office/drawing/2014/chartex" xmlns:cx1="http://schemas.microsoft.com/office/drawing/2015/9/8/chartex" xmlns:cx2="http://schemas.microsoft.com/office/drawing/2015/10/21/chartex" xmlns:cx3="http://schemas.microsoft.com/office/drawing/2016/5/9/chartex" xmlns:cx4="http://schemas.microsoft.com/office/drawing/2016/5/10/chartex" xmlns:cx5="http://schemas.microsoft.com/office/drawing/2016/5/11/chartex" xmlns:cx6="http://schemas.microsoft.com/office/drawing/2016/5/12/chartex" xmlns:cx7="http://schemas.microsoft.com/office/drawing/2016/5/13/chartex" xmlns:cx8="http://schemas.microsoft.com/office/drawing/2016/5/14/chartex" xmlns:mc="http://schemas.openxmlformats.org/markup-compatibility/2006" xmlns:aink="http://schemas.microsoft.com/office/drawing/2016/ink" xmlns:am3d="http://schemas.microsoft.com/office/drawing/2017/model3d" xmlns:o="urn:schemas-microsoft-com:office:office" xmlns:oel="http://schemas.microsoft.com/office/2019/extlst" xmlns:r="http://schemas.openxmlformats.org/officeDocument/2006/relationships" xmlns:m="http://schemas.openxmlformats.org/officeDocument/2006/math" xmlns:v="urn:schemas-microsoft-com:vml" xmlns:wp14="http://schemas.microsoft.com/office/word/2010/wordprocessingDrawing" xmlns:wp="http://schemas.openxmlformats.org/drawingml/2006/wordprocessingDrawing" xmlns:w10="urn:schemas-microsoft-com:office:word" xmlns:w="http://schemas.openxmlformats.org/wordprocessingml/2006/main" xmlns:w14="http://schemas.microsoft.com/office/word/2010/wordml" xmlns:w15="http://schemas.microsoft.com/office/word/2012/wordml" xmlns:w16cei="http://schemas.microsoft.com/office/word/2026/wordml/cei" xmlns:w16cex="http://schemas.microsoft.com/office/word/2018/wordml/cex" xmlns:w16cid="http://schemas.microsoft.com/office/word/2016/wordml/cid" xmlns:w16="http://schemas.microsoft.com/office/word/2018/wordml" xmlns:w16du="http://schemas.microsoft.com/office/word/2023/wordml/word16du" xmlns:w16sdtdh="http://schemas.microsoft.com/office/word/2020/wordml/sdtdatahash" xmlns:w16sdtfl="http://schemas.microsoft.com/office/word/2024/wordml/sdtformatlock" xmlns:w16se="http://schemas.microsoft.com/office/word/2015/wordml/symex" xmlns:wpg="http://schemas.microsoft.com/office/word/2010/wordprocessingGroup" xmlns:wpi="http://schemas.microsoft.com/office/word/2010/wordprocessingInk" xmlns:wne="http://schemas.microsoft.com/office/word/2006/wordml" xmlns:wps="http://schemas.microsoft.com/office/word/2010/wordprocessingShape" mc:Ignorable="w14 w15 w16se w16cid w16 w16cex w16sdtdh w16sdtfl w16du wp14">
+<w:numbering xmlns:wpc="http://schemas.microsoft.com/office/word/2010/wordprocessingCanvas" xmlns:cx="http://schemas.microsoft.com/office/drawing/2014/chartex" xmlns:cx1="http://schemas.microsoft.com/office/drawing/2015/9/8/chartex" xmlns:cx2="http://schemas.microsoft.com/office/drawing/2015/10/21/chartex" xmlns:cx3="http://schemas.microsoft.com/office/drawing/2016/5/9/chartex" xmlns:cx4="http://schemas.microsoft.com/office/drawing/2016/5/10/chartex" xmlns:cx5="http://schemas.microsoft.com/office/drawing/2016/5/11/chartex" xmlns:cx6="http://schemas.microsoft.com/office/drawing/2016/5/12/chartex" xmlns:cx7="http://schemas.microsoft.com/office/drawing/2016/5/13/chartex" xmlns:cx8="http://schemas.microsoft.com/office/drawing/2016/5/14/chartex" xmlns:mc="http://schemas.openxmlformats.org/markup-compatibility/2006" xmlns:aink="http://schemas.microsoft.com/office/drawing/2016/ink" xmlns:am3d="http://schemas.microsoft.com/office/drawing/2017/model3d" xmlns:o="urn:schemas-microsoft-com:office:office" xmlns:oel="http://schemas.microsoft.com/office/2019/extlst" xmlns:r="http://schemas.openxmlformats.org/officeDocument/2006/relationships" xmlns:m="http://schemas.openxmlformats.org/officeDocument/2006/math" xmlns:v="urn:schemas-microsoft-com:vml" xmlns:wp14="http://schemas.microsoft.com/office/word/2010/wordprocessingDrawing" xmlns:wp="http://schemas.openxmlformats.org/drawingml/2006/wordprocessingDrawing" xmlns:w10="urn:schemas-microsoft-com:office:word" xmlns:w="http://schemas.openxmlformats.org/wordprocessingml/2006/main" xmlns:w14="http://schemas.microsoft.com/office/word/2010/wordml" xmlns:w15="http://schemas.microsoft.com/office/word/2012/wordml" xmlns:w16cex="http://schemas.microsoft.com/office/word/2018/wordml/cex" xmlns:w16cid="http://schemas.microsoft.com/office/word/2016/wordml/cid" xmlns:w16="http://schemas.microsoft.com/office/word/2018/wordml" xmlns:w16du="http://schemas.microsoft.com/office/word/2023/wordml/word16du" xmlns:w16sdtdh="http://schemas.microsoft.com/office/word/2020/wordml/sdtdatahash" xmlns:w16sdtfl="http://schemas.microsoft.com/office/word/2024/wordml/sdtformatlock" xmlns:w16se="http://schemas.microsoft.com/office/word/2015/wordml/symex" xmlns:wpg="http://schemas.microsoft.com/office/word/2010/wordprocessingGroup" xmlns:wpi="http://schemas.microsoft.com/office/word/2010/wordprocessingInk" xmlns:wne="http://schemas.microsoft.com/office/word/2006/wordml" xmlns:wps="http://schemas.microsoft.com/office/word/2010/wordprocessingShape" mc:Ignorable="w14 w15 w16se w16cid w16 w16cex w16sdtdh w16sdtfl w16du wp14">
   <w:abstractNum w:abstractNumId="0" w15:restartNumberingAfterBreak="0">
     <w:nsid w:val="03254227"/>
     <w:multiLevelType w:val="multilevel"/>

</xml_diff>